<commit_message>
le puse mi nombre al documento
</commit_message>
<xml_diff>
--- a/FDE-089-Informe-final-TdG- SImulación_en_HIL_Para_Convertidores_DCDC.docx
+++ b/FDE-089-Informe-final-TdG- SImulación_en_HIL_Para_Convertidores_DCDC.docx
@@ -93,20 +93,53 @@
           <w:szCs w:val="32"/>
         </w:rPr>
       </w:pPr>
-      <w:bookmarkStart w:id="0" w:name="_Toc272509300"/>
       <w:r>
         <w:rPr>
           <w:sz w:val="32"/>
           <w:szCs w:val="32"/>
         </w:rPr>
-        <w:t>Estudiante</w:t>
-      </w:r>
+        <w:t xml:space="preserve">María </w:t>
+      </w:r>
+      <w:proofErr w:type="spellStart"/>
       <w:r>
         <w:rPr>
           <w:sz w:val="32"/>
           <w:szCs w:val="32"/>
         </w:rPr>
-        <w:t xml:space="preserve"> 1</w:t>
+        <w:t>Ceneida</w:t>
+      </w:r>
+      <w:proofErr w:type="spellEnd"/>
+      <w:r>
+        <w:rPr>
+          <w:sz w:val="32"/>
+          <w:szCs w:val="32"/>
+        </w:rPr>
+        <w:t xml:space="preserve"> Loaiza Bustamante</w:t>
+      </w:r>
+    </w:p>
+    <w:p>
+      <w:pPr>
+        <w:spacing w:after="0"/>
+        <w:jc w:val="center"/>
+        <w:rPr>
+          <w:sz w:val="32"/>
+          <w:szCs w:val="32"/>
+        </w:rPr>
+      </w:pPr>
+      <w:bookmarkStart w:id="0" w:name="_Toc272509301"/>
+      <w:r>
+        <w:rPr>
+          <w:sz w:val="32"/>
+          <w:szCs w:val="32"/>
+        </w:rPr>
+        <w:t>Estudiante</w:t>
+      </w:r>
+      <w:r>
+        <w:rPr>
+          <w:sz w:val="32"/>
+          <w:szCs w:val="32"/>
+        </w:rPr>
+        <w:t xml:space="preserve"> 2</w:t>
       </w:r>
       <w:bookmarkEnd w:id="0"/>
     </w:p>
@@ -119,7 +152,7 @@
           <w:szCs w:val="32"/>
         </w:rPr>
       </w:pPr>
-      <w:bookmarkStart w:id="1" w:name="_Toc272509301"/>
+      <w:bookmarkStart w:id="1" w:name="_Toc272509302"/>
       <w:r>
         <w:rPr>
           <w:sz w:val="32"/>
@@ -132,35 +165,19 @@
           <w:sz w:val="32"/>
           <w:szCs w:val="32"/>
         </w:rPr>
-        <w:t xml:space="preserve"> 2</w:t>
+        <w:t xml:space="preserve"> 3</w:t>
       </w:r>
       <w:bookmarkEnd w:id="1"/>
     </w:p>
     <w:p>
       <w:pPr>
         <w:spacing w:after="0"/>
-        <w:jc w:val="center"/>
-        <w:rPr>
-          <w:sz w:val="32"/>
-          <w:szCs w:val="32"/>
-        </w:rPr>
-      </w:pPr>
-      <w:bookmarkStart w:id="2" w:name="_Toc272509302"/>
-      <w:r>
-        <w:rPr>
-          <w:sz w:val="32"/>
-          <w:szCs w:val="32"/>
-        </w:rPr>
-        <w:t>Estudiante</w:t>
-      </w:r>
-      <w:r>
-        <w:rPr>
-          <w:sz w:val="32"/>
-          <w:szCs w:val="32"/>
-        </w:rPr>
-        <w:t xml:space="preserve"> 3</w:t>
-      </w:r>
-      <w:bookmarkEnd w:id="2"/>
+        <w:rPr>
+          <w:rFonts w:cstheme="minorHAnsi"/>
+          <w:sz w:val="24"/>
+          <w:szCs w:val="24"/>
+        </w:rPr>
+      </w:pPr>
     </w:p>
     <w:p>
       <w:pPr>
@@ -195,12 +212,37 @@
     <w:p>
       <w:pPr>
         <w:spacing w:after="0"/>
-        <w:rPr>
-          <w:rFonts w:cstheme="minorHAnsi"/>
-          <w:sz w:val="24"/>
-          <w:szCs w:val="24"/>
-        </w:rPr>
-      </w:pPr>
+        <w:jc w:val="center"/>
+        <w:rPr>
+          <w:rFonts w:cstheme="minorHAnsi"/>
+          <w:sz w:val="28"/>
+          <w:szCs w:val="28"/>
+        </w:rPr>
+      </w:pPr>
+      <w:r>
+        <w:rPr>
+          <w:rFonts w:cstheme="minorHAnsi"/>
+          <w:sz w:val="28"/>
+          <w:szCs w:val="28"/>
+        </w:rPr>
+        <w:t xml:space="preserve">Trabajo de </w:t>
+      </w:r>
+      <w:r>
+        <w:rPr>
+          <w:rFonts w:cstheme="minorHAnsi"/>
+          <w:sz w:val="28"/>
+          <w:szCs w:val="28"/>
+        </w:rPr>
+        <w:t>grado</w:t>
+      </w:r>
+      <w:r>
+        <w:rPr>
+          <w:rFonts w:cstheme="minorHAnsi"/>
+          <w:sz w:val="28"/>
+          <w:szCs w:val="28"/>
+        </w:rPr>
+        <w:t xml:space="preserve"> presentado como requisito parcial para optar al título de:</w:t>
+      </w:r>
     </w:p>
     <w:p>
       <w:pPr>
@@ -218,116 +260,81 @@
           <w:sz w:val="28"/>
           <w:szCs w:val="28"/>
         </w:rPr>
-        <w:t xml:space="preserve">Trabajo de </w:t>
-      </w:r>
-      <w:r>
-        <w:rPr>
-          <w:rFonts w:cstheme="minorHAnsi"/>
+        <w:t>Tecnólogo/Ingeniero XXX</w:t>
+      </w:r>
+    </w:p>
+    <w:p>
+      <w:pPr>
+        <w:spacing w:after="0"/>
+        <w:rPr>
+          <w:rFonts w:cstheme="minorHAnsi"/>
+          <w:sz w:val="24"/>
+          <w:szCs w:val="24"/>
+        </w:rPr>
+      </w:pPr>
+    </w:p>
+    <w:p>
+      <w:pPr>
+        <w:spacing w:after="0"/>
+        <w:jc w:val="both"/>
+        <w:rPr>
+          <w:rFonts w:cstheme="minorHAnsi"/>
+          <w:b/>
+          <w:sz w:val="24"/>
+          <w:szCs w:val="24"/>
+        </w:rPr>
+      </w:pPr>
+    </w:p>
+    <w:p>
+      <w:pPr>
+        <w:spacing w:after="0"/>
+        <w:jc w:val="both"/>
+        <w:rPr>
+          <w:rFonts w:cstheme="minorHAnsi"/>
+          <w:b/>
+          <w:sz w:val="24"/>
+          <w:szCs w:val="24"/>
+        </w:rPr>
+      </w:pPr>
+    </w:p>
+    <w:p>
+      <w:pPr>
+        <w:spacing w:after="0"/>
+        <w:jc w:val="both"/>
+        <w:rPr>
+          <w:rFonts w:cstheme="minorHAnsi"/>
+          <w:b/>
+          <w:sz w:val="24"/>
+          <w:szCs w:val="24"/>
+        </w:rPr>
+      </w:pPr>
+    </w:p>
+    <w:p>
+      <w:pPr>
+        <w:spacing w:after="0"/>
+        <w:jc w:val="center"/>
+        <w:rPr>
           <w:sz w:val="28"/>
           <w:szCs w:val="28"/>
         </w:rPr>
-        <w:t>grado</w:t>
-      </w:r>
-      <w:r>
-        <w:rPr>
-          <w:rFonts w:cstheme="minorHAnsi"/>
+      </w:pPr>
+      <w:bookmarkStart w:id="2" w:name="_Toc272509305"/>
+      <w:r>
+        <w:rPr>
           <w:sz w:val="28"/>
           <w:szCs w:val="28"/>
         </w:rPr>
-        <w:t xml:space="preserve"> presentado como requisito parcial para optar al título de:</w:t>
-      </w:r>
-    </w:p>
-    <w:p>
-      <w:pPr>
-        <w:spacing w:after="0"/>
-        <w:jc w:val="center"/>
-        <w:rPr>
-          <w:rFonts w:cstheme="minorHAnsi"/>
+        <w:t>Asesor</w:t>
+      </w:r>
+      <w:r>
+        <w:rPr>
           <w:sz w:val="28"/>
           <w:szCs w:val="28"/>
         </w:rPr>
-      </w:pPr>
-      <w:r>
-        <w:rPr>
-          <w:rFonts w:cstheme="minorHAnsi"/>
-          <w:sz w:val="28"/>
-          <w:szCs w:val="28"/>
-        </w:rPr>
-        <w:t>Tecnólogo/Ingeniero XXX</w:t>
+        <w:t>(es)</w:t>
       </w:r>
     </w:p>
-    <w:p>
-      <w:pPr>
-        <w:spacing w:after="0"/>
-        <w:rPr>
-          <w:rFonts w:cstheme="minorHAnsi"/>
-          <w:sz w:val="24"/>
-          <w:szCs w:val="24"/>
-        </w:rPr>
-      </w:pPr>
-    </w:p>
-    <w:p>
-      <w:pPr>
-        <w:spacing w:after="0"/>
-        <w:jc w:val="both"/>
-        <w:rPr>
-          <w:rFonts w:cstheme="minorHAnsi"/>
-          <w:b/>
-          <w:sz w:val="24"/>
-          <w:szCs w:val="24"/>
-        </w:rPr>
-      </w:pPr>
-    </w:p>
-    <w:p>
-      <w:pPr>
-        <w:spacing w:after="0"/>
-        <w:jc w:val="both"/>
-        <w:rPr>
-          <w:rFonts w:cstheme="minorHAnsi"/>
-          <w:b/>
-          <w:sz w:val="24"/>
-          <w:szCs w:val="24"/>
-        </w:rPr>
-      </w:pPr>
-    </w:p>
-    <w:p>
-      <w:pPr>
-        <w:spacing w:after="0"/>
-        <w:jc w:val="both"/>
-        <w:rPr>
-          <w:rFonts w:cstheme="minorHAnsi"/>
-          <w:b/>
-          <w:sz w:val="24"/>
-          <w:szCs w:val="24"/>
-        </w:rPr>
-      </w:pPr>
-    </w:p>
-    <w:p>
-      <w:pPr>
-        <w:spacing w:after="0"/>
-        <w:jc w:val="center"/>
-        <w:rPr>
-          <w:sz w:val="28"/>
-          <w:szCs w:val="28"/>
-        </w:rPr>
-      </w:pPr>
-      <w:bookmarkStart w:id="3" w:name="_Toc272509305"/>
-      <w:r>
-        <w:rPr>
-          <w:sz w:val="28"/>
-          <w:szCs w:val="28"/>
-        </w:rPr>
-        <w:t>Asesor</w:t>
-      </w:r>
-      <w:r>
-        <w:rPr>
-          <w:sz w:val="28"/>
-          <w:szCs w:val="28"/>
-        </w:rPr>
-        <w:t>(es)</w:t>
-      </w:r>
-    </w:p>
-    <w:bookmarkEnd w:id="3"/>
+    <w:bookmarkEnd w:id="2"/>
     <w:p>
       <w:pPr>
         <w:spacing w:after="0"/>
@@ -975,7 +982,7 @@
           <w:rFonts w:asciiTheme="minorHAnsi" w:hAnsiTheme="minorHAnsi" w:cstheme="minorHAnsi"/>
         </w:rPr>
       </w:pPr>
-      <w:commentRangeStart w:id="4"/>
+      <w:commentRangeStart w:id="3"/>
       <w:r>
         <w:rPr>
           <w:rFonts w:asciiTheme="minorHAnsi" w:hAnsiTheme="minorHAnsi" w:cstheme="minorHAnsi"/>
@@ -983,7 +990,7 @@
         <w:lastRenderedPageBreak/>
         <w:t>ACRÓNIMOS</w:t>
       </w:r>
-      <w:commentRangeEnd w:id="4"/>
+      <w:commentRangeEnd w:id="3"/>
       <w:r>
         <w:rPr>
           <w:rStyle w:val="Refdecomentario"/>
@@ -991,7 +998,7 @@
           <w:sz w:val="52"/>
           <w:szCs w:val="52"/>
         </w:rPr>
-        <w:commentReference w:id="4"/>
+        <w:commentReference w:id="3"/>
       </w:r>
     </w:p>
     <w:p>
@@ -2502,9 +2509,9 @@
           <w:szCs w:val="46"/>
         </w:rPr>
       </w:pPr>
-      <w:bookmarkStart w:id="5" w:name="_Toc272509307"/>
-      <w:bookmarkStart w:id="6" w:name="_Toc24203710"/>
-      <w:bookmarkStart w:id="7" w:name="_Toc24204349"/>
+      <w:bookmarkStart w:id="4" w:name="_Toc272509307"/>
+      <w:bookmarkStart w:id="5" w:name="_Toc24203710"/>
+      <w:bookmarkStart w:id="6" w:name="_Toc24204349"/>
       <w:r>
         <w:rPr>
           <w:rFonts w:asciiTheme="minorHAnsi" w:hAnsiTheme="minorHAnsi" w:cstheme="minorHAnsi"/>
@@ -2514,9 +2521,9 @@
         <w:lastRenderedPageBreak/>
         <w:t>INTRODUCCIÓN</w:t>
       </w:r>
+      <w:bookmarkEnd w:id="4"/>
       <w:bookmarkEnd w:id="5"/>
       <w:bookmarkEnd w:id="6"/>
-      <w:bookmarkEnd w:id="7"/>
     </w:p>
     <w:p>
       <w:pPr>
@@ -2720,9 +2727,9 @@
           <w:szCs w:val="46"/>
         </w:rPr>
       </w:pPr>
-      <w:bookmarkStart w:id="8" w:name="_Toc272509308"/>
-      <w:bookmarkStart w:id="9" w:name="_Toc24203711"/>
-      <w:bookmarkStart w:id="10" w:name="_Toc24204350"/>
+      <w:bookmarkStart w:id="7" w:name="_Toc272509308"/>
+      <w:bookmarkStart w:id="8" w:name="_Toc24203711"/>
+      <w:bookmarkStart w:id="9" w:name="_Toc24204350"/>
       <w:r>
         <w:rPr>
           <w:rFonts w:asciiTheme="minorHAnsi" w:hAnsiTheme="minorHAnsi" w:cstheme="minorHAnsi"/>
@@ -2732,9 +2739,9 @@
         <w:lastRenderedPageBreak/>
         <w:t>MARCO TEÓRICO</w:t>
       </w:r>
+      <w:bookmarkEnd w:id="7"/>
       <w:bookmarkEnd w:id="8"/>
       <w:bookmarkEnd w:id="9"/>
-      <w:bookmarkEnd w:id="10"/>
     </w:p>
     <w:p>
       <w:pPr>
@@ -2746,9 +2753,9 @@
           <w:szCs w:val="24"/>
         </w:rPr>
       </w:pPr>
-      <w:bookmarkStart w:id="11" w:name="_Toc272509309"/>
-      <w:bookmarkStart w:id="12" w:name="_Toc24203712"/>
-      <w:bookmarkStart w:id="13" w:name="_Toc24204351"/>
+      <w:bookmarkStart w:id="10" w:name="_Toc272509309"/>
+      <w:bookmarkStart w:id="11" w:name="_Toc24203712"/>
+      <w:bookmarkStart w:id="12" w:name="_Toc24204351"/>
       <w:r>
         <w:rPr>
           <w:rFonts w:eastAsia="Times New Roman" w:cstheme="minorHAnsi"/>
@@ -2836,7 +2843,7 @@
         </w:rPr>
         <w:t xml:space="preserve">• </w:t>
       </w:r>
-      <w:commentRangeStart w:id="14"/>
+      <w:commentRangeStart w:id="13"/>
       <w:r>
         <w:rPr>
           <w:rFonts w:eastAsia="Times New Roman" w:cstheme="minorHAnsi"/>
@@ -2913,7 +2920,7 @@
         </w:rPr>
         <w:t xml:space="preserve"> </w:t>
       </w:r>
-      <w:commentRangeEnd w:id="14"/>
+      <w:commentRangeEnd w:id="13"/>
       <w:r>
         <w:rPr>
           <w:rStyle w:val="Refdecomentario"/>
@@ -2921,7 +2928,7 @@
           <w:sz w:val="24"/>
           <w:szCs w:val="24"/>
         </w:rPr>
-        <w:commentReference w:id="14"/>
+        <w:commentReference w:id="13"/>
       </w:r>
       <w:r>
         <w:rPr>
@@ -5783,7 +5790,7 @@
       <w:pPr>
         <w:pStyle w:val="Descripcin"/>
       </w:pPr>
-      <w:bookmarkStart w:id="15" w:name="_Ref224117462"/>
+      <w:bookmarkStart w:id="14" w:name="_Ref224117462"/>
       <w:r>
         <w:t xml:space="preserve">Figura </w:t>
       </w:r>
@@ -5795,7 +5802,7 @@
           <w:t>1</w:t>
         </w:r>
       </w:fldSimple>
-      <w:bookmarkEnd w:id="15"/>
+      <w:bookmarkEnd w:id="14"/>
       <w:r>
         <w:t>:</w:t>
       </w:r>
@@ -5807,25 +5814,25 @@
       <w:pPr>
         <w:keepNext/>
       </w:pPr>
+      <w:commentRangeStart w:id="15"/>
       <w:commentRangeStart w:id="16"/>
-      <w:commentRangeStart w:id="17"/>
-      <w:commentRangeEnd w:id="16"/>
+      <w:commentRangeEnd w:id="15"/>
       <w:r>
         <w:rPr>
           <w:rStyle w:val="Refdecomentario"/>
           <w:sz w:val="22"/>
           <w:szCs w:val="22"/>
         </w:rPr>
-        <w:commentReference w:id="16"/>
-      </w:r>
-      <w:commentRangeEnd w:id="17"/>
+        <w:commentReference w:id="15"/>
+      </w:r>
+      <w:commentRangeEnd w:id="16"/>
       <w:r>
         <w:rPr>
           <w:rStyle w:val="Refdecomentario"/>
           <w:sz w:val="22"/>
           <w:szCs w:val="22"/>
         </w:rPr>
-        <w:commentReference w:id="17"/>
+        <w:commentReference w:id="16"/>
       </w:r>
       <w:r>
         <w:rPr>
@@ -5951,7 +5958,7 @@
         </w:rPr>
         <w:t xml:space="preserve">Mediante señales PWM complementarias, se controla la conmutación de </w:t>
       </w:r>
-      <w:bookmarkStart w:id="18" w:name="_Hlk224114955"/>
+      <w:bookmarkStart w:id="17" w:name="_Hlk224114955"/>
       <w:r>
         <w:rPr>
           <w:rFonts w:cstheme="minorHAnsi"/>
@@ -5977,7 +5984,7 @@
         </w:rPr>
         <w:t xml:space="preserve"> </w:t>
       </w:r>
-      <w:bookmarkEnd w:id="18"/>
+      <w:bookmarkEnd w:id="17"/>
       <w:r>
         <w:rPr>
           <w:rFonts w:cstheme="minorHAnsi"/>
@@ -8587,7 +8594,7 @@
       <w:pPr>
         <w:pStyle w:val="Descripcin"/>
       </w:pPr>
-      <w:bookmarkStart w:id="19" w:name="_Ref224118120"/>
+      <w:bookmarkStart w:id="18" w:name="_Ref224118120"/>
       <w:r>
         <w:t xml:space="preserve">Figura </w:t>
       </w:r>
@@ -8599,7 +8606,7 @@
           <w:t>2</w:t>
         </w:r>
       </w:fldSimple>
-      <w:bookmarkEnd w:id="19"/>
+      <w:bookmarkEnd w:id="18"/>
       <w:r>
         <w:t xml:space="preserve">: </w:t>
       </w:r>
@@ -8708,15 +8715,15 @@
           </mc:Fallback>
         </mc:AlternateContent>
       </w:r>
-      <w:commentRangeStart w:id="20"/>
-      <w:commentRangeEnd w:id="20"/>
+      <w:commentRangeStart w:id="19"/>
+      <w:commentRangeEnd w:id="19"/>
       <w:r>
         <w:rPr>
           <w:rStyle w:val="Refdecomentario"/>
           <w:sz w:val="22"/>
           <w:szCs w:val="22"/>
         </w:rPr>
-        <w:commentReference w:id="20"/>
+        <w:commentReference w:id="19"/>
       </w:r>
     </w:p>
     <w:p>
@@ -9237,25 +9244,7 @@
           <w:sz w:val="24"/>
           <w:szCs w:val="24"/>
         </w:rPr>
-        <w:t xml:space="preserve">se </w:t>
-      </w:r>
-      <w:proofErr w:type="gramStart"/>
-      <w:r>
-        <w:rPr>
-          <w:rFonts w:cstheme="minorHAnsi"/>
-          <w:sz w:val="24"/>
-          <w:szCs w:val="24"/>
-        </w:rPr>
-        <w:t>obtiene</w:t>
-      </w:r>
-      <w:proofErr w:type="gramEnd"/>
-      <w:r>
-        <w:rPr>
-          <w:rFonts w:cstheme="minorHAnsi"/>
-          <w:sz w:val="24"/>
-          <w:szCs w:val="24"/>
-        </w:rPr>
-        <w:t xml:space="preserve"> aplicando KVL en la malla formada por la fuente y el inductor, y KCL en el nodo común entre el c</w:t>
+        <w:t>se obtiene aplicando KVL en la malla formada por la fuente y el inductor, y KCL en el nodo común entre el c</w:t>
       </w:r>
       <w:r>
         <w:rPr>
@@ -12137,8 +12126,8 @@
           </mc:Fallback>
         </mc:AlternateContent>
       </w:r>
-      <w:commentRangeStart w:id="21"/>
-      <w:commentRangeEnd w:id="21"/>
+      <w:commentRangeStart w:id="20"/>
+      <w:commentRangeEnd w:id="20"/>
       <w:r>
         <w:rPr>
           <w:rStyle w:val="Refdecomentario"/>
@@ -12146,7 +12135,7 @@
           <w:sz w:val="22"/>
           <w:szCs w:val="22"/>
         </w:rPr>
-        <w:commentReference w:id="21"/>
+        <w:commentReference w:id="20"/>
       </w:r>
       <w:r>
         <w:rPr>
@@ -12216,15 +12205,7 @@
       </w:r>
       <w:proofErr w:type="spellEnd"/>
       <w:r>
-        <w:t xml:space="preserve"> con señal de </w:t>
-      </w:r>
-      <w:proofErr w:type="gramStart"/>
-      <w:r>
-        <w:t>control  u</w:t>
-      </w:r>
-      <w:proofErr w:type="gramEnd"/>
-      <w:r>
-        <w:t>=1.</w:t>
+        <w:t xml:space="preserve"> con señal de control  u=1.</w:t>
       </w:r>
     </w:p>
     <w:p>
@@ -16309,7 +16290,7 @@
           <w:szCs w:val="24"/>
         </w:rPr>
       </w:pPr>
-      <w:bookmarkStart w:id="22" w:name="_Hlk224119834"/>
+      <w:bookmarkStart w:id="21" w:name="_Hlk224119834"/>
       <w:r>
         <w:rPr>
           <w:rFonts w:eastAsia="Times New Roman" w:cstheme="minorHAnsi"/>
@@ -16478,7 +16459,7 @@
           <w:szCs w:val="24"/>
         </w:rPr>
       </w:pPr>
-      <w:bookmarkStart w:id="23" w:name="_Ref223032983"/>
+      <w:bookmarkStart w:id="22" w:name="_Ref223032983"/>
       <w:r>
         <w:t xml:space="preserve">Figura </w:t>
       </w:r>
@@ -16490,7 +16471,7 @@
           <w:t>5</w:t>
         </w:r>
       </w:fldSimple>
-      <w:bookmarkEnd w:id="23"/>
+      <w:bookmarkEnd w:id="22"/>
       <w:r>
         <w:t>: Ejemplo de señal PWM para controlar un convertidor conmutado DC/DC.</w:t>
       </w:r>
@@ -17636,7 +17617,7 @@
         <w:t xml:space="preserve"> en uno lineal e invariante. Aunque es válido principalmente para frecuencias muy inferiores a la de conmutación, constituye una herramienta esencial para el desarrollo sistemático de fuentes conmutadas estables y con respuesta transitoria predecible.</w:t>
       </w:r>
     </w:p>
-    <w:bookmarkEnd w:id="22"/>
+    <w:bookmarkEnd w:id="21"/>
     <w:p>
       <w:pPr>
         <w:pStyle w:val="Prrafodelista"/>
@@ -18576,7 +18557,7 @@
           <w:szCs w:val="24"/>
         </w:rPr>
       </w:pPr>
-      <w:bookmarkStart w:id="24" w:name="_Hlk227681184"/>
+      <w:bookmarkStart w:id="23" w:name="_Hlk227681184"/>
       <w:r>
         <w:rPr>
           <w:rFonts w:cstheme="minorHAnsi"/>
@@ -20994,8 +20975,8 @@
       <w:pPr>
         <w:pStyle w:val="Descripcin"/>
       </w:pPr>
-      <w:bookmarkStart w:id="25" w:name="_Ref224131419"/>
-      <w:bookmarkEnd w:id="24"/>
+      <w:bookmarkStart w:id="24" w:name="_Ref224131419"/>
+      <w:bookmarkEnd w:id="23"/>
       <w:r>
         <w:t xml:space="preserve">Figura </w:t>
       </w:r>
@@ -21007,7 +20988,7 @@
           <w:t>6</w:t>
         </w:r>
       </w:fldSimple>
-      <w:bookmarkEnd w:id="25"/>
+      <w:bookmarkEnd w:id="24"/>
       <w:r>
         <w:t>:</w:t>
       </w:r>
@@ -21597,7 +21578,7 @@
                                           </pic:cNvPicPr>
                                         </pic:nvPicPr>
                                         <pic:blipFill>
-                                          <a:blip r:embed="rId20">
+                                          <a:blip r:embed="rId19">
                                             <a:extLst>
                                               <a:ext uri="{28A0092B-C50C-407E-A947-70E740481C1C}">
                                                 <a14:useLocalDpi xmlns:a14="http://schemas.microsoft.com/office/drawing/2010/main" val="0"/>
@@ -21842,7 +21823,7 @@
                                           </pic:cNvPicPr>
                                         </pic:nvPicPr>
                                         <pic:blipFill>
-                                          <a:blip r:embed="rId20">
+                                          <a:blip r:embed="rId19">
                                             <a:extLst>
                                               <a:ext uri="{28A0092B-C50C-407E-A947-70E740481C1C}">
                                                 <a14:useLocalDpi xmlns:a14="http://schemas.microsoft.com/office/drawing/2010/main" val="0"/>
@@ -22087,7 +22068,7 @@
                                           </pic:cNvPicPr>
                                         </pic:nvPicPr>
                                         <pic:blipFill>
-                                          <a:blip r:embed="rId20">
+                                          <a:blip r:embed="rId19">
                                             <a:extLst>
                                               <a:ext uri="{28A0092B-C50C-407E-A947-70E740481C1C}">
                                                 <a14:useLocalDpi xmlns:a14="http://schemas.microsoft.com/office/drawing/2010/main" val="0"/>
@@ -22332,7 +22313,7 @@
                                           </pic:cNvPicPr>
                                         </pic:nvPicPr>
                                         <pic:blipFill>
-                                          <a:blip r:embed="rId20">
+                                          <a:blip r:embed="rId19">
                                             <a:extLst>
                                               <a:ext uri="{28A0092B-C50C-407E-A947-70E740481C1C}">
                                                 <a14:useLocalDpi xmlns:a14="http://schemas.microsoft.com/office/drawing/2010/main" val="0"/>
@@ -23230,7 +23211,7 @@
                                           </pic:cNvPicPr>
                                         </pic:nvPicPr>
                                         <pic:blipFill>
-                                          <a:blip r:embed="rId20">
+                                          <a:blip r:embed="rId19">
                                             <a:extLst>
                                               <a:ext uri="{28A0092B-C50C-407E-A947-70E740481C1C}">
                                                 <a14:useLocalDpi xmlns:a14="http://schemas.microsoft.com/office/drawing/2010/main" val="0"/>
@@ -23729,7 +23710,7 @@
       <w:pPr>
         <w:pStyle w:val="Descripcin"/>
       </w:pPr>
-      <w:bookmarkStart w:id="26" w:name="_Ref224131471"/>
+      <w:bookmarkStart w:id="25" w:name="_Ref224131471"/>
       <w:r>
         <w:t xml:space="preserve">Figura </w:t>
       </w:r>
@@ -23741,7 +23722,7 @@
           <w:t>7</w:t>
         </w:r>
       </w:fldSimple>
-      <w:bookmarkEnd w:id="26"/>
+      <w:bookmarkEnd w:id="25"/>
       <w:r>
         <w:t>:</w:t>
       </w:r>
@@ -24087,7 +24068,7 @@
                                           </pic:cNvPicPr>
                                         </pic:nvPicPr>
                                         <pic:blipFill>
-                                          <a:blip r:embed="rId20">
+                                          <a:blip r:embed="rId19">
                                             <a:extLst>
                                               <a:ext uri="{28A0092B-C50C-407E-A947-70E740481C1C}">
                                                 <a14:useLocalDpi xmlns:a14="http://schemas.microsoft.com/office/drawing/2010/main" val="0"/>
@@ -24332,7 +24313,7 @@
                                           </pic:cNvPicPr>
                                         </pic:nvPicPr>
                                         <pic:blipFill>
-                                          <a:blip r:embed="rId20">
+                                          <a:blip r:embed="rId19">
                                             <a:extLst>
                                               <a:ext uri="{28A0092B-C50C-407E-A947-70E740481C1C}">
                                                 <a14:useLocalDpi xmlns:a14="http://schemas.microsoft.com/office/drawing/2010/main" val="0"/>
@@ -24577,7 +24558,7 @@
                                           </pic:cNvPicPr>
                                         </pic:nvPicPr>
                                         <pic:blipFill>
-                                          <a:blip r:embed="rId20">
+                                          <a:blip r:embed="rId19">
                                             <a:extLst>
                                               <a:ext uri="{28A0092B-C50C-407E-A947-70E740481C1C}">
                                                 <a14:useLocalDpi xmlns:a14="http://schemas.microsoft.com/office/drawing/2010/main" val="0"/>
@@ -24822,7 +24803,7 @@
                                           </pic:cNvPicPr>
                                         </pic:nvPicPr>
                                         <pic:blipFill>
-                                          <a:blip r:embed="rId20">
+                                          <a:blip r:embed="rId19">
                                             <a:extLst>
                                               <a:ext uri="{28A0092B-C50C-407E-A947-70E740481C1C}">
                                                 <a14:useLocalDpi xmlns:a14="http://schemas.microsoft.com/office/drawing/2010/main" val="0"/>
@@ -26103,7 +26084,7 @@
       <w:pPr>
         <w:pStyle w:val="Descripcin"/>
       </w:pPr>
-      <w:bookmarkStart w:id="27" w:name="_Ref224131696"/>
+      <w:bookmarkStart w:id="26" w:name="_Ref224131696"/>
       <w:r>
         <w:t xml:space="preserve">Figura </w:t>
       </w:r>
@@ -26115,7 +26096,7 @@
           <w:t>8</w:t>
         </w:r>
       </w:fldSimple>
-      <w:bookmarkEnd w:id="27"/>
+      <w:bookmarkEnd w:id="26"/>
       <w:r>
         <w:t>:</w:t>
       </w:r>
@@ -28296,7 +28277,7 @@
                                           </pic:cNvPicPr>
                                         </pic:nvPicPr>
                                         <pic:blipFill>
-                                          <a:blip r:embed="rId20">
+                                          <a:blip r:embed="rId19">
                                             <a:extLst>
                                               <a:ext uri="{28A0092B-C50C-407E-A947-70E740481C1C}">
                                                 <a14:useLocalDpi xmlns:a14="http://schemas.microsoft.com/office/drawing/2010/main" val="0"/>
@@ -28657,7 +28638,7 @@
                                           </pic:cNvPicPr>
                                         </pic:nvPicPr>
                                         <pic:blipFill>
-                                          <a:blip r:embed="rId20">
+                                          <a:blip r:embed="rId19">
                                             <a:extLst>
                                               <a:ext uri="{28A0092B-C50C-407E-A947-70E740481C1C}">
                                                 <a14:useLocalDpi xmlns:a14="http://schemas.microsoft.com/office/drawing/2010/main" val="0"/>
@@ -30039,7 +30020,7 @@
       <w:pPr>
         <w:pStyle w:val="Descripcin"/>
       </w:pPr>
-      <w:bookmarkStart w:id="28" w:name="_Ref224131794"/>
+      <w:bookmarkStart w:id="27" w:name="_Ref224131794"/>
       <w:r>
         <w:t xml:space="preserve">Figura </w:t>
       </w:r>
@@ -30051,7 +30032,7 @@
           <w:t>9</w:t>
         </w:r>
       </w:fldSimple>
-      <w:bookmarkEnd w:id="28"/>
+      <w:bookmarkEnd w:id="27"/>
       <w:r>
         <w:t xml:space="preserve">: </w:t>
       </w:r>
@@ -32907,9 +32888,9 @@
         </w:rPr>
         <w:t>METODOLOGÍA</w:t>
       </w:r>
+      <w:bookmarkEnd w:id="10"/>
       <w:bookmarkEnd w:id="11"/>
       <w:bookmarkEnd w:id="12"/>
-      <w:bookmarkEnd w:id="13"/>
     </w:p>
     <w:p>
       <w:pPr>
@@ -33044,9 +33025,9 @@
           <w:szCs w:val="46"/>
         </w:rPr>
       </w:pPr>
-      <w:bookmarkStart w:id="29" w:name="_Toc272509310"/>
-      <w:bookmarkStart w:id="30" w:name="_Toc24203713"/>
-      <w:bookmarkStart w:id="31" w:name="_Toc24204352"/>
+      <w:bookmarkStart w:id="28" w:name="_Toc272509310"/>
+      <w:bookmarkStart w:id="29" w:name="_Toc24203713"/>
+      <w:bookmarkStart w:id="30" w:name="_Toc24204352"/>
       <w:r>
         <w:rPr>
           <w:rFonts w:asciiTheme="minorHAnsi" w:hAnsiTheme="minorHAnsi" w:cstheme="minorHAnsi"/>
@@ -33056,9 +33037,9 @@
         <w:lastRenderedPageBreak/>
         <w:t>RESULTADOS Y DISCUSIÓN</w:t>
       </w:r>
+      <w:bookmarkEnd w:id="28"/>
       <w:bookmarkEnd w:id="29"/>
       <w:bookmarkEnd w:id="30"/>
-      <w:bookmarkEnd w:id="31"/>
     </w:p>
     <w:p>
       <w:pPr>
@@ -33361,9 +33342,9 @@
           <w:szCs w:val="46"/>
         </w:rPr>
       </w:pPr>
-      <w:bookmarkStart w:id="32" w:name="_Toc272509311"/>
-      <w:bookmarkStart w:id="33" w:name="_Toc24203714"/>
-      <w:bookmarkStart w:id="34" w:name="_Toc24204353"/>
+      <w:bookmarkStart w:id="31" w:name="_Toc272509311"/>
+      <w:bookmarkStart w:id="32" w:name="_Toc24203714"/>
+      <w:bookmarkStart w:id="33" w:name="_Toc24204353"/>
       <w:r>
         <w:rPr>
           <w:rFonts w:asciiTheme="minorHAnsi" w:hAnsiTheme="minorHAnsi" w:cstheme="minorHAnsi"/>
@@ -33373,9 +33354,9 @@
         <w:lastRenderedPageBreak/>
         <w:t>CONCLUSIONES, RECOMENDACIONES Y TRABAJO FUTURO</w:t>
       </w:r>
+      <w:bookmarkEnd w:id="31"/>
       <w:bookmarkEnd w:id="32"/>
       <w:bookmarkEnd w:id="33"/>
-      <w:bookmarkEnd w:id="34"/>
     </w:p>
     <w:p>
       <w:pPr>
@@ -33725,25 +33706,7 @@
           <w:sz w:val="24"/>
           <w:szCs w:val="24"/>
         </w:rPr>
-        <w:t xml:space="preserve">se describen aquellos puntos que pudieran mejorar el trabajo y que no fueron tenidos en cuenta durante la realización o que fueron descubiertos en el desarrollo de </w:t>
-      </w:r>
-      <w:proofErr w:type="gramStart"/>
-      <w:r>
-        <w:rPr>
-          <w:rFonts w:cstheme="minorHAnsi"/>
-          <w:sz w:val="24"/>
-          <w:szCs w:val="24"/>
-        </w:rPr>
-        <w:t>la misma</w:t>
-      </w:r>
-      <w:proofErr w:type="gramEnd"/>
-      <w:r>
-        <w:rPr>
-          <w:rFonts w:cstheme="minorHAnsi"/>
-          <w:sz w:val="24"/>
-          <w:szCs w:val="24"/>
-        </w:rPr>
-        <w:t xml:space="preserve">. </w:t>
+        <w:t xml:space="preserve">se describen aquellos puntos que pudieran mejorar el trabajo y que no fueron tenidos en cuenta durante la realización o que fueron descubiertos en el desarrollo de la misma. </w:t>
       </w:r>
     </w:p>
     <w:p>
@@ -33815,9 +33778,9 @@
           <w:rFonts w:asciiTheme="minorHAnsi" w:hAnsiTheme="minorHAnsi" w:cstheme="minorHAnsi"/>
         </w:rPr>
       </w:pPr>
-      <w:bookmarkStart w:id="35" w:name="_Toc24203715"/>
-      <w:bookmarkStart w:id="36" w:name="_Toc24204354"/>
-      <w:bookmarkStart w:id="37" w:name="_Toc272509312"/>
+      <w:bookmarkStart w:id="34" w:name="_Toc24203715"/>
+      <w:bookmarkStart w:id="35" w:name="_Toc24204354"/>
+      <w:bookmarkStart w:id="36" w:name="_Toc272509312"/>
       <w:r>
         <w:rPr>
           <w:rFonts w:asciiTheme="minorHAnsi" w:hAnsiTheme="minorHAnsi" w:cstheme="minorHAnsi"/>
@@ -33827,8 +33790,8 @@
         <w:lastRenderedPageBreak/>
         <w:t>REFERENCIAS</w:t>
       </w:r>
+      <w:bookmarkEnd w:id="34"/>
       <w:bookmarkEnd w:id="35"/>
-      <w:bookmarkEnd w:id="36"/>
     </w:p>
     <w:p>
       <w:pPr>
@@ -33956,8 +33919,8 @@
           <w:szCs w:val="46"/>
         </w:rPr>
       </w:pPr>
-      <w:bookmarkStart w:id="38" w:name="_Toc24203716"/>
-      <w:bookmarkStart w:id="39" w:name="_Toc24204355"/>
+      <w:bookmarkStart w:id="37" w:name="_Toc24203716"/>
+      <w:bookmarkStart w:id="38" w:name="_Toc24204355"/>
       <w:r>
         <w:rPr>
           <w:rFonts w:asciiTheme="minorHAnsi" w:hAnsiTheme="minorHAnsi" w:cstheme="minorHAnsi"/>
@@ -33975,9 +33938,9 @@
         </w:rPr>
         <w:t>NEXOS</w:t>
       </w:r>
+      <w:bookmarkEnd w:id="36"/>
       <w:bookmarkEnd w:id="37"/>
       <w:bookmarkEnd w:id="38"/>
-      <w:bookmarkEnd w:id="39"/>
     </w:p>
     <w:p>
       <w:pPr>
@@ -34618,7 +34581,7 @@
 
 <file path=word/comments.xml><?xml version="1.0" encoding="utf-8"?>
 <w:comments xmlns:wpc="http://schemas.microsoft.com/office/word/2010/wordprocessingCanvas" xmlns:cx="http://schemas.microsoft.com/office/drawing/2014/chartex" xmlns:cx1="http://schemas.microsoft.com/office/drawing/2015/9/8/chartex" xmlns:cx2="http://schemas.microsoft.com/office/drawing/2015/10/21/chartex" xmlns:cx3="http://schemas.microsoft.com/office/drawing/2016/5/9/chartex" xmlns:cx4="http://schemas.microsoft.com/office/drawing/2016/5/10/chartex" xmlns:cx5="http://schemas.microsoft.com/office/drawing/2016/5/11/chartex" xmlns:cx6="http://schemas.microsoft.com/office/drawing/2016/5/12/chartex" xmlns:cx7="http://schemas.microsoft.com/office/drawing/2016/5/13/chartex" xmlns:cx8="http://schemas.microsoft.com/office/drawing/2016/5/14/chartex" xmlns:mc="http://schemas.openxmlformats.org/markup-compatibility/2006" xmlns:aink="http://schemas.microsoft.com/office/drawing/2016/ink" xmlns:am3d="http://schemas.microsoft.com/office/drawing/2017/model3d" xmlns:o="urn:schemas-microsoft-com:office:office" xmlns:oel="http://schemas.microsoft.com/office/2019/extlst" xmlns:r="http://schemas.openxmlformats.org/officeDocument/2006/relationships" xmlns:m="http://schemas.openxmlformats.org/officeDocument/2006/math" xmlns:v="urn:schemas-microsoft-com:vml" xmlns:wp14="http://schemas.microsoft.com/office/word/2010/wordprocessingDrawing" xmlns:wp="http://schemas.openxmlformats.org/drawingml/2006/wordprocessingDrawing" xmlns:w10="urn:schemas-microsoft-com:office:word" xmlns:w="http://schemas.openxmlformats.org/wordprocessingml/2006/main" xmlns:w14="http://schemas.microsoft.com/office/word/2010/wordml" xmlns:w15="http://schemas.microsoft.com/office/word/2012/wordml" xmlns:w16cex="http://schemas.microsoft.com/office/word/2018/wordml/cex" xmlns:w16cid="http://schemas.microsoft.com/office/word/2016/wordml/cid" xmlns:w16="http://schemas.microsoft.com/office/word/2018/wordml" xmlns:w16sdtdh="http://schemas.microsoft.com/office/word/2020/wordml/sdtdatahash" xmlns:w16se="http://schemas.microsoft.com/office/word/2015/wordml/symex" xmlns:wpg="http://schemas.microsoft.com/office/word/2010/wordprocessingGroup" xmlns:wpi="http://schemas.microsoft.com/office/word/2010/wordprocessingInk" xmlns:wne="http://schemas.microsoft.com/office/word/2006/wordml" xmlns:wps="http://schemas.microsoft.com/office/word/2010/wordprocessingShape" mc:Ignorable="w14 w15 w16se w16cid w16 w16cex w16sdtdh wp14">
-  <w:comment w:id="4" w:author="Sergio Ignacio Serna Garces" w:date="2026-02-26T16:23:00Z" w:initials="SS">
+  <w:comment w:id="3" w:author="Sergio Ignacio Serna Garces" w:date="2026-02-26T16:23:00Z" w:initials="SS">
     <w:p>
       <w:r>
         <w:rPr>
@@ -34635,7 +34598,7 @@
       </w:r>
     </w:p>
   </w:comment>
-  <w:comment w:id="14" w:author="Sergio Ignacio Serna Garces" w:date="2026-02-26T18:15:00Z" w:initials="SS">
+  <w:comment w:id="13" w:author="Sergio Ignacio Serna Garces" w:date="2026-02-26T18:15:00Z" w:initials="SS">
     <w:p>
       <w:r>
         <w:rPr>
@@ -34652,7 +34615,7 @@
       </w:r>
     </w:p>
   </w:comment>
-  <w:comment w:id="16" w:author="Sergio Ignacio Serna Garces" w:date="2026-02-26T16:25:00Z" w:initials="SS">
+  <w:comment w:id="15" w:author="Sergio Ignacio Serna Garces" w:date="2026-02-26T16:25:00Z" w:initials="SS">
     <w:p>
       <w:r>
         <w:rPr>
@@ -34669,7 +34632,7 @@
       </w:r>
     </w:p>
   </w:comment>
-  <w:comment w:id="17" w:author="Sergio Ignacio Serna Garces" w:date="2026-03-05T10:40:00Z" w:initials="SS">
+  <w:comment w:id="16" w:author="Sergio Ignacio Serna Garces" w:date="2026-03-05T10:40:00Z" w:initials="SS">
     <w:p>
       <w:r>
         <w:rPr>
@@ -34686,7 +34649,7 @@
       </w:r>
     </w:p>
   </w:comment>
-  <w:comment w:id="20" w:author="Sergio Ignacio Serna Garces" w:date="2026-02-26T16:26:00Z" w:initials="SS">
+  <w:comment w:id="19" w:author="Sergio Ignacio Serna Garces" w:date="2026-02-26T16:26:00Z" w:initials="SS">
     <w:p>
       <w:r>
         <w:rPr>
@@ -34701,41 +34664,16 @@
         </w:rPr>
         <w:t xml:space="preserve">Poner subíndice a voltajes y corrientes y resistencia de carga.  Vo y </w:t>
       </w:r>
-      <w:proofErr w:type="spellStart"/>
       <w:r>
         <w:rPr>
           <w:sz w:val="20"/>
           <w:szCs w:val="20"/>
         </w:rPr>
-        <w:t>Vc</w:t>
-      </w:r>
-      <w:proofErr w:type="spellEnd"/>
-      <w:r>
-        <w:rPr>
-          <w:sz w:val="20"/>
-          <w:szCs w:val="20"/>
-        </w:rPr>
-        <w:t xml:space="preserve"> son iguales, quitar </w:t>
-      </w:r>
-      <w:proofErr w:type="spellStart"/>
-      <w:r>
-        <w:rPr>
-          <w:sz w:val="20"/>
-          <w:szCs w:val="20"/>
-        </w:rPr>
-        <w:t>Vc</w:t>
-      </w:r>
-      <w:proofErr w:type="spellEnd"/>
-      <w:r>
-        <w:rPr>
-          <w:sz w:val="20"/>
-          <w:szCs w:val="20"/>
-        </w:rPr>
-        <w:t xml:space="preserve"> y dejar Vo. Poner subíndice a Q1 y Q2 y llamar a la señal PWM solo PWM no PWM1.</w:t>
+        <w:t>Vc son iguales, quitar Vc y dejar Vo. Poner subíndice a Q1 y Q2 y llamar a la señal PWM solo PWM no PWM1.</w:t>
       </w:r>
     </w:p>
   </w:comment>
-  <w:comment w:id="21" w:author="Sergio Ignacio Serna Garces" w:date="2026-02-26T17:47:00Z" w:initials="SS">
+  <w:comment w:id="20" w:author="Sergio Ignacio Serna Garces" w:date="2026-02-26T17:47:00Z" w:initials="SS">
     <w:p>
       <w:r>
         <w:rPr>
@@ -35313,7 +35251,7 @@
         <v:path o:extrusionok="f" gradientshapeok="t" o:connecttype="rect"/>
         <o:lock v:ext="edit" aspectratio="t"/>
       </v:shapetype>
-      <v:shape id="_x0000_i1036" type="#_x0000_t75" style="width:25pt;height:20pt;visibility:visible;mso-wrap-style:square" o:bullet="t">
+      <v:shape id="_x0000_i1057" type="#_x0000_t75" style="width:25pt;height:20pt;visibility:visible;mso-wrap-style:square" o:bullet="t">
         <v:imagedata r:id="rId1" o:title=""/>
       </v:shape>
     </w:pict>

</xml_diff>

<commit_message>
Tarea inicial para el marco teórico
</commit_message>
<xml_diff>
--- a/FDE-089-Informe-final-TdG- SImulación_en_HIL_Para_Convertidores_DCDC.docx
+++ b/FDE-089-Informe-final-TdG- SImulación_en_HIL_Para_Convertidores_DCDC.docx
@@ -1,6 +1,6 @@
 
 <file path=word/document.xml><?xml version="1.0" encoding="utf-8"?>
-<w:document xmlns:wpc="http://schemas.microsoft.com/office/word/2010/wordprocessingCanvas" xmlns:cx="http://schemas.microsoft.com/office/drawing/2014/chartex" xmlns:cx1="http://schemas.microsoft.com/office/drawing/2015/9/8/chartex" xmlns:cx2="http://schemas.microsoft.com/office/drawing/2015/10/21/chartex" xmlns:cx3="http://schemas.microsoft.com/office/drawing/2016/5/9/chartex" xmlns:cx4="http://schemas.microsoft.com/office/drawing/2016/5/10/chartex" xmlns:cx5="http://schemas.microsoft.com/office/drawing/2016/5/11/chartex" xmlns:cx6="http://schemas.microsoft.com/office/drawing/2016/5/12/chartex" xmlns:cx7="http://schemas.microsoft.com/office/drawing/2016/5/13/chartex" xmlns:cx8="http://schemas.microsoft.com/office/drawing/2016/5/14/chartex" xmlns:mc="http://schemas.openxmlformats.org/markup-compatibility/2006" xmlns:aink="http://schemas.microsoft.com/office/drawing/2016/ink" xmlns:am3d="http://schemas.microsoft.com/office/drawing/2017/model3d" xmlns:o="urn:schemas-microsoft-com:office:office" xmlns:oel="http://schemas.microsoft.com/office/2019/extlst" xmlns:r="http://schemas.openxmlformats.org/officeDocument/2006/relationships" xmlns:m="http://schemas.openxmlformats.org/officeDocument/2006/math" xmlns:v="urn:schemas-microsoft-com:vml" xmlns:wp14="http://schemas.microsoft.com/office/word/2010/wordprocessingDrawing" xmlns:wp="http://schemas.openxmlformats.org/drawingml/2006/wordprocessingDrawing" xmlns:w10="urn:schemas-microsoft-com:office:word" xmlns:w="http://schemas.openxmlformats.org/wordprocessingml/2006/main" xmlns:w14="http://schemas.microsoft.com/office/word/2010/wordml" xmlns:w15="http://schemas.microsoft.com/office/word/2012/wordml" xmlns:w16cex="http://schemas.microsoft.com/office/word/2018/wordml/cex" xmlns:w16cid="http://schemas.microsoft.com/office/word/2016/wordml/cid" xmlns:w16="http://schemas.microsoft.com/office/word/2018/wordml" xmlns:w16sdtdh="http://schemas.microsoft.com/office/word/2020/wordml/sdtdatahash" xmlns:w16se="http://schemas.microsoft.com/office/word/2015/wordml/symex" xmlns:wpg="http://schemas.microsoft.com/office/word/2010/wordprocessingGroup" xmlns:wpi="http://schemas.microsoft.com/office/word/2010/wordprocessingInk" xmlns:wne="http://schemas.microsoft.com/office/word/2006/wordml" xmlns:wps="http://schemas.microsoft.com/office/word/2010/wordprocessingShape" mc:Ignorable="w14 w15 w16se w16cid w16 w16cex w16sdtdh wp14">
+<w:document xmlns:wpc="http://schemas.microsoft.com/office/word/2010/wordprocessingCanvas" xmlns:cx="http://schemas.microsoft.com/office/drawing/2014/chartex" xmlns:cx1="http://schemas.microsoft.com/office/drawing/2015/9/8/chartex" xmlns:cx2="http://schemas.microsoft.com/office/drawing/2015/10/21/chartex" xmlns:cx3="http://schemas.microsoft.com/office/drawing/2016/5/9/chartex" xmlns:cx4="http://schemas.microsoft.com/office/drawing/2016/5/10/chartex" xmlns:cx5="http://schemas.microsoft.com/office/drawing/2016/5/11/chartex" xmlns:cx6="http://schemas.microsoft.com/office/drawing/2016/5/12/chartex" xmlns:cx7="http://schemas.microsoft.com/office/drawing/2016/5/13/chartex" xmlns:cx8="http://schemas.microsoft.com/office/drawing/2016/5/14/chartex" xmlns:mc="http://schemas.openxmlformats.org/markup-compatibility/2006" xmlns:m="http://schemas.openxmlformats.org/officeDocument/2006/math" xmlns:aink="http://schemas.microsoft.com/office/drawing/2016/ink" xmlns:am3d="http://schemas.microsoft.com/office/drawing/2017/model3d" xmlns:oel="http://schemas.microsoft.com/office/2019/extlst" xmlns:r="http://schemas.openxmlformats.org/officeDocument/2006/relationships" xmlns:wp14="http://schemas.microsoft.com/office/word/2010/wordprocessingDrawing" xmlns:wp="http://schemas.openxmlformats.org/drawingml/2006/wordprocessingDrawing" xmlns:wpg="http://schemas.microsoft.com/office/word/2010/wordprocessingGroup" xmlns:wpi="http://schemas.microsoft.com/office/word/2010/wordprocessingInk" xmlns:wps="http://schemas.microsoft.com/office/word/2010/wordprocessingShape" xmlns:o="urn:schemas-microsoft-com:office:office" xmlns:v="urn:schemas-microsoft-com:vml" xmlns:w10="urn:schemas-microsoft-com:office:word" xmlns:w="http://schemas.openxmlformats.org/wordprocessingml/2006/main" xmlns:w14="http://schemas.microsoft.com/office/word/2010/wordml" xmlns:w15="http://schemas.microsoft.com/office/word/2012/wordml" xmlns:w16cex="http://schemas.microsoft.com/office/word/2018/wordml/cex" xmlns:w16cid="http://schemas.microsoft.com/office/word/2016/wordml/cid" xmlns:w16="http://schemas.microsoft.com/office/word/2018/wordml" xmlns:w16sdtdh="http://schemas.microsoft.com/office/word/2020/wordml/sdtdatahash" xmlns:w16sdtfl="http://schemas.microsoft.com/office/word/2024/wordml/sdtformatlock" xmlns:w16se="http://schemas.microsoft.com/office/word/2015/wordml/symex" xmlns:w16du="http://schemas.microsoft.com/office/word/2023/wordml/word16du" xmlns:wne="http://schemas.microsoft.com/office/word/2006/wordml" mc:Ignorable="w14 w15 w16se w16cid w16 w16cex w16sdtdh w16sdtfl w16du wp14">
   <w:body>
     <w:p>
       <w:pPr>
@@ -98,23 +98,7 @@
           <w:sz w:val="32"/>
           <w:szCs w:val="32"/>
         </w:rPr>
-        <w:t xml:space="preserve">María </w:t>
-      </w:r>
-      <w:proofErr w:type="spellStart"/>
-      <w:r>
-        <w:rPr>
-          <w:sz w:val="32"/>
-          <w:szCs w:val="32"/>
-        </w:rPr>
-        <w:t>Ceneida</w:t>
-      </w:r>
-      <w:proofErr w:type="spellEnd"/>
-      <w:r>
-        <w:rPr>
-          <w:sz w:val="32"/>
-          <w:szCs w:val="32"/>
-        </w:rPr>
-        <w:t xml:space="preserve"> Loaiza Bustamante</w:t>
+        <w:t>María Ceneida Loaiza Bustamante</w:t>
       </w:r>
     </w:p>
     <w:p>
@@ -568,43 +552,7 @@
           <w:sz w:val="24"/>
           <w:szCs w:val="24"/>
         </w:rPr>
-        <w:t>El presente trabajo tiene como objetivo el desarrollo de una plataforma de simulación en hardware para convertidores de potencia DC-DC no aislados, específicamente las topologías Buck y Boost, empleando la técnica Hardware-In-</w:t>
-      </w:r>
-      <w:proofErr w:type="spellStart"/>
-      <w:r>
-        <w:rPr>
-          <w:rFonts w:cstheme="minorHAnsi"/>
-          <w:sz w:val="24"/>
-          <w:szCs w:val="24"/>
-        </w:rPr>
-        <w:t>the</w:t>
-      </w:r>
-      <w:proofErr w:type="spellEnd"/>
-      <w:r>
-        <w:rPr>
-          <w:rFonts w:cstheme="minorHAnsi"/>
-          <w:sz w:val="24"/>
-          <w:szCs w:val="24"/>
-        </w:rPr>
-        <w:t>-</w:t>
-      </w:r>
-      <w:proofErr w:type="spellStart"/>
-      <w:r>
-        <w:rPr>
-          <w:rFonts w:cstheme="minorHAnsi"/>
-          <w:sz w:val="24"/>
-          <w:szCs w:val="24"/>
-        </w:rPr>
-        <w:t>Loop</w:t>
-      </w:r>
-      <w:proofErr w:type="spellEnd"/>
-      <w:r>
-        <w:rPr>
-          <w:rFonts w:cstheme="minorHAnsi"/>
-          <w:sz w:val="24"/>
-          <w:szCs w:val="24"/>
-        </w:rPr>
-        <w:t xml:space="preserve"> (HIL) basada en FPGA. Esta propuesta surge ante la necesidad de reducir los altos costos, tiempos prolongados y riesgos asociados al prototipado físico tradicional de convertidores de potencia, los cuales constituyen un componente esencial en sistemas de energía como fuentes conmutadas, vehículos eléctricos y aplicaciones industriales.</w:t>
+        <w:t>El presente trabajo tiene como objetivo el desarrollo de una plataforma de simulación en hardware para convertidores de potencia DC-DC no aislados, específicamente las topologías Buck y Boost, empleando la técnica Hardware-In-the-Loop (HIL) basada en FPGA. Esta propuesta surge ante la necesidad de reducir los altos costos, tiempos prolongados y riesgos asociados al prototipado físico tradicional de convertidores de potencia, los cuales constituyen un componente esencial en sistemas de energía como fuentes conmutadas, vehículos eléctricos y aplicaciones industriales.</w:t>
       </w:r>
     </w:p>
     <w:p>
@@ -668,61 +616,7 @@
           <w:sz w:val="24"/>
           <w:szCs w:val="24"/>
         </w:rPr>
-        <w:t xml:space="preserve"> Convertidores DC-DC, Buck, </w:t>
-      </w:r>
-      <w:proofErr w:type="spellStart"/>
-      <w:r>
-        <w:rPr>
-          <w:rFonts w:cstheme="minorHAnsi"/>
-          <w:sz w:val="24"/>
-          <w:szCs w:val="24"/>
-        </w:rPr>
-        <w:t>Boost</w:t>
-      </w:r>
-      <w:proofErr w:type="spellEnd"/>
-      <w:r>
-        <w:rPr>
-          <w:rFonts w:cstheme="minorHAnsi"/>
-          <w:sz w:val="24"/>
-          <w:szCs w:val="24"/>
-        </w:rPr>
-        <w:t>, FPGA, Hardware-In-</w:t>
-      </w:r>
-      <w:proofErr w:type="spellStart"/>
-      <w:r>
-        <w:rPr>
-          <w:rFonts w:cstheme="minorHAnsi"/>
-          <w:sz w:val="24"/>
-          <w:szCs w:val="24"/>
-        </w:rPr>
-        <w:t>the</w:t>
-      </w:r>
-      <w:proofErr w:type="spellEnd"/>
-      <w:r>
-        <w:rPr>
-          <w:rFonts w:cstheme="minorHAnsi"/>
-          <w:sz w:val="24"/>
-          <w:szCs w:val="24"/>
-        </w:rPr>
-        <w:t>-</w:t>
-      </w:r>
-      <w:proofErr w:type="spellStart"/>
-      <w:r>
-        <w:rPr>
-          <w:rFonts w:cstheme="minorHAnsi"/>
-          <w:sz w:val="24"/>
-          <w:szCs w:val="24"/>
-        </w:rPr>
-        <w:t>Loop</w:t>
-      </w:r>
-      <w:proofErr w:type="spellEnd"/>
-      <w:r>
-        <w:rPr>
-          <w:rFonts w:cstheme="minorHAnsi"/>
-          <w:sz w:val="24"/>
-          <w:szCs w:val="24"/>
-        </w:rPr>
-        <w:t>, HIL, VHDL, Electrónica de potencia.</w:t>
+        <w:t xml:space="preserve"> Convertidores DC-DC, Buck, Boost, FPGA, Hardware-In-the-Loop, HIL, VHDL, Electrónica de potencia.</w:t>
       </w:r>
     </w:p>
     <w:p>
@@ -1032,43 +926,7 @@
           <w:sz w:val="24"/>
           <w:szCs w:val="24"/>
         </w:rPr>
-        <w:t>orriente alterna (</w:t>
-      </w:r>
-      <w:proofErr w:type="spellStart"/>
-      <w:r>
-        <w:rPr>
-          <w:rFonts w:cstheme="minorHAnsi"/>
-          <w:sz w:val="24"/>
-          <w:szCs w:val="24"/>
-        </w:rPr>
-        <w:t>Alternating</w:t>
-      </w:r>
-      <w:proofErr w:type="spellEnd"/>
-      <w:r>
-        <w:rPr>
-          <w:rFonts w:cstheme="minorHAnsi"/>
-          <w:sz w:val="24"/>
-          <w:szCs w:val="24"/>
-        </w:rPr>
-        <w:t xml:space="preserve"> </w:t>
-      </w:r>
-      <w:proofErr w:type="spellStart"/>
-      <w:r>
-        <w:rPr>
-          <w:rFonts w:cstheme="minorHAnsi"/>
-          <w:sz w:val="24"/>
-          <w:szCs w:val="24"/>
-        </w:rPr>
-        <w:t>Current</w:t>
-      </w:r>
-      <w:proofErr w:type="spellEnd"/>
-      <w:r>
-        <w:rPr>
-          <w:rFonts w:cstheme="minorHAnsi"/>
-          <w:sz w:val="24"/>
-          <w:szCs w:val="24"/>
-        </w:rPr>
-        <w:t>)</w:t>
+        <w:t>orriente alterna (Alternating Current)</w:t>
       </w:r>
       <w:r>
         <w:rPr>
@@ -1077,61 +935,7 @@
           <w:szCs w:val="24"/>
         </w:rPr>
         <w:br/>
-        <w:t>ADC Convertidor analógico–digital (</w:t>
-      </w:r>
-      <w:proofErr w:type="spellStart"/>
-      <w:r>
-        <w:rPr>
-          <w:rFonts w:cstheme="minorHAnsi"/>
-          <w:sz w:val="24"/>
-          <w:szCs w:val="24"/>
-        </w:rPr>
-        <w:t>Analog</w:t>
-      </w:r>
-      <w:proofErr w:type="spellEnd"/>
-      <w:r>
-        <w:rPr>
-          <w:rFonts w:cstheme="minorHAnsi"/>
-          <w:sz w:val="24"/>
-          <w:szCs w:val="24"/>
-        </w:rPr>
-        <w:t>-</w:t>
-      </w:r>
-      <w:proofErr w:type="spellStart"/>
-      <w:r>
-        <w:rPr>
-          <w:rFonts w:cstheme="minorHAnsi"/>
-          <w:sz w:val="24"/>
-          <w:szCs w:val="24"/>
-        </w:rPr>
-        <w:t>to</w:t>
-      </w:r>
-      <w:proofErr w:type="spellEnd"/>
-      <w:r>
-        <w:rPr>
-          <w:rFonts w:cstheme="minorHAnsi"/>
-          <w:sz w:val="24"/>
-          <w:szCs w:val="24"/>
-        </w:rPr>
-        <w:t xml:space="preserve">-Digital </w:t>
-      </w:r>
-      <w:proofErr w:type="spellStart"/>
-      <w:r>
-        <w:rPr>
-          <w:rFonts w:cstheme="minorHAnsi"/>
-          <w:sz w:val="24"/>
-          <w:szCs w:val="24"/>
-        </w:rPr>
-        <w:t>Converter</w:t>
-      </w:r>
-      <w:proofErr w:type="spellEnd"/>
-      <w:r>
-        <w:rPr>
-          <w:rFonts w:cstheme="minorHAnsi"/>
-          <w:sz w:val="24"/>
-          <w:szCs w:val="24"/>
-        </w:rPr>
-        <w:t>)</w:t>
+        <w:t>ADC Convertidor analógico–digital (Analog-to-Digital Converter)</w:t>
       </w:r>
       <w:r>
         <w:rPr>
@@ -1158,25 +962,7 @@
           <w:szCs w:val="24"/>
         </w:rPr>
         <w:br/>
-        <w:t xml:space="preserve">DC  Corriente continua (Direct </w:t>
-      </w:r>
-      <w:proofErr w:type="spellStart"/>
-      <w:r>
-        <w:rPr>
-          <w:rFonts w:cstheme="minorHAnsi"/>
-          <w:sz w:val="24"/>
-          <w:szCs w:val="24"/>
-        </w:rPr>
-        <w:t>Current</w:t>
-      </w:r>
-      <w:proofErr w:type="spellEnd"/>
-      <w:r>
-        <w:rPr>
-          <w:rFonts w:cstheme="minorHAnsi"/>
-          <w:sz w:val="24"/>
-          <w:szCs w:val="24"/>
-        </w:rPr>
-        <w:t>)</w:t>
+        <w:t>DC  Corriente continua (Direct Current)</w:t>
       </w:r>
       <w:r>
         <w:rPr>
@@ -1220,25 +1006,7 @@
           <w:szCs w:val="24"/>
         </w:rPr>
         <w:br/>
-        <w:t xml:space="preserve">FPGA Arreglo de compuertas programables en campo (Field </w:t>
-      </w:r>
-      <w:proofErr w:type="spellStart"/>
-      <w:r>
-        <w:rPr>
-          <w:rFonts w:cstheme="minorHAnsi"/>
-          <w:sz w:val="24"/>
-          <w:szCs w:val="24"/>
-        </w:rPr>
-        <w:t>Programmable</w:t>
-      </w:r>
-      <w:proofErr w:type="spellEnd"/>
-      <w:r>
-        <w:rPr>
-          <w:rFonts w:cstheme="minorHAnsi"/>
-          <w:sz w:val="24"/>
-          <w:szCs w:val="24"/>
-        </w:rPr>
-        <w:t xml:space="preserve"> Gate Array)</w:t>
+        <w:t>FPGA Arreglo de compuertas programables en campo (Field Programmable Gate Array)</w:t>
       </w:r>
       <w:r>
         <w:rPr>
@@ -1247,36 +1015,8 @@
           <w:szCs w:val="24"/>
         </w:rPr>
         <w:br/>
-        <w:t>HIL Hardware-in-</w:t>
-      </w:r>
-      <w:proofErr w:type="spellStart"/>
-      <w:r>
-        <w:rPr>
-          <w:rFonts w:cstheme="minorHAnsi"/>
-          <w:sz w:val="24"/>
-          <w:szCs w:val="24"/>
-        </w:rPr>
-        <w:t>the</w:t>
-      </w:r>
-      <w:proofErr w:type="spellEnd"/>
-      <w:r>
-        <w:rPr>
-          <w:rFonts w:cstheme="minorHAnsi"/>
-          <w:sz w:val="24"/>
-          <w:szCs w:val="24"/>
-        </w:rPr>
-        <w:t>-</w:t>
-      </w:r>
-      <w:proofErr w:type="spellStart"/>
-      <w:r>
-        <w:rPr>
-          <w:rFonts w:cstheme="minorHAnsi"/>
-          <w:sz w:val="24"/>
-          <w:szCs w:val="24"/>
-        </w:rPr>
-        <w:t>Loop</w:t>
-      </w:r>
-      <w:proofErr w:type="spellEnd"/>
+        <w:t>HIL Hardware-in-the-Loop</w:t>
+      </w:r>
       <w:r>
         <w:rPr>
           <w:rFonts w:cstheme="minorHAnsi"/>
@@ -2749,6 +2489,7 @@
         <w:jc w:val="both"/>
         <w:rPr>
           <w:rFonts w:eastAsia="Times New Roman" w:cstheme="minorHAnsi"/>
+          <w:color w:val="EE0000"/>
           <w:sz w:val="24"/>
           <w:szCs w:val="24"/>
         </w:rPr>
@@ -2756,6 +2497,59 @@
       <w:bookmarkStart w:id="10" w:name="_Toc272509309"/>
       <w:bookmarkStart w:id="11" w:name="_Toc24203712"/>
       <w:bookmarkStart w:id="12" w:name="_Toc24204351"/>
+      <w:r>
+        <w:rPr>
+          <w:rFonts w:eastAsia="Times New Roman" w:cstheme="minorHAnsi"/>
+          <w:color w:val="EE0000"/>
+          <w:sz w:val="24"/>
+          <w:szCs w:val="24"/>
+        </w:rPr>
+        <w:t>Este marco teórico debe comenzar por la importancia de los sistemas de simulación en hardware para el desarrollo de controladores en aplicaciones industriales y en entornos de investigación.</w:t>
+      </w:r>
+    </w:p>
+    <w:p>
+      <w:pPr>
+        <w:spacing w:after="0"/>
+        <w:jc w:val="both"/>
+        <w:rPr>
+          <w:rFonts w:eastAsia="Times New Roman" w:cstheme="minorHAnsi"/>
+          <w:color w:val="EE0000"/>
+          <w:sz w:val="24"/>
+          <w:szCs w:val="24"/>
+        </w:rPr>
+      </w:pPr>
+      <w:r>
+        <w:rPr>
+          <w:rFonts w:eastAsia="Times New Roman" w:cstheme="minorHAnsi"/>
+          <w:color w:val="EE0000"/>
+          <w:sz w:val="24"/>
+          <w:szCs w:val="24"/>
+        </w:rPr>
+        <w:t>El contexto: enfocarlo en la simulación HIL para convertidores de potencia.</w:t>
+      </w:r>
+    </w:p>
+    <w:p>
+      <w:pPr>
+        <w:spacing w:after="0"/>
+        <w:jc w:val="both"/>
+        <w:rPr>
+          <w:rFonts w:eastAsia="Times New Roman" w:cstheme="minorHAnsi"/>
+          <w:color w:val="EE0000"/>
+          <w:sz w:val="24"/>
+          <w:szCs w:val="24"/>
+        </w:rPr>
+      </w:pPr>
+    </w:p>
+    <w:p>
+      <w:pPr>
+        <w:spacing w:after="0"/>
+        <w:jc w:val="both"/>
+        <w:rPr>
+          <w:rFonts w:eastAsia="Times New Roman" w:cstheme="minorHAnsi"/>
+          <w:sz w:val="24"/>
+          <w:szCs w:val="24"/>
+        </w:rPr>
+      </w:pPr>
       <w:r>
         <w:rPr>
           <w:rFonts w:eastAsia="Times New Roman" w:cstheme="minorHAnsi"/>
@@ -3137,21 +2931,8 @@
           <w:szCs w:val="24"/>
           <w:lang w:val="es-MX"/>
         </w:rPr>
-        <w:t xml:space="preserve">Convertidor </w:t>
-      </w:r>
-      <w:proofErr w:type="spellStart"/>
-      <w:r>
-        <w:rPr>
-          <w:rFonts w:cstheme="minorHAnsi"/>
-          <w:b/>
-          <w:bCs/>
-          <w:sz w:val="24"/>
-          <w:szCs w:val="24"/>
-          <w:lang w:val="es-MX"/>
-        </w:rPr>
-        <w:t>Boost</w:t>
-      </w:r>
-      <w:proofErr w:type="spellEnd"/>
+        <w:t>Convertidor Boost</w:t>
+      </w:r>
     </w:p>
     <w:p>
       <w:pPr>
@@ -3170,9 +2951,9 @@
           <w:szCs w:val="24"/>
           <w:lang w:val="es-MX"/>
         </w:rPr>
+        <w:lastRenderedPageBreak/>
         <w:t xml:space="preserve">El convertidor </w:t>
       </w:r>
-      <w:proofErr w:type="spellStart"/>
       <w:r>
         <w:rPr>
           <w:rFonts w:cstheme="minorHAnsi"/>
@@ -3189,17 +2970,7 @@
           <w:szCs w:val="24"/>
           <w:lang w:val="es-MX"/>
         </w:rPr>
-        <w:t>oost</w:t>
-      </w:r>
-      <w:proofErr w:type="spellEnd"/>
-      <w:r>
-        <w:rPr>
-          <w:rFonts w:cstheme="minorHAnsi"/>
-          <w:sz w:val="24"/>
-          <w:szCs w:val="24"/>
-          <w:lang w:val="es-MX"/>
-        </w:rPr>
-        <w:t xml:space="preserve"> es un convertidor de potencia de tipo </w:t>
+        <w:t xml:space="preserve">oost es un convertidor de potencia de tipo </w:t>
       </w:r>
       <w:r>
         <w:rPr>
@@ -3235,7 +3006,6 @@
           <w:sz w:val="24"/>
           <w:szCs w:val="24"/>
         </w:rPr>
-        <w:lastRenderedPageBreak/>
         <w:t xml:space="preserve">Funciona mediante la conmutación rápida de un </w:t>
       </w:r>
       <w:r>
@@ -3652,7 +3422,7 @@
                 <v:stroke joinstyle="miter"/>
                 <v:path gradientshapeok="t" o:connecttype="rect"/>
               </v:shapetype>
-              <v:shape id="Cuadro de texto 32" o:spid="_x0000_s1026" type="#_x0000_t202" style="position:absolute;margin-left:415.95pt;margin-top:46.35pt;width:20pt;height:23pt;z-index:251692032;visibility:visible;mso-wrap-style:square;mso-width-percent:0;mso-height-percent:0;mso-wrap-distance-left:9pt;mso-wrap-distance-top:0;mso-wrap-distance-right:9pt;mso-wrap-distance-bottom:0;mso-position-horizontal:absolute;mso-position-horizontal-relative:text;mso-position-vertical:absolute;mso-position-vertical-relative:text;mso-width-percent:0;mso-height-percent:0;mso-width-relative:margin;mso-height-relative:margin;v-text-anchor:top" o:gfxdata="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" filled="f" stroked="f">
+              <v:shape id="Cuadro de texto 32" o:spid="_x0000_s1026" type="#_x0000_t202" style="position:absolute;margin-left:415.95pt;margin-top:46.35pt;width:20pt;height:23pt;z-index:251692032;visibility:visible;mso-wrap-style:square;mso-width-percent:0;mso-height-percent:0;mso-wrap-distance-left:9pt;mso-wrap-distance-top:0;mso-wrap-distance-right:9pt;mso-wrap-distance-bottom:0;mso-position-horizontal:absolute;mso-position-horizontal-relative:text;mso-position-vertical:absolute;mso-position-vertical-relative:text;mso-width-percent:0;mso-height-percent:0;mso-width-relative:margin;mso-height-relative:margin;v-text-anchor:top" o:gfxdata="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" filled="f" stroked="f">
                 <v:textbox>
                   <w:txbxContent>
                     <w:p>
@@ -3703,7 +3473,7 @@
                                     </pic:cNvPicPr>
                                   </pic:nvPicPr>
                                   <pic:blipFill>
-                                    <a:blip r:embed="rId13">
+                                    <a:blip r:embed="rId12">
                                       <a:extLst>
                                         <a:ext uri="{28A0092B-C50C-407E-A947-70E740481C1C}">
                                           <a14:useLocalDpi xmlns:a14="http://schemas.microsoft.com/office/drawing/2010/main" val="0"/>
@@ -3850,7 +3620,7 @@
           </mc:Choice>
           <mc:Fallback>
             <w:pict>
-              <v:shape w14:anchorId="1D0DD485" id="Cuadro de texto 21" o:spid="_x0000_s1027" type="#_x0000_t202" style="position:absolute;margin-left:414.95pt;margin-top:59.85pt;width:32.5pt;height:23pt;z-index:251676672;visibility:visible;mso-wrap-style:square;mso-width-percent:0;mso-height-percent:0;mso-wrap-distance-left:9pt;mso-wrap-distance-top:0;mso-wrap-distance-right:9pt;mso-wrap-distance-bottom:0;mso-position-horizontal:absolute;mso-position-horizontal-relative:margin;mso-position-vertical:absolute;mso-position-vertical-relative:text;mso-width-percent:0;mso-height-percent:0;mso-width-relative:margin;mso-height-relative:margin;v-text-anchor:top" o:gfxdata="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" filled="f" stroked="f">
+              <v:shape w14:anchorId="1D0DD485" id="Cuadro de texto 21" o:spid="_x0000_s1027" type="#_x0000_t202" style="position:absolute;margin-left:414.95pt;margin-top:59.85pt;width:32.5pt;height:23pt;z-index:251676672;visibility:visible;mso-wrap-style:square;mso-width-percent:0;mso-height-percent:0;mso-wrap-distance-left:9pt;mso-wrap-distance-top:0;mso-wrap-distance-right:9pt;mso-wrap-distance-bottom:0;mso-position-horizontal:absolute;mso-position-horizontal-relative:margin;mso-position-vertical:absolute;mso-position-vertical-relative:text;mso-width-percent:0;mso-height-percent:0;mso-width-relative:margin;mso-height-relative:margin;v-text-anchor:top" o:gfxdata="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" filled="f" stroked="f">
                 <v:textbox>
                   <w:txbxContent>
                     <w:p>
@@ -3991,7 +3761,7 @@
           </mc:Choice>
           <mc:Fallback>
             <w:pict>
-              <v:shape w14:anchorId="1E551DD7" id="Cuadro de texto 34" o:spid="_x0000_s1028" type="#_x0000_t202" style="position:absolute;margin-left:415.95pt;margin-top:66.85pt;width:20pt;height:22.5pt;z-index:251694080;visibility:visible;mso-wrap-style:square;mso-width-percent:0;mso-height-percent:0;mso-wrap-distance-left:9pt;mso-wrap-distance-top:0;mso-wrap-distance-right:9pt;mso-wrap-distance-bottom:0;mso-position-horizontal:absolute;mso-position-horizontal-relative:text;mso-position-vertical:absolute;mso-position-vertical-relative:text;mso-width-percent:0;mso-height-percent:0;mso-width-relative:margin;mso-height-relative:margin;v-text-anchor:top" o:gfxdata="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" filled="f" stroked="f">
+              <v:shape w14:anchorId="1E551DD7" id="Cuadro de texto 34" o:spid="_x0000_s1028" type="#_x0000_t202" style="position:absolute;margin-left:415.95pt;margin-top:66.85pt;width:20pt;height:22.5pt;z-index:251694080;visibility:visible;mso-wrap-style:square;mso-width-percent:0;mso-height-percent:0;mso-wrap-distance-left:9pt;mso-wrap-distance-top:0;mso-wrap-distance-right:9pt;mso-wrap-distance-bottom:0;mso-position-horizontal:absolute;mso-position-horizontal-relative:text;mso-position-vertical:absolute;mso-position-vertical-relative:text;mso-width-percent:0;mso-height-percent:0;mso-width-relative:margin;mso-height-relative:margin;v-text-anchor:top" o:gfxdata="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" filled="f" stroked="f">
                 <v:textbox>
                   <w:txbxContent>
                     <w:p>
@@ -4131,7 +3901,7 @@
           </mc:Choice>
           <mc:Fallback>
             <w:pict>
-              <v:shape w14:anchorId="5D36413D" id="Cuadro de texto 27" o:spid="_x0000_s1029" type="#_x0000_t202" style="position:absolute;margin-left:418.95pt;margin-top:20.35pt;width:30pt;height:23pt;z-index:251685888;visibility:visible;mso-wrap-style:square;mso-width-percent:0;mso-height-percent:0;mso-wrap-distance-left:9pt;mso-wrap-distance-top:0;mso-wrap-distance-right:9pt;mso-wrap-distance-bottom:0;mso-position-horizontal:absolute;mso-position-horizontal-relative:text;mso-position-vertical:absolute;mso-position-vertical-relative:text;mso-width-percent:0;mso-height-percent:0;mso-width-relative:margin;mso-height-relative:margin;v-text-anchor:top" o:gfxdata="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" filled="f" stroked="f">
+              <v:shape w14:anchorId="5D36413D" id="Cuadro de texto 27" o:spid="_x0000_s1029" type="#_x0000_t202" style="position:absolute;margin-left:418.95pt;margin-top:20.35pt;width:30pt;height:23pt;z-index:251685888;visibility:visible;mso-wrap-style:square;mso-width-percent:0;mso-height-percent:0;mso-wrap-distance-left:9pt;mso-wrap-distance-top:0;mso-wrap-distance-right:9pt;mso-wrap-distance-bottom:0;mso-position-horizontal:absolute;mso-position-horizontal-relative:text;mso-position-vertical:absolute;mso-position-vertical-relative:text;mso-width-percent:0;mso-height-percent:0;mso-width-relative:margin;mso-height-relative:margin;v-text-anchor:top" o:gfxdata="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" filled="f" stroked="f">
                 <v:textbox>
                   <w:txbxContent>
                     <w:p>
@@ -4399,7 +4169,7 @@
           </mc:Choice>
           <mc:Fallback>
             <w:pict>
-              <v:shape w14:anchorId="3EB49ED6" id="Cuadro de texto 28" o:spid="_x0000_s1030" type="#_x0000_t202" style="position:absolute;margin-left:329.05pt;margin-top:45.85pt;width:20pt;height:23pt;z-index:251687936;visibility:visible;mso-wrap-style:square;mso-width-percent:0;mso-height-percent:0;mso-wrap-distance-left:9pt;mso-wrap-distance-top:0;mso-wrap-distance-right:9pt;mso-wrap-distance-bottom:0;mso-position-horizontal:absolute;mso-position-horizontal-relative:text;mso-position-vertical:absolute;mso-position-vertical-relative:text;mso-width-percent:0;mso-height-percent:0;mso-width-relative:margin;mso-height-relative:margin;v-text-anchor:top" o:gfxdata="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" filled="f" stroked="f">
+              <v:shape w14:anchorId="3EB49ED6" id="Cuadro de texto 28" o:spid="_x0000_s1030" type="#_x0000_t202" style="position:absolute;margin-left:329.05pt;margin-top:45.85pt;width:20pt;height:23pt;z-index:251687936;visibility:visible;mso-wrap-style:square;mso-width-percent:0;mso-height-percent:0;mso-wrap-distance-left:9pt;mso-wrap-distance-top:0;mso-wrap-distance-right:9pt;mso-wrap-distance-bottom:0;mso-position-horizontal:absolute;mso-position-horizontal-relative:text;mso-position-vertical:absolute;mso-position-vertical-relative:text;mso-width-percent:0;mso-height-percent:0;mso-width-relative:margin;mso-height-relative:margin;v-text-anchor:top" o:gfxdata="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" filled="f" stroked="f">
                 <v:textbox>
                   <w:txbxContent>
                     <w:p>
@@ -4450,7 +4220,7 @@
                                     </pic:cNvPicPr>
                                   </pic:nvPicPr>
                                   <pic:blipFill>
-                                    <a:blip r:embed="rId13">
+                                    <a:blip r:embed="rId12">
                                       <a:extLst>
                                         <a:ext uri="{28A0092B-C50C-407E-A947-70E740481C1C}">
                                           <a14:useLocalDpi xmlns:a14="http://schemas.microsoft.com/office/drawing/2010/main" val="0"/>
@@ -4597,7 +4367,7 @@
           </mc:Choice>
           <mc:Fallback>
             <w:pict>
-              <v:shape w14:anchorId="5948E1A2" id="Cuadro de texto 20" o:spid="_x0000_s1031" type="#_x0000_t202" style="position:absolute;margin-left:328.45pt;margin-top:58.35pt;width:30pt;height:23pt;z-index:251674624;visibility:visible;mso-wrap-style:square;mso-width-percent:0;mso-height-percent:0;mso-wrap-distance-left:9pt;mso-wrap-distance-top:0;mso-wrap-distance-right:9pt;mso-wrap-distance-bottom:0;mso-position-horizontal:absolute;mso-position-horizontal-relative:text;mso-position-vertical:absolute;mso-position-vertical-relative:text;mso-width-percent:0;mso-height-percent:0;mso-width-relative:margin;mso-height-relative:margin;v-text-anchor:top" o:gfxdata="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" filled="f" stroked="f">
+              <v:shape w14:anchorId="5948E1A2" id="Cuadro de texto 20" o:spid="_x0000_s1031" type="#_x0000_t202" style="position:absolute;margin-left:328.45pt;margin-top:58.35pt;width:30pt;height:23pt;z-index:251674624;visibility:visible;mso-wrap-style:square;mso-width-percent:0;mso-height-percent:0;mso-wrap-distance-left:9pt;mso-wrap-distance-top:0;mso-wrap-distance-right:9pt;mso-wrap-distance-bottom:0;mso-position-horizontal:absolute;mso-position-horizontal-relative:text;mso-position-vertical:absolute;mso-position-vertical-relative:text;mso-width-percent:0;mso-height-percent:0;mso-width-relative:margin;mso-height-relative:margin;v-text-anchor:top" o:gfxdata="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" filled="f" stroked="f">
                 <v:textbox>
                   <w:txbxContent>
                     <w:p>
@@ -4737,7 +4507,7 @@
           </mc:Choice>
           <mc:Fallback>
             <w:pict>
-              <v:shape w14:anchorId="106ACED9" id="Cuadro de texto 30" o:spid="_x0000_s1032" type="#_x0000_t202" style="position:absolute;margin-left:328.45pt;margin-top:67.35pt;width:20pt;height:22.5pt;z-index:251689984;visibility:visible;mso-wrap-style:square;mso-width-percent:0;mso-height-percent:0;mso-wrap-distance-left:9pt;mso-wrap-distance-top:0;mso-wrap-distance-right:9pt;mso-wrap-distance-bottom:0;mso-position-horizontal:absolute;mso-position-horizontal-relative:text;mso-position-vertical:absolute;mso-position-vertical-relative:text;mso-width-percent:0;mso-height-percent:0;mso-width-relative:margin;mso-height-relative:margin;v-text-anchor:top" o:gfxdata="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" filled="f" stroked="f">
+              <v:shape w14:anchorId="106ACED9" id="Cuadro de texto 30" o:spid="_x0000_s1032" type="#_x0000_t202" style="position:absolute;margin-left:328.45pt;margin-top:67.35pt;width:20pt;height:22.5pt;z-index:251689984;visibility:visible;mso-wrap-style:square;mso-width-percent:0;mso-height-percent:0;mso-wrap-distance-left:9pt;mso-wrap-distance-top:0;mso-wrap-distance-right:9pt;mso-wrap-distance-bottom:0;mso-position-horizontal:absolute;mso-position-horizontal-relative:text;mso-position-vertical:absolute;mso-position-vertical-relative:text;mso-width-percent:0;mso-height-percent:0;mso-width-relative:margin;mso-height-relative:margin;v-text-anchor:top" o:gfxdata="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" filled="f" stroked="f">
                 <v:textbox>
                   <w:txbxContent>
                     <w:p>
@@ -4877,7 +4647,7 @@
           </mc:Choice>
           <mc:Fallback>
             <w:pict>
-              <v:shape w14:anchorId="5A9369EF" id="Cuadro de texto 26" o:spid="_x0000_s1033" type="#_x0000_t202" style="position:absolute;margin-left:325.45pt;margin-top:24.85pt;width:30pt;height:23pt;z-index:251683840;visibility:visible;mso-wrap-style:square;mso-width-percent:0;mso-height-percent:0;mso-wrap-distance-left:9pt;mso-wrap-distance-top:0;mso-wrap-distance-right:9pt;mso-wrap-distance-bottom:0;mso-position-horizontal:absolute;mso-position-horizontal-relative:text;mso-position-vertical:absolute;mso-position-vertical-relative:text;mso-width-percent:0;mso-height-percent:0;mso-width-relative:margin;mso-height-relative:margin;v-text-anchor:top" o:gfxdata="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" filled="f" stroked="f">
+              <v:shape w14:anchorId="5A9369EF" id="Cuadro de texto 26" o:spid="_x0000_s1033" type="#_x0000_t202" style="position:absolute;margin-left:325.45pt;margin-top:24.85pt;width:30pt;height:23pt;z-index:251683840;visibility:visible;mso-wrap-style:square;mso-width-percent:0;mso-height-percent:0;mso-wrap-distance-left:9pt;mso-wrap-distance-top:0;mso-wrap-distance-right:9pt;mso-wrap-distance-bottom:0;mso-position-horizontal:absolute;mso-position-horizontal-relative:text;mso-position-vertical:absolute;mso-position-vertical-relative:text;mso-width-percent:0;mso-height-percent:0;mso-width-relative:margin;mso-height-relative:margin;v-text-anchor:top" o:gfxdata="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" filled="f" stroked="f">
                 <v:textbox>
                   <w:txbxContent>
                     <w:p>
@@ -5100,7 +4870,7 @@
           </mc:Choice>
           <mc:Fallback>
             <w:pict>
-              <v:shape w14:anchorId="750AE716" id="Cuadro de texto 25" o:spid="_x0000_s1034" type="#_x0000_t202" style="position:absolute;margin-left:291.45pt;margin-top:.35pt;width:30pt;height:23pt;z-index:251681792;visibility:visible;mso-wrap-style:square;mso-width-percent:0;mso-height-percent:0;mso-wrap-distance-left:9pt;mso-wrap-distance-top:0;mso-wrap-distance-right:9pt;mso-wrap-distance-bottom:0;mso-position-horizontal:absolute;mso-position-horizontal-relative:text;mso-position-vertical:absolute;mso-position-vertical-relative:text;mso-width-percent:0;mso-height-percent:0;mso-width-relative:margin;mso-height-relative:margin;v-text-anchor:top" o:gfxdata="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" filled="f" stroked="f">
+              <v:shape w14:anchorId="750AE716" id="Cuadro de texto 25" o:spid="_x0000_s1034" type="#_x0000_t202" style="position:absolute;margin-left:291.45pt;margin-top:.35pt;width:30pt;height:23pt;z-index:251681792;visibility:visible;mso-wrap-style:square;mso-width-percent:0;mso-height-percent:0;mso-wrap-distance-left:9pt;mso-wrap-distance-top:0;mso-wrap-distance-right:9pt;mso-wrap-distance-bottom:0;mso-position-horizontal:absolute;mso-position-horizontal-relative:text;mso-position-vertical:absolute;mso-position-vertical-relative:text;mso-width-percent:0;mso-height-percent:0;mso-width-relative:margin;mso-height-relative:margin;v-text-anchor:top" o:gfxdata="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" filled="f" stroked="f">
                 <v:textbox>
                   <w:txbxContent>
                     <w:p>
@@ -5317,7 +5087,7 @@
           </mc:Choice>
           <mc:Fallback>
             <w:pict>
-              <v:shape w14:anchorId="7C530AE5" id="Cuadro de texto 19" o:spid="_x0000_s1035" type="#_x0000_t202" style="position:absolute;margin-left:235.45pt;margin-top:.35pt;width:41pt;height:23pt;z-index:251672576;visibility:visible;mso-wrap-style:square;mso-width-percent:0;mso-height-percent:0;mso-wrap-distance-left:9pt;mso-wrap-distance-top:0;mso-wrap-distance-right:9pt;mso-wrap-distance-bottom:0;mso-position-horizontal:absolute;mso-position-horizontal-relative:text;mso-position-vertical:absolute;mso-position-vertical-relative:text;mso-width-percent:0;mso-height-percent:0;mso-width-relative:margin;mso-height-relative:margin;v-text-anchor:top" o:gfxdata="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" filled="f" stroked="f">
+              <v:shape w14:anchorId="7C530AE5" id="Cuadro de texto 19" o:spid="_x0000_s1035" type="#_x0000_t202" style="position:absolute;margin-left:235.45pt;margin-top:.35pt;width:41pt;height:23pt;z-index:251672576;visibility:visible;mso-wrap-style:square;mso-width-percent:0;mso-height-percent:0;mso-wrap-distance-left:9pt;mso-wrap-distance-top:0;mso-wrap-distance-right:9pt;mso-wrap-distance-bottom:0;mso-position-horizontal:absolute;mso-position-horizontal-relative:text;mso-position-vertical:absolute;mso-position-vertical-relative:text;mso-width-percent:0;mso-height-percent:0;mso-width-relative:margin;mso-height-relative:margin;v-text-anchor:top" o:gfxdata="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" filled="f" stroked="f">
                 <v:textbox>
                   <w:txbxContent>
                     <w:p>
@@ -5464,7 +5234,7 @@
           </mc:Choice>
           <mc:Fallback>
             <w:pict>
-              <v:shape w14:anchorId="1D76BBB8" id="Cuadro de texto 17" o:spid="_x0000_s1036" type="#_x0000_t202" style="position:absolute;margin-left:125.55pt;margin-top:.35pt;width:1in;height:19pt;z-index:251670528;visibility:visible;mso-wrap-style:none;mso-height-percent:0;mso-wrap-distance-left:9pt;mso-wrap-distance-top:0;mso-wrap-distance-right:9pt;mso-wrap-distance-bottom:0;mso-position-horizontal:absolute;mso-position-horizontal-relative:text;mso-position-vertical:absolute;mso-position-vertical-relative:text;mso-height-percent:0;mso-height-relative:margin;v-text-anchor:top" o:gfxdata="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" filled="f" stroked="f">
+              <v:shape w14:anchorId="1D76BBB8" id="Cuadro de texto 17" o:spid="_x0000_s1036" type="#_x0000_t202" style="position:absolute;margin-left:125.55pt;margin-top:.35pt;width:1in;height:19pt;z-index:251670528;visibility:visible;mso-wrap-style:none;mso-height-percent:0;mso-wrap-distance-left:9pt;mso-wrap-distance-top:0;mso-wrap-distance-right:9pt;mso-wrap-distance-bottom:0;mso-position-horizontal:absolute;mso-position-horizontal-relative:text;mso-position-vertical:absolute;mso-position-vertical-relative:text;mso-height-percent:0;mso-height-relative:margin;v-text-anchor:top" o:gfxdata="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" filled="f" stroked="f">
                 <v:textbox>
                   <w:txbxContent>
                     <w:p>
@@ -5691,7 +5461,7 @@
           </mc:Choice>
           <mc:Fallback>
             <w:pict>
-              <v:shape w14:anchorId="53500EFD" id="Cuadro de texto 15" o:spid="_x0000_s1037" type="#_x0000_t202" style="position:absolute;margin-left:80.45pt;margin-top:.35pt;width:34pt;height:23pt;z-index:251668480;visibility:visible;mso-wrap-style:square;mso-width-percent:0;mso-height-percent:0;mso-wrap-distance-left:9pt;mso-wrap-distance-top:0;mso-wrap-distance-right:9pt;mso-wrap-distance-bottom:0;mso-position-horizontal:absolute;mso-position-horizontal-relative:text;mso-position-vertical:absolute;mso-position-vertical-relative:text;mso-width-percent:0;mso-height-percent:0;mso-width-relative:margin;mso-height-relative:margin;v-text-anchor:top" o:gfxdata="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" filled="f" stroked="f">
+              <v:shape w14:anchorId="53500EFD" id="Cuadro de texto 15" o:spid="_x0000_s1037" type="#_x0000_t202" style="position:absolute;margin-left:80.45pt;margin-top:.35pt;width:34pt;height:23pt;z-index:251668480;visibility:visible;mso-wrap-style:square;mso-width-percent:0;mso-height-percent:0;mso-wrap-distance-left:9pt;mso-wrap-distance-top:0;mso-wrap-distance-right:9pt;mso-wrap-distance-bottom:0;mso-position-horizontal:absolute;mso-position-horizontal-relative:text;mso-position-vertical:absolute;mso-position-vertical-relative:text;mso-width-percent:0;mso-height-percent:0;mso-width-relative:margin;mso-height-relative:margin;v-text-anchor:top" o:gfxdata="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" filled="f" stroked="f">
                 <v:textbox>
                   <w:txbxContent>
                     <w:p>
@@ -5765,7 +5535,7 @@
                     <pic:cNvPicPr/>
                   </pic:nvPicPr>
                   <pic:blipFill>
-                    <a:blip r:embed="rId14"/>
+                    <a:blip r:embed="rId13"/>
                     <a:stretch>
                       <a:fillRect/>
                     </a:stretch>
@@ -5820,8 +5590,9 @@
       <w:r>
         <w:rPr>
           <w:rStyle w:val="Refdecomentario"/>
-          <w:sz w:val="22"/>
-          <w:szCs w:val="22"/>
+          <w:rFonts w:cstheme="minorHAnsi"/>
+          <w:sz w:val="24"/>
+          <w:szCs w:val="24"/>
         </w:rPr>
         <w:commentReference w:id="15"/>
       </w:r>
@@ -5829,8 +5600,9 @@
       <w:r>
         <w:rPr>
           <w:rStyle w:val="Refdecomentario"/>
-          <w:sz w:val="22"/>
-          <w:szCs w:val="22"/>
+          <w:rFonts w:cstheme="minorHAnsi"/>
+          <w:sz w:val="24"/>
+          <w:szCs w:val="24"/>
         </w:rPr>
         <w:commentReference w:id="16"/>
       </w:r>
@@ -5938,7 +5710,16 @@
           <w:sz w:val="24"/>
           <w:szCs w:val="24"/>
         </w:rPr>
-        <w:t>muestra la topología de un convertidor Boost síncrono, en la cual el diodo presente en la configuración convencional es sustituido por un segundo interruptor activo, implementado mediante un MOSFET de canal N. Esta modificación permite reducir las pérdidas por conducción asociadas al diodo, mejorando así la eficiencia del convertidor.</w:t>
+        <w:t xml:space="preserve">muestra la topología de un convertidor Boost síncrono, en la cual el diodo presente en la configuración convencional es sustituido por un segundo interruptor activo, implementado mediante un MOSFET de canal N. Esta modificación </w:t>
+      </w:r>
+      <w:r>
+        <w:rPr>
+          <w:rFonts w:cstheme="minorHAnsi"/>
+          <w:sz w:val="24"/>
+          <w:szCs w:val="24"/>
+        </w:rPr>
+        <w:lastRenderedPageBreak/>
+        <w:t>permite reducir las pérdidas por conducción asociadas al diodo, mejorando así la eficiencia del convertidor.</w:t>
       </w:r>
     </w:p>
     <w:p>
@@ -6147,7 +5928,6 @@
         <w:rPr>
           <w:noProof/>
         </w:rPr>
-        <w:lastRenderedPageBreak/>
         <mc:AlternateContent>
           <mc:Choice Requires="wps">
             <w:drawing>
@@ -6307,7 +6087,7 @@
           </mc:Choice>
           <mc:Fallback>
             <w:pict>
-              <v:shape w14:anchorId="52C0C28C" id="Cuadro de texto 103800708" o:spid="_x0000_s1038" type="#_x0000_t202" style="position:absolute;margin-left:236.45pt;margin-top:43.5pt;width:21pt;height:22.5pt;rotation:180;flip:x y;z-index:251727872;visibility:visible;mso-wrap-style:square;mso-width-percent:0;mso-height-percent:0;mso-wrap-distance-left:9pt;mso-wrap-distance-top:0;mso-wrap-distance-right:9pt;mso-wrap-distance-bottom:0;mso-position-horizontal:absolute;mso-position-horizontal-relative:text;mso-position-vertical:absolute;mso-position-vertical-relative:text;mso-width-percent:0;mso-height-percent:0;mso-width-relative:margin;mso-height-relative:margin;v-text-anchor:top" o:gfxdata="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" filled="f" stroked="f">
+              <v:shape w14:anchorId="52C0C28C" id="Cuadro de texto 103800708" o:spid="_x0000_s1038" type="#_x0000_t202" style="position:absolute;margin-left:236.45pt;margin-top:43.5pt;width:21pt;height:22.5pt;rotation:180;flip:x y;z-index:251727872;visibility:visible;mso-wrap-style:square;mso-width-percent:0;mso-height-percent:0;mso-wrap-distance-left:9pt;mso-wrap-distance-top:0;mso-wrap-distance-right:9pt;mso-wrap-distance-bottom:0;mso-position-horizontal:absolute;mso-position-horizontal-relative:text;mso-position-vertical:absolute;mso-position-vertical-relative:text;mso-width-percent:0;mso-height-percent:0;mso-width-relative:margin;mso-height-relative:margin;v-text-anchor:top" o:gfxdata="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" filled="f" stroked="f">
                 <v:textbox>
                   <w:txbxContent>
                     <w:p>
@@ -6434,7 +6214,7 @@
           </mc:Choice>
           <mc:Fallback>
             <w:pict>
-              <v:shape w14:anchorId="27284096" id="Cuadro de texto 103800707" o:spid="_x0000_s1039" type="#_x0000_t202" style="position:absolute;margin-left:170.45pt;margin-top:100pt;width:26pt;height:26pt;rotation:180;flip:x y;z-index:251725824;visibility:visible;mso-wrap-style:square;mso-width-percent:0;mso-height-percent:0;mso-wrap-distance-left:9pt;mso-wrap-distance-top:0;mso-wrap-distance-right:9pt;mso-wrap-distance-bottom:0;mso-position-horizontal:absolute;mso-position-horizontal-relative:text;mso-position-vertical:absolute;mso-position-vertical-relative:text;mso-width-percent:0;mso-height-percent:0;mso-width-relative:margin;mso-height-relative:margin;v-text-anchor:top" o:gfxdata="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" filled="f" stroked="f">
+              <v:shape w14:anchorId="27284096" id="Cuadro de texto 103800707" o:spid="_x0000_s1039" type="#_x0000_t202" style="position:absolute;margin-left:170.45pt;margin-top:100pt;width:26pt;height:26pt;rotation:180;flip:x y;z-index:251725824;visibility:visible;mso-wrap-style:square;mso-width-percent:0;mso-height-percent:0;mso-wrap-distance-left:9pt;mso-wrap-distance-top:0;mso-wrap-distance-right:9pt;mso-wrap-distance-bottom:0;mso-position-horizontal:absolute;mso-position-horizontal-relative:text;mso-position-vertical:absolute;mso-position-vertical-relative:text;mso-width-percent:0;mso-height-percent:0;mso-width-relative:margin;mso-height-relative:margin;v-text-anchor:top" o:gfxdata="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" filled="f" stroked="f">
                 <v:textbox>
                   <w:txbxContent>
                     <w:p>
@@ -6558,7 +6338,7 @@
           </mc:Choice>
           <mc:Fallback>
             <w:pict>
-              <v:shape w14:anchorId="38375E89" id="Cuadro de texto 103800706" o:spid="_x0000_s1040" type="#_x0000_t202" style="position:absolute;margin-left:417.45pt;margin-top:106.5pt;width:1in;height:20pt;z-index:251723776;visibility:visible;mso-wrap-style:none;mso-height-percent:0;mso-wrap-distance-left:9pt;mso-wrap-distance-top:0;mso-wrap-distance-right:9pt;mso-wrap-distance-bottom:0;mso-position-horizontal:absolute;mso-position-horizontal-relative:text;mso-position-vertical:absolute;mso-position-vertical-relative:text;mso-height-percent:0;mso-height-relative:margin;v-text-anchor:top" o:gfxdata="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" filled="f" stroked="f">
+              <v:shape w14:anchorId="38375E89" id="Cuadro de texto 103800706" o:spid="_x0000_s1040" type="#_x0000_t202" style="position:absolute;margin-left:417.45pt;margin-top:106.5pt;width:1in;height:20pt;z-index:251723776;visibility:visible;mso-wrap-style:none;mso-height-percent:0;mso-wrap-distance-left:9pt;mso-wrap-distance-top:0;mso-wrap-distance-right:9pt;mso-wrap-distance-bottom:0;mso-position-horizontal:absolute;mso-position-horizontal-relative:text;mso-position-vertical:absolute;mso-position-vertical-relative:text;mso-height-percent:0;mso-height-relative:margin;v-text-anchor:top" o:gfxdata="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" filled="f" stroked="f">
                 <v:textbox>
                   <w:txbxContent>
                     <w:p>
@@ -6682,7 +6462,7 @@
           </mc:Choice>
           <mc:Fallback>
             <w:pict>
-              <v:shape w14:anchorId="2A5ED70C" id="Cuadro de texto 103800704" o:spid="_x0000_s1041" type="#_x0000_t202" style="position:absolute;margin-left:339.45pt;margin-top:106pt;width:1in;height:20pt;z-index:251721728;visibility:visible;mso-wrap-style:none;mso-height-percent:0;mso-wrap-distance-left:9pt;mso-wrap-distance-top:0;mso-wrap-distance-right:9pt;mso-wrap-distance-bottom:0;mso-position-horizontal:absolute;mso-position-horizontal-relative:text;mso-position-vertical:absolute;mso-position-vertical-relative:text;mso-height-percent:0;mso-height-relative:margin;v-text-anchor:top" o:gfxdata="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" filled="f" stroked="f">
+              <v:shape w14:anchorId="2A5ED70C" id="Cuadro de texto 103800704" o:spid="_x0000_s1041" type="#_x0000_t202" style="position:absolute;margin-left:339.45pt;margin-top:106pt;width:1in;height:20pt;z-index:251721728;visibility:visible;mso-wrap-style:none;mso-height-percent:0;mso-wrap-distance-left:9pt;mso-wrap-distance-top:0;mso-wrap-distance-right:9pt;mso-wrap-distance-bottom:0;mso-position-horizontal:absolute;mso-position-horizontal-relative:text;mso-position-vertical:absolute;mso-position-vertical-relative:text;mso-height-percent:0;mso-height-relative:margin;v-text-anchor:top" o:gfxdata="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" filled="f" stroked="f">
                 <v:textbox>
                   <w:txbxContent>
                     <w:p>
@@ -6809,7 +6589,7 @@
           </mc:Choice>
           <mc:Fallback>
             <w:pict>
-              <v:shape w14:anchorId="3EE9C056" id="Cuadro de texto 62" o:spid="_x0000_s1042" type="#_x0000_t202" style="position:absolute;margin-left:415.45pt;margin-top:87pt;width:24.5pt;height:19pt;z-index:251719680;visibility:visible;mso-wrap-style:square;mso-width-percent:0;mso-height-percent:0;mso-wrap-distance-left:9pt;mso-wrap-distance-top:0;mso-wrap-distance-right:9pt;mso-wrap-distance-bottom:0;mso-position-horizontal:absolute;mso-position-horizontal-relative:margin;mso-position-vertical:absolute;mso-position-vertical-relative:text;mso-width-percent:0;mso-height-percent:0;mso-width-relative:margin;mso-height-relative:margin;v-text-anchor:top" o:gfxdata="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" filled="f" stroked="f">
+              <v:shape w14:anchorId="3EE9C056" id="Cuadro de texto 62" o:spid="_x0000_s1042" type="#_x0000_t202" style="position:absolute;margin-left:415.45pt;margin-top:87pt;width:24.5pt;height:19pt;z-index:251719680;visibility:visible;mso-wrap-style:square;mso-width-percent:0;mso-height-percent:0;mso-wrap-distance-left:9pt;mso-wrap-distance-top:0;mso-wrap-distance-right:9pt;mso-wrap-distance-bottom:0;mso-position-horizontal:absolute;mso-position-horizontal-relative:margin;mso-position-vertical:absolute;mso-position-vertical-relative:text;mso-width-percent:0;mso-height-percent:0;mso-width-relative:margin;mso-height-relative:margin;v-text-anchor:top" o:gfxdata="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" filled="f" stroked="f">
                 <v:textbox>
                   <w:txbxContent>
                     <w:p>
@@ -6982,7 +6762,7 @@
           </mc:Choice>
           <mc:Fallback>
             <w:pict>
-              <v:shape w14:anchorId="4DA234FE" id="Cuadro de texto 61" o:spid="_x0000_s1043" type="#_x0000_t202" style="position:absolute;margin-left:300.95pt;margin-top:42.5pt;width:1in;height:20pt;z-index:251717632;visibility:visible;mso-wrap-style:none;mso-height-percent:0;mso-wrap-distance-left:9pt;mso-wrap-distance-top:0;mso-wrap-distance-right:9pt;mso-wrap-distance-bottom:0;mso-position-horizontal:absolute;mso-position-horizontal-relative:text;mso-position-vertical:absolute;mso-position-vertical-relative:text;mso-height-percent:0;mso-height-relative:margin;v-text-anchor:top" o:gfxdata="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" filled="f" stroked="f">
+              <v:shape w14:anchorId="4DA234FE" id="Cuadro de texto 61" o:spid="_x0000_s1043" type="#_x0000_t202" style="position:absolute;margin-left:300.95pt;margin-top:42.5pt;width:1in;height:20pt;z-index:251717632;visibility:visible;mso-wrap-style:none;mso-height-percent:0;mso-wrap-distance-left:9pt;mso-wrap-distance-top:0;mso-wrap-distance-right:9pt;mso-wrap-distance-bottom:0;mso-position-horizontal:absolute;mso-position-horizontal-relative:text;mso-position-vertical:absolute;mso-position-vertical-relative:text;mso-height-percent:0;mso-height-relative:margin;v-text-anchor:top" o:gfxdata="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" filled="f" stroked="f">
                 <v:textbox>
                   <w:txbxContent>
                     <w:p>
@@ -7154,7 +6934,7 @@
           </mc:Choice>
           <mc:Fallback>
             <w:pict>
-              <v:shape w14:anchorId="5AAEA6F7" id="Cuadro de texto 52" o:spid="_x0000_s1044" type="#_x0000_t202" style="position:absolute;margin-left:339.95pt;margin-top:86.5pt;width:1in;height:20pt;z-index:251701248;visibility:visible;mso-wrap-style:none;mso-height-percent:0;mso-wrap-distance-left:9pt;mso-wrap-distance-top:0;mso-wrap-distance-right:9pt;mso-wrap-distance-bottom:0;mso-position-horizontal:absolute;mso-position-horizontal-relative:text;mso-position-vertical:absolute;mso-position-vertical-relative:text;mso-height-percent:0;mso-height-relative:margin;v-text-anchor:top" o:gfxdata="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" filled="f" stroked="f">
+              <v:shape w14:anchorId="5AAEA6F7" id="Cuadro de texto 52" o:spid="_x0000_s1044" type="#_x0000_t202" style="position:absolute;margin-left:339.95pt;margin-top:86.5pt;width:1in;height:20pt;z-index:251701248;visibility:visible;mso-wrap-style:none;mso-height-percent:0;mso-wrap-distance-left:9pt;mso-wrap-distance-top:0;mso-wrap-distance-right:9pt;mso-wrap-distance-bottom:0;mso-position-horizontal:absolute;mso-position-horizontal-relative:text;mso-position-vertical:absolute;mso-position-vertical-relative:text;mso-height-percent:0;mso-height-relative:margin;v-text-anchor:top" o:gfxdata="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" filled="f" stroked="f">
                 <v:textbox>
                   <w:txbxContent>
                     <w:p>
@@ -7326,7 +7106,7 @@
           </mc:Choice>
           <mc:Fallback>
             <w:pict>
-              <v:shape w14:anchorId="11C27882" id="Cuadro de texto 60" o:spid="_x0000_s1045" type="#_x0000_t202" style="position:absolute;margin-left:20.8pt;margin-top:66.5pt;width:1in;height:20pt;z-index:251715584;visibility:visible;mso-wrap-style:none;mso-height-percent:0;mso-wrap-distance-left:9pt;mso-wrap-distance-top:0;mso-wrap-distance-right:9pt;mso-wrap-distance-bottom:0;mso-position-horizontal:right;mso-position-horizontal-relative:margin;mso-position-vertical:absolute;mso-position-vertical-relative:text;mso-height-percent:0;mso-height-relative:margin;v-text-anchor:top" o:gfxdata="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" filled="f" stroked="f">
+              <v:shape w14:anchorId="11C27882" id="Cuadro de texto 60" o:spid="_x0000_s1045" type="#_x0000_t202" style="position:absolute;margin-left:20.8pt;margin-top:66.5pt;width:1in;height:20pt;z-index:251715584;visibility:visible;mso-wrap-style:none;mso-height-percent:0;mso-wrap-distance-left:9pt;mso-wrap-distance-top:0;mso-wrap-distance-right:9pt;mso-wrap-distance-bottom:0;mso-position-horizontal:right;mso-position-horizontal-relative:margin;mso-position-vertical:absolute;mso-position-vertical-relative:text;mso-height-percent:0;mso-height-relative:margin;v-text-anchor:top" o:gfxdata="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" filled="f" stroked="f">
                 <v:textbox>
                   <w:txbxContent>
                     <w:p>
@@ -7547,7 +7327,7 @@
           </mc:Choice>
           <mc:Fallback>
             <w:pict>
-              <v:shape w14:anchorId="228D596F" id="Cuadro de texto 59" o:spid="_x0000_s1046" type="#_x0000_t202" style="position:absolute;margin-left:330.95pt;margin-top:70.5pt;width:1in;height:20pt;z-index:251713536;visibility:visible;mso-wrap-style:none;mso-height-percent:0;mso-wrap-distance-left:9pt;mso-wrap-distance-top:0;mso-wrap-distance-right:9pt;mso-wrap-distance-bottom:0;mso-position-horizontal:absolute;mso-position-horizontal-relative:text;mso-position-vertical:absolute;mso-position-vertical-relative:text;mso-height-percent:0;mso-height-relative:margin;v-text-anchor:top" o:gfxdata="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" filled="f" stroked="f">
+              <v:shape w14:anchorId="228D596F" id="Cuadro de texto 59" o:spid="_x0000_s1046" type="#_x0000_t202" style="position:absolute;margin-left:330.95pt;margin-top:70.5pt;width:1in;height:20pt;z-index:251713536;visibility:visible;mso-wrap-style:none;mso-height-percent:0;mso-wrap-distance-left:9pt;mso-wrap-distance-top:0;mso-wrap-distance-right:9pt;mso-wrap-distance-bottom:0;mso-position-horizontal:absolute;mso-position-horizontal-relative:text;mso-position-vertical:absolute;mso-position-vertical-relative:text;mso-height-percent:0;mso-height-relative:margin;v-text-anchor:top" o:gfxdata="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" filled="f" stroked="f">
                 <v:textbox>
                   <w:txbxContent>
                     <w:p>
@@ -7767,7 +7547,7 @@
           </mc:Choice>
           <mc:Fallback>
             <w:pict>
-              <v:shape w14:anchorId="1E5B33D6" id="Cuadro de texto 58" o:spid="_x0000_s1047" type="#_x0000_t202" style="position:absolute;margin-left:156.95pt;margin-top:40pt;width:1in;height:20pt;z-index:251711488;visibility:visible;mso-wrap-style:none;mso-height-percent:0;mso-wrap-distance-left:9pt;mso-wrap-distance-top:0;mso-wrap-distance-right:9pt;mso-wrap-distance-bottom:0;mso-position-horizontal:absolute;mso-position-horizontal-relative:text;mso-position-vertical:absolute;mso-position-vertical-relative:text;mso-height-percent:0;mso-height-relative:margin;v-text-anchor:top" o:gfxdata="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" filled="f" stroked="f">
+              <v:shape w14:anchorId="1E5B33D6" id="Cuadro de texto 58" o:spid="_x0000_s1047" type="#_x0000_t202" style="position:absolute;margin-left:156.95pt;margin-top:40pt;width:1in;height:20pt;z-index:251711488;visibility:visible;mso-wrap-style:none;mso-height-percent:0;mso-wrap-distance-left:9pt;mso-wrap-distance-top:0;mso-wrap-distance-right:9pt;mso-wrap-distance-bottom:0;mso-position-horizontal:absolute;mso-position-horizontal-relative:text;mso-position-vertical:absolute;mso-position-vertical-relative:text;mso-height-percent:0;mso-height-relative:margin;v-text-anchor:top" o:gfxdata="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" filled="f" stroked="f">
                 <v:textbox>
                   <w:txbxContent>
                     <w:p>
@@ -7950,7 +7730,7 @@
           </mc:Choice>
           <mc:Fallback>
             <w:pict>
-              <v:shape w14:anchorId="1B2BCB5D" id="Cuadro de texto 57" o:spid="_x0000_s1048" type="#_x0000_t202" style="position:absolute;margin-left:20.8pt;margin-top:95.5pt;width:1in;height:20pt;z-index:251709440;visibility:visible;mso-wrap-style:none;mso-height-percent:0;mso-wrap-distance-left:9pt;mso-wrap-distance-top:0;mso-wrap-distance-right:9pt;mso-wrap-distance-bottom:0;mso-position-horizontal:right;mso-position-horizontal-relative:margin;mso-position-vertical:absolute;mso-position-vertical-relative:text;mso-height-percent:0;mso-height-relative:margin;v-text-anchor:top" o:gfxdata="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" filled="f" stroked="f">
+              <v:shape w14:anchorId="1B2BCB5D" id="Cuadro de texto 57" o:spid="_x0000_s1048" type="#_x0000_t202" style="position:absolute;margin-left:20.8pt;margin-top:95.5pt;width:1in;height:20pt;z-index:251709440;visibility:visible;mso-wrap-style:none;mso-height-percent:0;mso-wrap-distance-left:9pt;mso-wrap-distance-top:0;mso-wrap-distance-right:9pt;mso-wrap-distance-bottom:0;mso-position-horizontal:right;mso-position-horizontal-relative:margin;mso-position-vertical:absolute;mso-position-vertical-relative:text;mso-height-percent:0;mso-height-relative:margin;v-text-anchor:top" o:gfxdata="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" filled="f" stroked="f">
                 <v:textbox>
                   <w:txbxContent>
                     <w:p>
@@ -8097,7 +7877,7 @@
           </mc:Choice>
           <mc:Fallback>
             <w:pict>
-              <v:shape w14:anchorId="1D804DD3" id="Cuadro de texto 54" o:spid="_x0000_s1049" type="#_x0000_t202" style="position:absolute;margin-left:337.45pt;margin-top:95.5pt;width:1in;height:20pt;z-index:251703296;visibility:visible;mso-wrap-style:none;mso-height-percent:0;mso-wrap-distance-left:9pt;mso-wrap-distance-top:0;mso-wrap-distance-right:9pt;mso-wrap-distance-bottom:0;mso-position-horizontal:absolute;mso-position-horizontal-relative:text;mso-position-vertical:absolute;mso-position-vertical-relative:text;mso-height-percent:0;mso-height-relative:margin;v-text-anchor:top" o:gfxdata="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" filled="f" stroked="f">
+              <v:shape w14:anchorId="1D804DD3" id="Cuadro de texto 54" o:spid="_x0000_s1049" type="#_x0000_t202" style="position:absolute;margin-left:337.45pt;margin-top:95.5pt;width:1in;height:20pt;z-index:251703296;visibility:visible;mso-wrap-style:none;mso-height-percent:0;mso-wrap-distance-left:9pt;mso-wrap-distance-top:0;mso-wrap-distance-right:9pt;mso-wrap-distance-bottom:0;mso-position-horizontal:absolute;mso-position-horizontal-relative:text;mso-position-vertical:absolute;mso-position-vertical-relative:text;mso-height-percent:0;mso-height-relative:margin;v-text-anchor:top" o:gfxdata="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" filled="f" stroked="f">
                 <v:textbox>
                   <w:txbxContent>
                     <w:p>
@@ -8243,7 +8023,7 @@
           </mc:Choice>
           <mc:Fallback>
             <w:pict>
-              <v:shape w14:anchorId="54888D91" id="Cuadro de texto 51" o:spid="_x0000_s1050" type="#_x0000_t202" style="position:absolute;margin-left:111.95pt;margin-top:41pt;width:1in;height:20pt;z-index:251699200;visibility:visible;mso-wrap-style:none;mso-height-percent:0;mso-wrap-distance-left:9pt;mso-wrap-distance-top:0;mso-wrap-distance-right:9pt;mso-wrap-distance-bottom:0;mso-position-horizontal:absolute;mso-position-horizontal-relative:text;mso-position-vertical:absolute;mso-position-vertical-relative:text;mso-height-percent:0;mso-height-relative:margin;v-text-anchor:top" o:gfxdata="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" filled="f" stroked="f">
+              <v:shape w14:anchorId="54888D91" id="Cuadro de texto 51" o:spid="_x0000_s1050" type="#_x0000_t202" style="position:absolute;margin-left:111.95pt;margin-top:41pt;width:1in;height:20pt;z-index:251699200;visibility:visible;mso-wrap-style:none;mso-height-percent:0;mso-wrap-distance-left:9pt;mso-wrap-distance-top:0;mso-wrap-distance-right:9pt;mso-wrap-distance-bottom:0;mso-position-horizontal:absolute;mso-position-horizontal-relative:text;mso-position-vertical:absolute;mso-position-vertical-relative:text;mso-height-percent:0;mso-height-relative:margin;v-text-anchor:top" o:gfxdata="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" filled="f" stroked="f">
                 <v:textbox>
                   <w:txbxContent>
                     <w:p>
@@ -8569,7 +8349,7 @@
                     <pic:cNvPicPr/>
                   </pic:nvPicPr>
                   <pic:blipFill>
-                    <a:blip r:embed="rId15"/>
+                    <a:blip r:embed="rId14"/>
                     <a:stretch>
                       <a:fillRect/>
                     </a:stretch>
@@ -8611,15 +8391,7 @@
         <w:t xml:space="preserve">: </w:t>
       </w:r>
       <w:r>
-        <w:t xml:space="preserve">convertidor </w:t>
-      </w:r>
-      <w:proofErr w:type="spellStart"/>
-      <w:r>
-        <w:t>Boost</w:t>
-      </w:r>
-      <w:proofErr w:type="spellEnd"/>
-      <w:r>
-        <w:t xml:space="preserve"> Síncrono.</w:t>
+        <w:t>convertidor Boost Síncrono.</w:t>
       </w:r>
       <w:r>
         <w:rPr>
@@ -8692,7 +8464,7 @@
           </mc:Choice>
           <mc:Fallback>
             <w:pict>
-              <v:shape w14:anchorId="2D10F6C0" id="Cuadro de texto 12" o:spid="_x0000_s1051" type="#_x0000_t202" style="position:absolute;margin-left:153.3pt;margin-top:84.75pt;width:1in;height:21.9pt;z-index:251662336;visibility:visible;mso-wrap-style:none;mso-height-percent:0;mso-wrap-distance-left:9pt;mso-wrap-distance-top:0;mso-wrap-distance-right:9pt;mso-wrap-distance-bottom:0;mso-position-horizontal:absolute;mso-position-horizontal-relative:text;mso-position-vertical:absolute;mso-position-vertical-relative:text;mso-height-percent:0;mso-height-relative:margin;v-text-anchor:top" o:gfxdata="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" filled="f" stroked="f" strokeweight=".5pt">
+              <v:shape w14:anchorId="2D10F6C0" id="Cuadro de texto 12" o:spid="_x0000_s1051" type="#_x0000_t202" style="position:absolute;margin-left:153.3pt;margin-top:84.75pt;width:1in;height:21.9pt;z-index:251662336;visibility:visible;mso-wrap-style:none;mso-height-percent:0;mso-wrap-distance-left:9pt;mso-wrap-distance-top:0;mso-wrap-distance-right:9pt;mso-wrap-distance-bottom:0;mso-position-horizontal:absolute;mso-position-horizontal-relative:text;mso-position-vertical:absolute;mso-position-vertical-relative:text;mso-height-percent:0;mso-height-relative:margin;v-text-anchor:top" o:gfxdata="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" filled="f" stroked="f" strokeweight=".5pt">
                 <v:textbox>
                   <w:txbxContent>
                     <w:p>
@@ -8720,8 +8492,8 @@
       <w:r>
         <w:rPr>
           <w:rStyle w:val="Refdecomentario"/>
-          <w:sz w:val="22"/>
-          <w:szCs w:val="22"/>
+          <w:sz w:val="18"/>
+          <w:szCs w:val="18"/>
         </w:rPr>
         <w:commentReference w:id="19"/>
       </w:r>
@@ -8828,25 +8600,7 @@
           <w:sz w:val="24"/>
           <w:szCs w:val="24"/>
         </w:rPr>
-        <w:t xml:space="preserve"> sobre las topologías </w:t>
-      </w:r>
-      <w:proofErr w:type="spellStart"/>
-      <w:r>
-        <w:rPr>
-          <w:rFonts w:cstheme="minorHAnsi"/>
-          <w:sz w:val="24"/>
-          <w:szCs w:val="24"/>
-        </w:rPr>
-        <w:t>circuitales</w:t>
-      </w:r>
-      <w:proofErr w:type="spellEnd"/>
-      <w:r>
-        <w:rPr>
-          <w:rFonts w:cstheme="minorHAnsi"/>
-          <w:sz w:val="24"/>
-          <w:szCs w:val="24"/>
-        </w:rPr>
-        <w:t xml:space="preserve"> derivadas de la acción de los interruptores. </w:t>
+        <w:t xml:space="preserve"> sobre las topologías circuitales derivadas de la acción de los interruptores. </w:t>
       </w:r>
     </w:p>
     <w:p>
@@ -9244,7 +8998,16 @@
           <w:sz w:val="24"/>
           <w:szCs w:val="24"/>
         </w:rPr>
-        <w:t>se obtiene aplicando KVL en la malla formada por la fuente y el inductor, y KCL en el nodo común entre el c</w:t>
+        <w:t xml:space="preserve">se obtiene aplicando KVL en la </w:t>
+      </w:r>
+      <w:r>
+        <w:rPr>
+          <w:rFonts w:cstheme="minorHAnsi"/>
+          <w:sz w:val="24"/>
+          <w:szCs w:val="24"/>
+        </w:rPr>
+        <w:lastRenderedPageBreak/>
+        <w:t>malla formada por la fuente y el inductor, y KCL en el nodo común entre el c</w:t>
       </w:r>
       <w:r>
         <w:rPr>
@@ -10588,7 +10351,7 @@
           </mc:Choice>
           <mc:Fallback>
             <w:pict>
-              <v:shape w14:anchorId="401EDEA3" id="Cuadro de texto 39" o:spid="_x0000_s1052" type="#_x0000_t202" style="position:absolute;margin-left:414.45pt;margin-top:56.65pt;width:1in;height:20pt;z-index:251751424;visibility:visible;mso-wrap-style:none;mso-height-percent:0;mso-wrap-distance-left:9pt;mso-wrap-distance-top:0;mso-wrap-distance-right:9pt;mso-wrap-distance-bottom:0;mso-position-horizontal:absolute;mso-position-horizontal-relative:text;mso-position-vertical:absolute;mso-position-vertical-relative:text;mso-height-percent:0;mso-height-relative:margin;v-text-anchor:top" o:gfxdata="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" filled="f" stroked="f">
+              <v:shape w14:anchorId="401EDEA3" id="Cuadro de texto 39" o:spid="_x0000_s1052" type="#_x0000_t202" style="position:absolute;margin-left:414.45pt;margin-top:56.65pt;width:1in;height:20pt;z-index:251751424;visibility:visible;mso-wrap-style:none;mso-height-percent:0;mso-wrap-distance-left:9pt;mso-wrap-distance-top:0;mso-wrap-distance-right:9pt;mso-wrap-distance-bottom:0;mso-position-horizontal:absolute;mso-position-horizontal-relative:text;mso-position-vertical:absolute;mso-position-vertical-relative:text;mso-height-percent:0;mso-height-relative:margin;v-text-anchor:top" o:gfxdata="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" filled="f" stroked="f">
                 <v:textbox>
                   <w:txbxContent>
                     <w:p>
@@ -10724,7 +10487,7 @@
           </mc:Choice>
           <mc:Fallback>
             <w:pict>
-              <v:shape w14:anchorId="27E20B79" id="Cuadro de texto 4" o:spid="_x0000_s1053" type="#_x0000_t202" style="position:absolute;margin-left:412.95pt;margin-top:66.65pt;width:1in;height:23pt;z-index:251734016;visibility:visible;mso-wrap-style:none;mso-height-percent:0;mso-wrap-distance-left:9pt;mso-wrap-distance-top:0;mso-wrap-distance-right:9pt;mso-wrap-distance-bottom:0;mso-position-horizontal:absolute;mso-position-horizontal-relative:text;mso-position-vertical:absolute;mso-position-vertical-relative:text;mso-height-percent:0;mso-height-relative:margin;v-text-anchor:top" o:gfxdata="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" filled="f" stroked="f">
+              <v:shape w14:anchorId="27E20B79" id="Cuadro de texto 4" o:spid="_x0000_s1053" type="#_x0000_t202" style="position:absolute;margin-left:412.95pt;margin-top:66.65pt;width:1in;height:23pt;z-index:251734016;visibility:visible;mso-wrap-style:none;mso-height-percent:0;mso-wrap-distance-left:9pt;mso-wrap-distance-top:0;mso-wrap-distance-right:9pt;mso-wrap-distance-bottom:0;mso-position-horizontal:absolute;mso-position-horizontal-relative:text;mso-position-vertical:absolute;mso-position-vertical-relative:text;mso-height-percent:0;mso-height-relative:margin;v-text-anchor:top" o:gfxdata="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" filled="f" stroked="f">
                 <v:textbox>
                   <w:txbxContent>
                     <w:p>
@@ -10863,7 +10626,7 @@
           </mc:Choice>
           <mc:Fallback>
             <w:pict>
-              <v:shape w14:anchorId="374D4E96" id="Cuadro de texto 38" o:spid="_x0000_s1054" type="#_x0000_t202" style="position:absolute;margin-left:413.95pt;margin-top:77.65pt;width:16pt;height:22pt;z-index:251749376;visibility:visible;mso-wrap-style:square;mso-width-percent:0;mso-height-percent:0;mso-wrap-distance-left:9pt;mso-wrap-distance-top:0;mso-wrap-distance-right:9pt;mso-wrap-distance-bottom:0;mso-position-horizontal:absolute;mso-position-horizontal-relative:text;mso-position-vertical:absolute;mso-position-vertical-relative:text;mso-width-percent:0;mso-height-percent:0;mso-width-relative:margin;mso-height-relative:margin;v-text-anchor:top" o:gfxdata="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" filled="f" stroked="f">
+              <v:shape w14:anchorId="374D4E96" id="Cuadro de texto 38" o:spid="_x0000_s1054" type="#_x0000_t202" style="position:absolute;margin-left:413.95pt;margin-top:77.65pt;width:16pt;height:22pt;z-index:251749376;visibility:visible;mso-wrap-style:square;mso-width-percent:0;mso-height-percent:0;mso-wrap-distance-left:9pt;mso-wrap-distance-top:0;mso-wrap-distance-right:9pt;mso-wrap-distance-bottom:0;mso-position-horizontal:absolute;mso-position-horizontal-relative:text;mso-position-vertical:absolute;mso-position-vertical-relative:text;mso-width-percent:0;mso-height-percent:0;mso-width-relative:margin;mso-height-relative:margin;v-text-anchor:top" o:gfxdata="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" filled="f" stroked="f">
                 <v:textbox>
                   <w:txbxContent>
                     <w:p>
@@ -11071,7 +10834,7 @@
           </mc:Choice>
           <mc:Fallback>
             <w:pict>
-              <v:shape w14:anchorId="2457AB0B" id="Cuadro de texto 33" o:spid="_x0000_s1055" type="#_x0000_t202" style="position:absolute;margin-left:411.45pt;margin-top:28.65pt;width:1in;height:23pt;z-index:251743232;visibility:visible;mso-wrap-style:none;mso-height-percent:0;mso-wrap-distance-left:9pt;mso-wrap-distance-top:0;mso-wrap-distance-right:9pt;mso-wrap-distance-bottom:0;mso-position-horizontal:absolute;mso-position-horizontal-relative:text;mso-position-vertical:absolute;mso-position-vertical-relative:text;mso-height-percent:0;mso-height-relative:margin;v-text-anchor:top" o:gfxdata="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" filled="f" stroked="f">
+              <v:shape w14:anchorId="2457AB0B" id="Cuadro de texto 33" o:spid="_x0000_s1055" type="#_x0000_t202" style="position:absolute;margin-left:411.45pt;margin-top:28.65pt;width:1in;height:23pt;z-index:251743232;visibility:visible;mso-wrap-style:none;mso-height-percent:0;mso-wrap-distance-left:9pt;mso-wrap-distance-top:0;mso-wrap-distance-right:9pt;mso-wrap-distance-bottom:0;mso-position-horizontal:absolute;mso-position-horizontal-relative:text;mso-position-vertical:absolute;mso-position-vertical-relative:text;mso-height-percent:0;mso-height-relative:margin;v-text-anchor:top" o:gfxdata="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" filled="f" stroked="f">
                 <v:textbox>
                   <w:txbxContent>
                     <w:p>
@@ -11211,7 +10974,7 @@
           </mc:Choice>
           <mc:Fallback>
             <w:pict>
-              <v:shape w14:anchorId="2B5D7466" id="Cuadro de texto 37" o:spid="_x0000_s1056" type="#_x0000_t202" style="position:absolute;margin-left:331.45pt;margin-top:77.65pt;width:19.5pt;height:20.5pt;z-index:251747328;visibility:visible;mso-wrap-style:square;mso-width-percent:0;mso-height-percent:0;mso-wrap-distance-left:9pt;mso-wrap-distance-top:0;mso-wrap-distance-right:9pt;mso-wrap-distance-bottom:0;mso-position-horizontal:absolute;mso-position-horizontal-relative:text;mso-position-vertical:absolute;mso-position-vertical-relative:text;mso-width-percent:0;mso-height-percent:0;mso-width-relative:margin;mso-height-relative:margin;v-text-anchor:top" o:gfxdata="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" filled="f" stroked="f">
+              <v:shape w14:anchorId="2B5D7466" id="Cuadro de texto 37" o:spid="_x0000_s1056" type="#_x0000_t202" style="position:absolute;margin-left:331.45pt;margin-top:77.65pt;width:19.5pt;height:20.5pt;z-index:251747328;visibility:visible;mso-wrap-style:square;mso-width-percent:0;mso-height-percent:0;mso-wrap-distance-left:9pt;mso-wrap-distance-top:0;mso-wrap-distance-right:9pt;mso-wrap-distance-bottom:0;mso-position-horizontal:absolute;mso-position-horizontal-relative:text;mso-position-vertical:absolute;mso-position-vertical-relative:text;mso-width-percent:0;mso-height-percent:0;mso-width-relative:margin;mso-height-relative:margin;v-text-anchor:top" o:gfxdata="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" filled="f" stroked="f">
                 <v:textbox>
                   <w:txbxContent>
                     <w:p>
@@ -11336,7 +11099,7 @@
           </mc:Choice>
           <mc:Fallback>
             <w:pict>
-              <v:shape w14:anchorId="58035C9F" id="Cuadro de texto 36" o:spid="_x0000_s1057" type="#_x0000_t202" style="position:absolute;margin-left:331.25pt;margin-top:56.65pt;width:1in;height:21.5pt;z-index:251745280;visibility:visible;mso-wrap-style:none;mso-height-percent:0;mso-wrap-distance-left:9pt;mso-wrap-distance-top:0;mso-wrap-distance-right:9pt;mso-wrap-distance-bottom:0;mso-position-horizontal:absolute;mso-position-horizontal-relative:text;mso-position-vertical:absolute;mso-position-vertical-relative:text;mso-height-percent:0;mso-height-relative:margin;v-text-anchor:top" o:gfxdata="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" filled="f" stroked="f">
+              <v:shape w14:anchorId="58035C9F" id="Cuadro de texto 36" o:spid="_x0000_s1057" type="#_x0000_t202" style="position:absolute;margin-left:331.25pt;margin-top:56.65pt;width:1in;height:21.5pt;z-index:251745280;visibility:visible;mso-wrap-style:none;mso-height-percent:0;mso-wrap-distance-left:9pt;mso-wrap-distance-top:0;mso-wrap-distance-right:9pt;mso-wrap-distance-bottom:0;mso-position-horizontal:absolute;mso-position-horizontal-relative:text;mso-position-vertical:absolute;mso-position-vertical-relative:text;mso-height-percent:0;mso-height-relative:margin;v-text-anchor:top" o:gfxdata="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" filled="f" stroked="f">
                 <v:textbox>
                   <w:txbxContent>
                     <w:p>
@@ -11475,7 +11238,7 @@
           </mc:Choice>
           <mc:Fallback>
             <w:pict>
-              <v:shape w14:anchorId="04324B2A" id="Cuadro de texto 3" o:spid="_x0000_s1058" type="#_x0000_t202" style="position:absolute;margin-left:328.95pt;margin-top:66.65pt;width:26.5pt;height:25pt;z-index:251731968;visibility:visible;mso-wrap-style:square;mso-width-percent:0;mso-height-percent:0;mso-wrap-distance-left:9pt;mso-wrap-distance-top:0;mso-wrap-distance-right:9pt;mso-wrap-distance-bottom:0;mso-position-horizontal:absolute;mso-position-horizontal-relative:text;mso-position-vertical:absolute;mso-position-vertical-relative:text;mso-width-percent:0;mso-height-percent:0;mso-width-relative:margin;mso-height-relative:margin;v-text-anchor:top" o:gfxdata="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" filled="f" stroked="f">
+              <v:shape w14:anchorId="04324B2A" id="Cuadro de texto 3" o:spid="_x0000_s1058" type="#_x0000_t202" style="position:absolute;margin-left:328.95pt;margin-top:66.65pt;width:26.5pt;height:25pt;z-index:251731968;visibility:visible;mso-wrap-style:square;mso-width-percent:0;mso-height-percent:0;mso-wrap-distance-left:9pt;mso-wrap-distance-top:0;mso-wrap-distance-right:9pt;mso-wrap-distance-bottom:0;mso-position-horizontal:absolute;mso-position-horizontal-relative:text;mso-position-vertical:absolute;mso-position-vertical-relative:text;mso-width-percent:0;mso-height-percent:0;mso-width-relative:margin;mso-height-relative:margin;v-text-anchor:top" o:gfxdata="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" filled="f" stroked="f">
                 <v:textbox>
                   <w:txbxContent>
                     <w:p>
@@ -11690,7 +11453,7 @@
           </mc:Choice>
           <mc:Fallback>
             <w:pict>
-              <v:shape w14:anchorId="28084034" id="Cuadro de texto 31" o:spid="_x0000_s1059" type="#_x0000_t202" style="position:absolute;margin-left:331.95pt;margin-top:37.15pt;width:1in;height:23pt;z-index:251741184;visibility:visible;mso-wrap-style:none;mso-height-percent:0;mso-wrap-distance-left:9pt;mso-wrap-distance-top:0;mso-wrap-distance-right:9pt;mso-wrap-distance-bottom:0;mso-position-horizontal:absolute;mso-position-horizontal-relative:text;mso-position-vertical:absolute;mso-position-vertical-relative:text;mso-height-percent:0;mso-height-relative:margin;v-text-anchor:top" o:gfxdata="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" filled="f" stroked="f">
+              <v:shape w14:anchorId="28084034" id="Cuadro de texto 31" o:spid="_x0000_s1059" type="#_x0000_t202" style="position:absolute;margin-left:331.95pt;margin-top:37.15pt;width:1in;height:23pt;z-index:251741184;visibility:visible;mso-wrap-style:none;mso-height-percent:0;mso-wrap-distance-left:9pt;mso-wrap-distance-top:0;mso-wrap-distance-right:9pt;mso-wrap-distance-bottom:0;mso-position-horizontal:absolute;mso-position-horizontal-relative:text;mso-position-vertical:absolute;mso-position-vertical-relative:text;mso-height-percent:0;mso-height-relative:margin;v-text-anchor:top" o:gfxdata="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" filled="f" stroked="f">
                 <v:textbox>
                   <w:txbxContent>
                     <w:p>
@@ -11839,7 +11602,7 @@
           </mc:Choice>
           <mc:Fallback>
             <w:pict>
-              <v:shape w14:anchorId="015A35F0" id="Cuadro de texto 29" o:spid="_x0000_s1060" type="#_x0000_t202" style="position:absolute;margin-left:131.95pt;margin-top:7.65pt;width:1in;height:23pt;z-index:251739136;visibility:visible;mso-wrap-style:none;mso-height-percent:0;mso-wrap-distance-left:9pt;mso-wrap-distance-top:0;mso-wrap-distance-right:9pt;mso-wrap-distance-bottom:0;mso-position-horizontal:absolute;mso-position-horizontal-relative:text;mso-position-vertical:absolute;mso-position-vertical-relative:text;mso-height-percent:0;mso-height-relative:margin;v-text-anchor:top" o:gfxdata="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" filled="f" stroked="f">
+              <v:shape w14:anchorId="015A35F0" id="Cuadro de texto 29" o:spid="_x0000_s1060" type="#_x0000_t202" style="position:absolute;margin-left:131.95pt;margin-top:7.65pt;width:1in;height:23pt;z-index:251739136;visibility:visible;mso-wrap-style:none;mso-height-percent:0;mso-wrap-distance-left:9pt;mso-wrap-distance-top:0;mso-wrap-distance-right:9pt;mso-wrap-distance-bottom:0;mso-position-horizontal:absolute;mso-position-horizontal-relative:text;mso-position-vertical:absolute;mso-position-vertical-relative:text;mso-height-percent:0;mso-height-relative:margin;v-text-anchor:top" o:gfxdata="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" filled="f" stroked="f">
                 <v:textbox>
                   <w:txbxContent>
                     <w:p>
@@ -12069,7 +11832,7 @@
           </mc:Choice>
           <mc:Fallback>
             <w:pict>
-              <v:shape w14:anchorId="47C1E5F1" id="Cuadro de texto 2" o:spid="_x0000_s1061" type="#_x0000_t202" style="position:absolute;margin-left:86.3pt;margin-top:10.65pt;width:1in;height:23pt;z-index:251729920;visibility:visible;mso-wrap-style:none;mso-height-percent:0;mso-wrap-distance-left:9pt;mso-wrap-distance-top:0;mso-wrap-distance-right:9pt;mso-wrap-distance-bottom:0;mso-position-horizontal:absolute;mso-position-horizontal-relative:text;mso-position-vertical:absolute;mso-position-vertical-relative:text;mso-height-percent:0;mso-height-relative:margin;v-text-anchor:top" o:gfxdata="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" filled="f" stroked="f">
+              <v:shape w14:anchorId="47C1E5F1" id="Cuadro de texto 2" o:spid="_x0000_s1061" type="#_x0000_t202" style="position:absolute;margin-left:86.3pt;margin-top:10.65pt;width:1in;height:23pt;z-index:251729920;visibility:visible;mso-wrap-style:none;mso-height-percent:0;mso-wrap-distance-left:9pt;mso-wrap-distance-top:0;mso-wrap-distance-right:9pt;mso-wrap-distance-bottom:0;mso-position-horizontal:absolute;mso-position-horizontal-relative:text;mso-position-vertical:absolute;mso-position-vertical-relative:text;mso-height-percent:0;mso-height-relative:margin;v-text-anchor:top" o:gfxdata="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" filled="f" stroked="f">
                 <v:textbox>
                   <w:txbxContent>
                     <w:p>
@@ -12131,7 +11894,7 @@
       <w:r>
         <w:rPr>
           <w:rStyle w:val="Refdecomentario"/>
-          <w:rFonts w:cstheme="minorHAnsi"/>
+          <w:noProof/>
           <w:sz w:val="22"/>
           <w:szCs w:val="22"/>
         </w:rPr>
@@ -12157,7 +11920,7 @@
                     <pic:cNvPicPr/>
                   </pic:nvPicPr>
                   <pic:blipFill>
-                    <a:blip r:embed="rId16"/>
+                    <a:blip r:embed="rId15"/>
                     <a:stretch>
                       <a:fillRect/>
                     </a:stretch>
@@ -12197,15 +11960,7 @@
         <w:t xml:space="preserve">: </w:t>
       </w:r>
       <w:r>
-        <w:t xml:space="preserve">convertidor </w:t>
-      </w:r>
-      <w:proofErr w:type="spellStart"/>
-      <w:r>
-        <w:t>Boost</w:t>
-      </w:r>
-      <w:proofErr w:type="spellEnd"/>
-      <w:r>
-        <w:t xml:space="preserve"> con señal de control  u=1.</w:t>
+        <w:t>convertidor Boost con señal de control  u=1.</w:t>
       </w:r>
     </w:p>
     <w:p>
@@ -12627,7 +12382,7 @@
           </mc:Choice>
           <mc:Fallback>
             <w:pict>
-              <v:shape w14:anchorId="2E918799" id="Cuadro de texto 103800714" o:spid="_x0000_s1062" type="#_x0000_t202" style="position:absolute;margin-left:329.75pt;margin-top:99pt;width:1in;height:30pt;rotation:180;flip:y;z-index:251768832;visibility:visible;mso-wrap-style:none;mso-height-percent:0;mso-wrap-distance-left:9pt;mso-wrap-distance-top:0;mso-wrap-distance-right:9pt;mso-wrap-distance-bottom:0;mso-position-horizontal:absolute;mso-position-horizontal-relative:text;mso-position-vertical:absolute;mso-position-vertical-relative:text;mso-height-percent:0;mso-height-relative:margin;v-text-anchor:top" o:gfxdata="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" filled="f" stroked="f">
+              <v:shape w14:anchorId="2E918799" id="Cuadro de texto 103800714" o:spid="_x0000_s1062" type="#_x0000_t202" style="position:absolute;margin-left:329.75pt;margin-top:99pt;width:1in;height:30pt;rotation:180;flip:y;z-index:251768832;visibility:visible;mso-wrap-style:none;mso-height-percent:0;mso-wrap-distance-left:9pt;mso-wrap-distance-top:0;mso-wrap-distance-right:9pt;mso-wrap-distance-bottom:0;mso-position-horizontal:absolute;mso-position-horizontal-relative:text;mso-position-vertical:absolute;mso-position-vertical-relative:text;mso-height-percent:0;mso-height-relative:margin;v-text-anchor:top" o:gfxdata="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" filled="f" stroked="f">
                 <v:textbox>
                   <w:txbxContent>
                     <w:p>
@@ -12756,7 +12511,7 @@
           </mc:Choice>
           <mc:Fallback>
             <w:pict>
-              <v:shape w14:anchorId="3D44393F" id="Cuadro de texto 103800715" o:spid="_x0000_s1063" type="#_x0000_t202" style="position:absolute;margin-left:327.45pt;margin-top:78pt;width:1in;height:23pt;rotation:180;flip:y;z-index:251770880;visibility:visible;mso-wrap-style:none;mso-width-percent:0;mso-height-percent:0;mso-wrap-distance-left:9pt;mso-wrap-distance-top:0;mso-wrap-distance-right:9pt;mso-wrap-distance-bottom:0;mso-position-horizontal:absolute;mso-position-horizontal-relative:text;mso-position-vertical:absolute;mso-position-vertical-relative:text;mso-width-percent:0;mso-height-percent:0;mso-width-relative:margin;mso-height-relative:margin;v-text-anchor:top" o:gfxdata="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" filled="f" stroked="f">
+              <v:shape w14:anchorId="3D44393F" id="Cuadro de texto 103800715" o:spid="_x0000_s1063" type="#_x0000_t202" style="position:absolute;margin-left:327.45pt;margin-top:78pt;width:1in;height:23pt;rotation:180;flip:y;z-index:251770880;visibility:visible;mso-wrap-style:none;mso-width-percent:0;mso-height-percent:0;mso-wrap-distance-left:9pt;mso-wrap-distance-top:0;mso-wrap-distance-right:9pt;mso-wrap-distance-bottom:0;mso-position-horizontal:absolute;mso-position-horizontal-relative:text;mso-position-vertical:absolute;mso-position-vertical-relative:text;mso-width-percent:0;mso-height-percent:0;mso-width-relative:margin;mso-height-relative:margin;v-text-anchor:top" o:gfxdata="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" filled="f" stroked="f">
                 <v:textbox>
                   <w:txbxContent>
                     <w:p>
@@ -12893,7 +12648,7 @@
           </mc:Choice>
           <mc:Fallback>
             <w:pict>
-              <v:shape w14:anchorId="04848B3C" id="Cuadro de texto 103800705" o:spid="_x0000_s1064" type="#_x0000_t202" style="position:absolute;margin-left:410.9pt;margin-top:54.5pt;width:1in;height:22pt;z-index:251762688;visibility:visible;mso-wrap-style:none;mso-height-percent:0;mso-wrap-distance-left:9pt;mso-wrap-distance-top:0;mso-wrap-distance-right:9pt;mso-wrap-distance-bottom:0;mso-position-horizontal:absolute;mso-position-horizontal-relative:text;mso-position-vertical:absolute;mso-position-vertical-relative:text;mso-height-percent:0;mso-height-relative:margin;v-text-anchor:top" o:gfxdata="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" filled="f" stroked="f">
+              <v:shape w14:anchorId="04848B3C" id="Cuadro de texto 103800705" o:spid="_x0000_s1064" type="#_x0000_t202" style="position:absolute;margin-left:410.9pt;margin-top:54.5pt;width:1in;height:22pt;z-index:251762688;visibility:visible;mso-wrap-style:none;mso-height-percent:0;mso-wrap-distance-left:9pt;mso-wrap-distance-top:0;mso-wrap-distance-right:9pt;mso-wrap-distance-bottom:0;mso-position-horizontal:absolute;mso-position-horizontal-relative:text;mso-position-vertical:absolute;mso-position-vertical-relative:text;mso-height-percent:0;mso-height-relative:margin;v-text-anchor:top" o:gfxdata="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" filled="f" stroked="f">
                 <v:textbox>
                   <w:txbxContent>
                     <w:p>
@@ -13096,7 +12851,7 @@
           </mc:Choice>
           <mc:Fallback>
             <w:pict>
-              <v:shape w14:anchorId="25F0E04A" id="Cuadro de texto 103800712" o:spid="_x0000_s1065" type="#_x0000_t202" style="position:absolute;margin-left:406.95pt;margin-top:99pt;width:1in;height:30pt;rotation:180;flip:y;z-index:251764736;visibility:visible;mso-wrap-style:none;mso-height-percent:0;mso-wrap-distance-left:9pt;mso-wrap-distance-top:0;mso-wrap-distance-right:9pt;mso-wrap-distance-bottom:0;mso-position-horizontal:absolute;mso-position-horizontal-relative:text;mso-position-vertical:absolute;mso-position-vertical-relative:text;mso-height-percent:0;mso-height-relative:margin;v-text-anchor:top" o:gfxdata="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" filled="f" stroked="f">
+              <v:shape w14:anchorId="25F0E04A" id="Cuadro de texto 103800712" o:spid="_x0000_s1065" type="#_x0000_t202" style="position:absolute;margin-left:406.95pt;margin-top:99pt;width:1in;height:30pt;rotation:180;flip:y;z-index:251764736;visibility:visible;mso-wrap-style:none;mso-height-percent:0;mso-wrap-distance-left:9pt;mso-wrap-distance-top:0;mso-wrap-distance-right:9pt;mso-wrap-distance-bottom:0;mso-position-horizontal:absolute;mso-position-horizontal-relative:text;mso-position-vertical:absolute;mso-position-vertical-relative:text;mso-height-percent:0;mso-height-relative:margin;v-text-anchor:top" o:gfxdata="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" filled="f" stroked="f">
                 <v:textbox>
                   <w:txbxContent>
                     <w:p>
@@ -13222,7 +12977,7 @@
           </mc:Choice>
           <mc:Fallback>
             <w:pict>
-              <v:shape w14:anchorId="1E6A959E" id="Cuadro de texto 103800713" o:spid="_x0000_s1066" type="#_x0000_t202" style="position:absolute;margin-left:-33.75pt;margin-top:79.5pt;width:1in;height:22.5pt;rotation:180;flip:y;z-index:251766784;visibility:visible;mso-wrap-style:none;mso-height-percent:0;mso-wrap-distance-left:9pt;mso-wrap-distance-top:0;mso-wrap-distance-right:9pt;mso-wrap-distance-bottom:0;mso-position-horizontal:absolute;mso-position-horizontal-relative:right-margin-area;mso-position-vertical:absolute;mso-position-vertical-relative:text;mso-height-percent:0;mso-height-relative:margin;v-text-anchor:top" o:gfxdata="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" filled="f" stroked="f">
+              <v:shape w14:anchorId="1E6A959E" id="Cuadro de texto 103800713" o:spid="_x0000_s1066" type="#_x0000_t202" style="position:absolute;margin-left:-33.75pt;margin-top:79.5pt;width:1in;height:22.5pt;rotation:180;flip:y;z-index:251766784;visibility:visible;mso-wrap-style:none;mso-height-percent:0;mso-wrap-distance-left:9pt;mso-wrap-distance-top:0;mso-wrap-distance-right:9pt;mso-wrap-distance-bottom:0;mso-position-horizontal:absolute;mso-position-horizontal-relative:right-margin-area;mso-position-vertical:absolute;mso-position-vertical-relative:text;mso-height-percent:0;mso-height-relative:margin;v-text-anchor:top" o:gfxdata="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" filled="f" stroked="f">
                 <v:textbox>
                   <w:txbxContent>
                     <w:p>
@@ -13360,7 +13115,7 @@
           </mc:Choice>
           <mc:Fallback>
             <w:pict>
-              <v:shape w14:anchorId="4399F754" id="Cuadro de texto 53" o:spid="_x0000_s1067" type="#_x0000_t202" style="position:absolute;margin-left:407.95pt;margin-top:90.5pt;width:1in;height:22pt;z-index:251756544;visibility:visible;mso-wrap-style:none;mso-height-percent:0;mso-wrap-distance-left:9pt;mso-wrap-distance-top:0;mso-wrap-distance-right:9pt;mso-wrap-distance-bottom:0;mso-position-horizontal:absolute;mso-position-horizontal-relative:text;mso-position-vertical:absolute;mso-position-vertical-relative:text;mso-height-percent:0;mso-height-relative:margin;v-text-anchor:top" o:gfxdata="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" filled="f" stroked="f">
+              <v:shape w14:anchorId="4399F754" id="Cuadro de texto 53" o:spid="_x0000_s1067" type="#_x0000_t202" style="position:absolute;margin-left:407.95pt;margin-top:90.5pt;width:1in;height:22pt;z-index:251756544;visibility:visible;mso-wrap-style:none;mso-height-percent:0;mso-wrap-distance-left:9pt;mso-wrap-distance-top:0;mso-wrap-distance-right:9pt;mso-wrap-distance-bottom:0;mso-position-horizontal:absolute;mso-position-horizontal-relative:text;mso-position-vertical:absolute;mso-position-vertical-relative:text;mso-height-percent:0;mso-height-relative:margin;v-text-anchor:top" o:gfxdata="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" filled="f" stroked="f">
                 <v:textbox>
                   <w:txbxContent>
                     <w:p>
@@ -13508,7 +13263,7 @@
           </mc:Choice>
           <mc:Fallback>
             <w:pict>
-              <v:shape w14:anchorId="1633E932" id="Cuadro de texto 48" o:spid="_x0000_s1068" type="#_x0000_t202" style="position:absolute;margin-left:326.95pt;margin-top:87.5pt;width:1in;height:22pt;z-index:251754496;visibility:visible;mso-wrap-style:none;mso-height-percent:0;mso-wrap-distance-left:9pt;mso-wrap-distance-top:0;mso-wrap-distance-right:9pt;mso-wrap-distance-bottom:0;mso-position-horizontal:absolute;mso-position-horizontal-relative:text;mso-position-vertical:absolute;mso-position-vertical-relative:text;mso-height-percent:0;mso-height-relative:margin;v-text-anchor:top" o:gfxdata="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" filled="f" stroked="f">
+              <v:shape w14:anchorId="1633E932" id="Cuadro de texto 48" o:spid="_x0000_s1068" type="#_x0000_t202" style="position:absolute;margin-left:326.95pt;margin-top:87.5pt;width:1in;height:22pt;z-index:251754496;visibility:visible;mso-wrap-style:none;mso-height-percent:0;mso-wrap-distance-left:9pt;mso-wrap-distance-top:0;mso-wrap-distance-right:9pt;mso-wrap-distance-bottom:0;mso-position-horizontal:absolute;mso-position-horizontal-relative:text;mso-position-vertical:absolute;mso-position-vertical-relative:text;mso-height-percent:0;mso-height-relative:margin;v-text-anchor:top" o:gfxdata="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" filled="f" stroked="f">
                 <v:textbox>
                   <w:txbxContent>
                     <w:p>
@@ -13659,7 +13414,7 @@
           </mc:Choice>
           <mc:Fallback>
             <w:pict>
-              <v:shape w14:anchorId="6645F62A" id="Cuadro de texto 63" o:spid="_x0000_s1069" type="#_x0000_t202" style="position:absolute;margin-left:326.4pt;margin-top:57.5pt;width:24.35pt;height:19.5pt;z-index:251760640;visibility:visible;mso-wrap-style:square;mso-width-percent:0;mso-height-percent:0;mso-wrap-distance-left:9pt;mso-wrap-distance-top:0;mso-wrap-distance-right:9pt;mso-wrap-distance-bottom:0;mso-position-horizontal:absolute;mso-position-horizontal-relative:text;mso-position-vertical:absolute;mso-position-vertical-relative:text;mso-width-percent:0;mso-height-percent:0;mso-width-relative:margin;mso-height-relative:margin;v-text-anchor:top" o:gfxdata="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" filled="f" stroked="f">
+              <v:shape w14:anchorId="6645F62A" id="Cuadro de texto 63" o:spid="_x0000_s1069" type="#_x0000_t202" style="position:absolute;margin-left:326.4pt;margin-top:57.5pt;width:24.35pt;height:19.5pt;z-index:251760640;visibility:visible;mso-wrap-style:square;mso-width-percent:0;mso-height-percent:0;mso-wrap-distance-left:9pt;mso-wrap-distance-top:0;mso-wrap-distance-right:9pt;mso-wrap-distance-bottom:0;mso-position-horizontal:absolute;mso-position-horizontal-relative:text;mso-position-vertical:absolute;mso-position-vertical-relative:text;mso-width-percent:0;mso-height-percent:0;mso-width-relative:margin;mso-height-relative:margin;v-text-anchor:top" o:gfxdata="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" filled="f" stroked="f">
                 <v:textbox>
                   <w:txbxContent>
                     <w:p>
@@ -13873,7 +13628,7 @@
           </mc:Choice>
           <mc:Fallback>
             <w:pict>
-              <v:shape w14:anchorId="1785964E" id="Cuadro de texto 56" o:spid="_x0000_s1070" type="#_x0000_t202" style="position:absolute;margin-left:127.45pt;margin-top:27pt;width:1in;height:22pt;z-index:251758592;visibility:visible;mso-wrap-style:none;mso-height-percent:0;mso-wrap-distance-left:9pt;mso-wrap-distance-top:0;mso-wrap-distance-right:9pt;mso-wrap-distance-bottom:0;mso-position-horizontal:absolute;mso-position-horizontal-relative:text;mso-position-vertical:absolute;mso-position-vertical-relative:text;mso-height-percent:0;mso-height-relative:margin;v-text-anchor:top" o:gfxdata="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" filled="f" stroked="f">
+              <v:shape w14:anchorId="1785964E" id="Cuadro de texto 56" o:spid="_x0000_s1070" type="#_x0000_t202" style="position:absolute;margin-left:127.45pt;margin-top:27pt;width:1in;height:22pt;z-index:251758592;visibility:visible;mso-wrap-style:none;mso-height-percent:0;mso-wrap-distance-left:9pt;mso-wrap-distance-top:0;mso-wrap-distance-right:9pt;mso-wrap-distance-bottom:0;mso-position-horizontal:absolute;mso-position-horizontal-relative:text;mso-position-vertical:absolute;mso-position-vertical-relative:text;mso-height-percent:0;mso-height-relative:margin;v-text-anchor:top" o:gfxdata="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" filled="f" stroked="f">
                 <v:textbox>
                   <w:txbxContent>
                     <w:p>
@@ -14087,7 +13842,7 @@
           </mc:Choice>
           <mc:Fallback>
             <w:pict>
-              <v:shape w14:anchorId="34BDB7C5" id="Cuadro de texto 47" o:spid="_x0000_s1071" type="#_x0000_t202" style="position:absolute;margin-left:87.45pt;margin-top:29.5pt;width:1in;height:22pt;z-index:251752448;visibility:visible;mso-wrap-style:none;mso-height-percent:0;mso-wrap-distance-left:9pt;mso-wrap-distance-top:0;mso-wrap-distance-right:9pt;mso-wrap-distance-bottom:0;mso-position-horizontal:absolute;mso-position-horizontal-relative:text;mso-position-vertical:absolute;mso-position-vertical-relative:text;mso-height-percent:0;mso-height-relative:margin;v-text-anchor:top" o:gfxdata="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" filled="f" stroked="f">
+              <v:shape w14:anchorId="34BDB7C5" id="Cuadro de texto 47" o:spid="_x0000_s1071" type="#_x0000_t202" style="position:absolute;margin-left:87.45pt;margin-top:29.5pt;width:1in;height:22pt;z-index:251752448;visibility:visible;mso-wrap-style:none;mso-height-percent:0;mso-wrap-distance-left:9pt;mso-wrap-distance-top:0;mso-wrap-distance-right:9pt;mso-wrap-distance-bottom:0;mso-position-horizontal:absolute;mso-position-horizontal-relative:text;mso-position-vertical:absolute;mso-position-vertical-relative:text;mso-height-percent:0;mso-height-relative:margin;v-text-anchor:top" o:gfxdata="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" filled="f" stroked="f">
                 <v:textbox>
                   <w:txbxContent>
                     <w:p>
@@ -14156,7 +13911,7 @@
                     <pic:cNvPicPr/>
                   </pic:nvPicPr>
                   <pic:blipFill>
-                    <a:blip r:embed="rId17"/>
+                    <a:blip r:embed="rId16"/>
                     <a:stretch>
                       <a:fillRect/>
                     </a:stretch>
@@ -14196,15 +13951,7 @@
         <w:t>:</w:t>
       </w:r>
       <w:r>
-        <w:t xml:space="preserve">convertidor </w:t>
-      </w:r>
-      <w:proofErr w:type="spellStart"/>
-      <w:r>
-        <w:t>Boost</w:t>
-      </w:r>
-      <w:proofErr w:type="spellEnd"/>
-      <w:r>
-        <w:t xml:space="preserve"> con señal de control u=0.</w:t>
+        <w:t>convertidor Boost con señal de control u=0.</w:t>
       </w:r>
     </w:p>
     <w:p>
@@ -15235,25 +14982,24 @@
           <w:sz w:val="24"/>
           <w:szCs w:val="24"/>
         </w:rPr>
-        <w:t xml:space="preserve"> del convertidor </w:t>
-      </w:r>
-      <w:proofErr w:type="spellStart"/>
+        <w:t xml:space="preserve"> del convertidor boost describe el comportamiento dinámico del sistema al considerar explícitamente los dos estados de operación del interruptor: Posición 1 (</w:t>
+      </w:r>
       <w:r>
         <w:rPr>
           <w:rFonts w:eastAsia="Times New Roman" w:cstheme="minorHAnsi"/>
           <w:sz w:val="24"/>
           <w:szCs w:val="24"/>
         </w:rPr>
-        <w:t>boost</w:t>
-      </w:r>
-      <w:proofErr w:type="spellEnd"/>
+        <w:t>Q</w:t>
+      </w:r>
       <w:r>
         <w:rPr>
           <w:rFonts w:eastAsia="Times New Roman" w:cstheme="minorHAnsi"/>
           <w:sz w:val="24"/>
           <w:szCs w:val="24"/>
-        </w:rPr>
-        <w:t xml:space="preserve"> describe el comportamiento dinámico del sistema al considerar explícitamente los dos estados de operación del interruptor: Posición 1 (</w:t>
+          <w:vertAlign w:val="subscript"/>
+        </w:rPr>
+        <w:t>1</w:t>
       </w:r>
       <w:r>
         <w:rPr>
@@ -15261,6 +15007,71 @@
           <w:sz w:val="24"/>
           <w:szCs w:val="24"/>
         </w:rPr>
+        <w:t xml:space="preserve"> </w:t>
+      </w:r>
+      <w:r>
+        <w:rPr>
+          <w:rFonts w:eastAsia="Times New Roman" w:cstheme="minorHAnsi"/>
+          <w:sz w:val="24"/>
+          <w:szCs w:val="24"/>
+        </w:rPr>
+        <w:sym w:font="Wingdings" w:char="F0E0"/>
+      </w:r>
+      <w:r>
+        <w:rPr>
+          <w:rFonts w:eastAsia="Times New Roman" w:cstheme="minorHAnsi"/>
+          <w:sz w:val="24"/>
+          <w:szCs w:val="24"/>
+        </w:rPr>
+        <w:t xml:space="preserve"> ON, Q</w:t>
+      </w:r>
+      <w:r>
+        <w:rPr>
+          <w:rFonts w:eastAsia="Times New Roman" w:cstheme="minorHAnsi"/>
+          <w:sz w:val="24"/>
+          <w:szCs w:val="24"/>
+          <w:vertAlign w:val="subscript"/>
+        </w:rPr>
+        <w:t>2</w:t>
+      </w:r>
+      <w:r>
+        <w:rPr>
+          <w:rFonts w:eastAsia="Times New Roman" w:cstheme="minorHAnsi"/>
+          <w:sz w:val="24"/>
+          <w:szCs w:val="24"/>
+        </w:rPr>
+        <w:t xml:space="preserve"> o D </w:t>
+      </w:r>
+      <w:r>
+        <w:rPr>
+          <w:rFonts w:eastAsia="Times New Roman" w:cstheme="minorHAnsi"/>
+          <w:sz w:val="24"/>
+          <w:szCs w:val="24"/>
+        </w:rPr>
+        <w:sym w:font="Wingdings" w:char="F0E0"/>
+      </w:r>
+      <w:r>
+        <w:rPr>
+          <w:rFonts w:eastAsia="Times New Roman" w:cstheme="minorHAnsi"/>
+          <w:sz w:val="24"/>
+          <w:szCs w:val="24"/>
+        </w:rPr>
+        <w:t xml:space="preserve"> OFF</w:t>
+      </w:r>
+      <w:r>
+        <w:rPr>
+          <w:rFonts w:eastAsia="Times New Roman" w:cstheme="minorHAnsi"/>
+          <w:sz w:val="24"/>
+          <w:szCs w:val="24"/>
+        </w:rPr>
+        <w:t>) y Posición 2 (</w:t>
+      </w:r>
+      <w:r>
+        <w:rPr>
+          <w:rFonts w:eastAsia="Times New Roman" w:cstheme="minorHAnsi"/>
+          <w:sz w:val="24"/>
+          <w:szCs w:val="24"/>
+        </w:rPr>
         <w:t>Q</w:t>
       </w:r>
       <w:r>
@@ -15294,7 +15105,7 @@
           <w:sz w:val="24"/>
           <w:szCs w:val="24"/>
         </w:rPr>
-        <w:t xml:space="preserve"> ON, Q</w:t>
+        <w:t xml:space="preserve"> OFF, Q</w:t>
       </w:r>
       <w:r>
         <w:rPr>
@@ -15327,7 +15138,7 @@
           <w:sz w:val="24"/>
           <w:szCs w:val="24"/>
         </w:rPr>
-        <w:t xml:space="preserve"> OFF</w:t>
+        <w:t xml:space="preserve"> ON</w:t>
       </w:r>
       <w:r>
         <w:rPr>
@@ -15335,107 +15146,7 @@
           <w:sz w:val="24"/>
           <w:szCs w:val="24"/>
         </w:rPr>
-        <w:t>) y Posición 2 (</w:t>
-      </w:r>
-      <w:r>
-        <w:rPr>
-          <w:rFonts w:eastAsia="Times New Roman" w:cstheme="minorHAnsi"/>
-          <w:sz w:val="24"/>
-          <w:szCs w:val="24"/>
-        </w:rPr>
-        <w:t>Q</w:t>
-      </w:r>
-      <w:r>
-        <w:rPr>
-          <w:rFonts w:eastAsia="Times New Roman" w:cstheme="minorHAnsi"/>
-          <w:sz w:val="24"/>
-          <w:szCs w:val="24"/>
-          <w:vertAlign w:val="subscript"/>
-        </w:rPr>
-        <w:t>1</w:t>
-      </w:r>
-      <w:r>
-        <w:rPr>
-          <w:rFonts w:eastAsia="Times New Roman" w:cstheme="minorHAnsi"/>
-          <w:sz w:val="24"/>
-          <w:szCs w:val="24"/>
-        </w:rPr>
-        <w:t xml:space="preserve"> </w:t>
-      </w:r>
-      <w:r>
-        <w:rPr>
-          <w:rFonts w:eastAsia="Times New Roman" w:cstheme="minorHAnsi"/>
-          <w:sz w:val="24"/>
-          <w:szCs w:val="24"/>
-        </w:rPr>
-        <w:sym w:font="Wingdings" w:char="F0E0"/>
-      </w:r>
-      <w:r>
-        <w:rPr>
-          <w:rFonts w:eastAsia="Times New Roman" w:cstheme="minorHAnsi"/>
-          <w:sz w:val="24"/>
-          <w:szCs w:val="24"/>
-        </w:rPr>
-        <w:t xml:space="preserve"> OFF, Q</w:t>
-      </w:r>
-      <w:r>
-        <w:rPr>
-          <w:rFonts w:eastAsia="Times New Roman" w:cstheme="minorHAnsi"/>
-          <w:sz w:val="24"/>
-          <w:szCs w:val="24"/>
-          <w:vertAlign w:val="subscript"/>
-        </w:rPr>
-        <w:t>2</w:t>
-      </w:r>
-      <w:r>
-        <w:rPr>
-          <w:rFonts w:eastAsia="Times New Roman" w:cstheme="minorHAnsi"/>
-          <w:sz w:val="24"/>
-          <w:szCs w:val="24"/>
-        </w:rPr>
-        <w:t xml:space="preserve"> o D </w:t>
-      </w:r>
-      <w:r>
-        <w:rPr>
-          <w:rFonts w:eastAsia="Times New Roman" w:cstheme="minorHAnsi"/>
-          <w:sz w:val="24"/>
-          <w:szCs w:val="24"/>
-        </w:rPr>
-        <w:sym w:font="Wingdings" w:char="F0E0"/>
-      </w:r>
-      <w:r>
-        <w:rPr>
-          <w:rFonts w:eastAsia="Times New Roman" w:cstheme="minorHAnsi"/>
-          <w:sz w:val="24"/>
-          <w:szCs w:val="24"/>
-        </w:rPr>
-        <w:t xml:space="preserve"> ON</w:t>
-      </w:r>
-      <w:r>
-        <w:rPr>
-          <w:rFonts w:eastAsia="Times New Roman" w:cstheme="minorHAnsi"/>
-          <w:sz w:val="24"/>
-          <w:szCs w:val="24"/>
-        </w:rPr>
-        <w:t xml:space="preserve">). Cada estado corresponde a una configuración </w:t>
-      </w:r>
-      <w:proofErr w:type="spellStart"/>
-      <w:r>
-        <w:rPr>
-          <w:rFonts w:eastAsia="Times New Roman" w:cstheme="minorHAnsi"/>
-          <w:sz w:val="24"/>
-          <w:szCs w:val="24"/>
-        </w:rPr>
-        <w:t>circuital</w:t>
-      </w:r>
-      <w:proofErr w:type="spellEnd"/>
-      <w:r>
-        <w:rPr>
-          <w:rFonts w:eastAsia="Times New Roman" w:cstheme="minorHAnsi"/>
-          <w:sz w:val="24"/>
-          <w:szCs w:val="24"/>
-        </w:rPr>
-        <w:t xml:space="preserve"> distinta, lo que da lugar a un conjunto específico de ecuaciones diferenciales que gobiernan la dinámica de las variables de estado representadas por la corriente del inductor y el voltaje del capacitor</w:t>
+        <w:t>). Cada estado corresponde a una configuración circuital distinta, lo que da lugar a un conjunto específico de ecuaciones diferenciales que gobiernan la dinámica de las variables de estado representadas por la corriente del inductor y el voltaje del capacitor</w:t>
       </w:r>
       <w:r>
         <w:rPr>
@@ -16408,7 +16119,7 @@
           <w:szCs w:val="24"/>
         </w:rPr>
         <w:drawing>
-          <wp:inline distT="0" distB="0" distL="0" distR="0" wp14:anchorId="58429D04" wp14:editId="0E8E8058">
+          <wp:inline distT="0" distB="0" distL="0" distR="0" wp14:anchorId="58429D04" wp14:editId="66BE0AD8">
             <wp:extent cx="3544957" cy="2658918"/>
             <wp:effectExtent l="0" t="0" r="0" b="0"/>
             <wp:docPr id="1248200758" name="Imagen 13"/>
@@ -16423,7 +16134,7 @@
                     <pic:cNvPicPr/>
                   </pic:nvPicPr>
                   <pic:blipFill>
-                    <a:blip r:embed="rId18" cstate="print">
+                    <a:blip r:embed="rId17" cstate="print">
                       <a:extLst>
                         <a:ext uri="{28A0092B-C50C-407E-A947-70E740481C1C}">
                           <a14:useLocalDpi xmlns:a14="http://schemas.microsoft.com/office/drawing/2010/main" val="0"/>
@@ -18668,7 +18379,7 @@
           </mc:Choice>
           <mc:Fallback>
             <w:pict>
-              <v:shape w14:anchorId="15F29ABE" id="Cuadro de texto 103800750" o:spid="_x0000_s1072" type="#_x0000_t202" style="position:absolute;margin-left:341.6pt;margin-top:74.15pt;width:18.5pt;height:22pt;z-index:251803648;visibility:visible;mso-wrap-style:square;mso-width-percent:0;mso-height-percent:0;mso-wrap-distance-left:9pt;mso-wrap-distance-top:0;mso-wrap-distance-right:9pt;mso-wrap-distance-bottom:0;mso-position-horizontal:absolute;mso-position-horizontal-relative:text;mso-position-vertical:absolute;mso-position-vertical-relative:text;mso-width-percent:0;mso-height-percent:0;mso-width-relative:margin;mso-height-relative:margin;v-text-anchor:top" o:gfxdata="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" filled="f" stroked="f">
+              <v:shape w14:anchorId="15F29ABE" id="Cuadro de texto 103800750" o:spid="_x0000_s1072" type="#_x0000_t202" style="position:absolute;margin-left:341.6pt;margin-top:74.15pt;width:18.5pt;height:22pt;z-index:251803648;visibility:visible;mso-wrap-style:square;mso-width-percent:0;mso-height-percent:0;mso-wrap-distance-left:9pt;mso-wrap-distance-top:0;mso-wrap-distance-right:9pt;mso-wrap-distance-bottom:0;mso-position-horizontal:absolute;mso-position-horizontal-relative:text;mso-position-vertical:absolute;mso-position-vertical-relative:text;mso-width-percent:0;mso-height-percent:0;mso-width-relative:margin;mso-height-relative:margin;v-text-anchor:top" o:gfxdata="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" filled="f" stroked="f">
                 <v:textbox>
                   <w:txbxContent>
                     <w:p>
@@ -18801,7 +18512,7 @@
                                           </pic:cNvPicPr>
                                         </pic:nvPicPr>
                                         <pic:blipFill>
-                                          <a:blip r:embed="rId19">
+                                          <a:blip r:embed="rId18">
                                             <a:extLst>
                                               <a:ext uri="{28A0092B-C50C-407E-A947-70E740481C1C}">
                                                 <a14:useLocalDpi xmlns:a14="http://schemas.microsoft.com/office/drawing/2010/main" val="0"/>
@@ -18855,7 +18566,7 @@
           </mc:Choice>
           <mc:Fallback>
             <w:pict>
-              <v:shape w14:anchorId="32DFA075" id="Cuadro de texto 103800744" o:spid="_x0000_s1073" type="#_x0000_t202" style="position:absolute;margin-left:232.45pt;margin-top:77.15pt;width:16.5pt;height:22.5pt;z-index:251797504;visibility:visible;mso-wrap-style:square;mso-width-percent:0;mso-height-percent:0;mso-wrap-distance-left:9pt;mso-wrap-distance-top:0;mso-wrap-distance-right:9pt;mso-wrap-distance-bottom:0;mso-position-horizontal:absolute;mso-position-horizontal-relative:text;mso-position-vertical:absolute;mso-position-vertical-relative:text;mso-width-percent:0;mso-height-percent:0;mso-width-relative:margin;mso-height-relative:margin;v-text-anchor:top" o:gfxdata="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" filled="f" stroked="f">
+              <v:shape w14:anchorId="32DFA075" id="Cuadro de texto 103800744" o:spid="_x0000_s1073" type="#_x0000_t202" style="position:absolute;margin-left:232.45pt;margin-top:77.15pt;width:16.5pt;height:22.5pt;z-index:251797504;visibility:visible;mso-wrap-style:square;mso-width-percent:0;mso-height-percent:0;mso-wrap-distance-left:9pt;mso-wrap-distance-top:0;mso-wrap-distance-right:9pt;mso-wrap-distance-bottom:0;mso-position-horizontal:absolute;mso-position-horizontal-relative:text;mso-position-vertical:absolute;mso-position-vertical-relative:text;mso-width-percent:0;mso-height-percent:0;mso-width-relative:margin;mso-height-relative:margin;v-text-anchor:top" o:gfxdata="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" filled="f" stroked="f">
                 <v:textbox>
                   <w:txbxContent>
                     <w:p>
@@ -18906,7 +18617,7 @@
                                     </pic:cNvPicPr>
                                   </pic:nvPicPr>
                                   <pic:blipFill>
-                                    <a:blip r:embed="rId20">
+                                    <a:blip r:embed="rId18">
                                       <a:extLst>
                                         <a:ext uri="{28A0092B-C50C-407E-A947-70E740481C1C}">
                                           <a14:useLocalDpi xmlns:a14="http://schemas.microsoft.com/office/drawing/2010/main" val="0"/>
@@ -19057,7 +18768,7 @@
                                           </pic:cNvPicPr>
                                         </pic:nvPicPr>
                                         <pic:blipFill>
-                                          <a:blip r:embed="rId19">
+                                          <a:blip r:embed="rId18">
                                             <a:extLst>
                                               <a:ext uri="{28A0092B-C50C-407E-A947-70E740481C1C}">
                                                 <a14:useLocalDpi xmlns:a14="http://schemas.microsoft.com/office/drawing/2010/main" val="0"/>
@@ -19111,7 +18822,7 @@
           </mc:Choice>
           <mc:Fallback>
             <w:pict>
-              <v:shape w14:anchorId="4A573C83" id="Cuadro de texto 103800748" o:spid="_x0000_s1074" type="#_x0000_t202" style="position:absolute;margin-left:228.45pt;margin-top:68.65pt;width:31.5pt;height:29.5pt;z-index:251801600;visibility:visible;mso-wrap-style:square;mso-width-percent:0;mso-height-percent:0;mso-wrap-distance-left:9pt;mso-wrap-distance-top:0;mso-wrap-distance-right:9pt;mso-wrap-distance-bottom:0;mso-position-horizontal:absolute;mso-position-horizontal-relative:text;mso-position-vertical:absolute;mso-position-vertical-relative:text;mso-width-percent:0;mso-height-percent:0;mso-width-relative:margin;mso-height-relative:margin;v-text-anchor:top" o:gfxdata="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" filled="f" stroked="f">
+              <v:shape w14:anchorId="4A573C83" id="Cuadro de texto 103800748" o:spid="_x0000_s1074" type="#_x0000_t202" style="position:absolute;margin-left:228.45pt;margin-top:68.65pt;width:31.5pt;height:29.5pt;z-index:251801600;visibility:visible;mso-wrap-style:square;mso-width-percent:0;mso-height-percent:0;mso-wrap-distance-left:9pt;mso-wrap-distance-top:0;mso-wrap-distance-right:9pt;mso-wrap-distance-bottom:0;mso-position-horizontal:absolute;mso-position-horizontal-relative:text;mso-position-vertical:absolute;mso-position-vertical-relative:text;mso-width-percent:0;mso-height-percent:0;mso-width-relative:margin;mso-height-relative:margin;v-text-anchor:top" o:gfxdata="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" filled="f" stroked="f">
                 <v:textbox>
                   <w:txbxContent>
                     <w:p>
@@ -19173,7 +18884,7 @@
                                     </pic:cNvPicPr>
                                   </pic:nvPicPr>
                                   <pic:blipFill>
-                                    <a:blip r:embed="rId20">
+                                    <a:blip r:embed="rId18">
                                       <a:extLst>
                                         <a:ext uri="{28A0092B-C50C-407E-A947-70E740481C1C}">
                                           <a14:useLocalDpi xmlns:a14="http://schemas.microsoft.com/office/drawing/2010/main" val="0"/>
@@ -19313,7 +19024,7 @@
                                           </pic:cNvPicPr>
                                         </pic:nvPicPr>
                                         <pic:blipFill>
-                                          <a:blip r:embed="rId19">
+                                          <a:blip r:embed="rId18">
                                             <a:extLst>
                                               <a:ext uri="{28A0092B-C50C-407E-A947-70E740481C1C}">
                                                 <a14:useLocalDpi xmlns:a14="http://schemas.microsoft.com/office/drawing/2010/main" val="0"/>
@@ -19367,7 +19078,7 @@
           </mc:Choice>
           <mc:Fallback>
             <w:pict>
-              <v:shape w14:anchorId="18DBA26A" id="Cuadro de texto 103800746" o:spid="_x0000_s1075" type="#_x0000_t202" style="position:absolute;margin-left:230.95pt;margin-top:58.65pt;width:18.5pt;height:22pt;z-index:251799552;visibility:visible;mso-wrap-style:square;mso-width-percent:0;mso-height-percent:0;mso-wrap-distance-left:9pt;mso-wrap-distance-top:0;mso-wrap-distance-right:9pt;mso-wrap-distance-bottom:0;mso-position-horizontal:absolute;mso-position-horizontal-relative:text;mso-position-vertical:absolute;mso-position-vertical-relative:text;mso-width-percent:0;mso-height-percent:0;mso-width-relative:margin;mso-height-relative:margin;v-text-anchor:top" o:gfxdata="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" filled="f" stroked="f">
+              <v:shape w14:anchorId="18DBA26A" id="Cuadro de texto 103800746" o:spid="_x0000_s1075" type="#_x0000_t202" style="position:absolute;margin-left:230.95pt;margin-top:58.65pt;width:18.5pt;height:22pt;z-index:251799552;visibility:visible;mso-wrap-style:square;mso-width-percent:0;mso-height-percent:0;mso-wrap-distance-left:9pt;mso-wrap-distance-top:0;mso-wrap-distance-right:9pt;mso-wrap-distance-bottom:0;mso-position-horizontal:absolute;mso-position-horizontal-relative:text;mso-position-vertical:absolute;mso-position-vertical-relative:text;mso-width-percent:0;mso-height-percent:0;mso-width-relative:margin;mso-height-relative:margin;v-text-anchor:top" o:gfxdata="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" filled="f" stroked="f">
                 <v:textbox>
                   <w:txbxContent>
                     <w:p>
@@ -19418,7 +19129,7 @@
                                     </pic:cNvPicPr>
                                   </pic:nvPicPr>
                                   <pic:blipFill>
-                                    <a:blip r:embed="rId20">
+                                    <a:blip r:embed="rId18">
                                       <a:extLst>
                                         <a:ext uri="{28A0092B-C50C-407E-A947-70E740481C1C}">
                                           <a14:useLocalDpi xmlns:a14="http://schemas.microsoft.com/office/drawing/2010/main" val="0"/>
@@ -19554,7 +19265,7 @@
           </mc:Choice>
           <mc:Fallback>
             <w:pict>
-              <v:shape w14:anchorId="0678FB6E" id="Cuadro de texto 103800743" o:spid="_x0000_s1076" type="#_x0000_t202" style="position:absolute;margin-left:402.95pt;margin-top:76.15pt;width:18.5pt;height:22pt;z-index:251795456;visibility:visible;mso-wrap-style:square;mso-width-percent:0;mso-height-percent:0;mso-wrap-distance-left:9pt;mso-wrap-distance-top:0;mso-wrap-distance-right:9pt;mso-wrap-distance-bottom:0;mso-position-horizontal:absolute;mso-position-horizontal-relative:text;mso-position-vertical:absolute;mso-position-vertical-relative:text;mso-width-percent:0;mso-height-percent:0;mso-width-relative:margin;mso-height-relative:margin;v-text-anchor:top" o:gfxdata="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" filled="f" stroked="f">
+              <v:shape w14:anchorId="0678FB6E" id="Cuadro de texto 103800743" o:spid="_x0000_s1076" type="#_x0000_t202" style="position:absolute;margin-left:402.95pt;margin-top:76.15pt;width:18.5pt;height:22pt;z-index:251795456;visibility:visible;mso-wrap-style:square;mso-width-percent:0;mso-height-percent:0;mso-wrap-distance-left:9pt;mso-wrap-distance-top:0;mso-wrap-distance-right:9pt;mso-wrap-distance-bottom:0;mso-position-horizontal:absolute;mso-position-horizontal-relative:text;mso-position-vertical:absolute;mso-position-vertical-relative:text;mso-width-percent:0;mso-height-percent:0;mso-width-relative:margin;mso-height-relative:margin;v-text-anchor:top" o:gfxdata="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" filled="f" stroked="f">
                 <v:textbox>
                   <w:txbxContent>
                     <w:p>
@@ -19683,7 +19394,7 @@
           </mc:Choice>
           <mc:Fallback>
             <w:pict>
-              <v:shape w14:anchorId="75F9E87E" id="Cuadro de texto 103800742" o:spid="_x0000_s1077" type="#_x0000_t202" style="position:absolute;margin-left:402.45pt;margin-top:55.15pt;width:18.5pt;height:22pt;z-index:251793408;visibility:visible;mso-wrap-style:square;mso-width-percent:0;mso-height-percent:0;mso-wrap-distance-left:9pt;mso-wrap-distance-top:0;mso-wrap-distance-right:9pt;mso-wrap-distance-bottom:0;mso-position-horizontal:absolute;mso-position-horizontal-relative:text;mso-position-vertical:absolute;mso-position-vertical-relative:text;mso-width-percent:0;mso-height-percent:0;mso-width-relative:margin;mso-height-relative:margin;v-text-anchor:top" o:gfxdata="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" filled="f" stroked="f">
+              <v:shape w14:anchorId="75F9E87E" id="Cuadro de texto 103800742" o:spid="_x0000_s1077" type="#_x0000_t202" style="position:absolute;margin-left:402.45pt;margin-top:55.15pt;width:18.5pt;height:22pt;z-index:251793408;visibility:visible;mso-wrap-style:square;mso-width-percent:0;mso-height-percent:0;mso-wrap-distance-left:9pt;mso-wrap-distance-top:0;mso-wrap-distance-right:9pt;mso-wrap-distance-bottom:0;mso-position-horizontal:absolute;mso-position-horizontal-relative:text;mso-position-vertical:absolute;mso-position-vertical-relative:text;mso-width-percent:0;mso-height-percent:0;mso-width-relative:margin;mso-height-relative:margin;v-text-anchor:top" o:gfxdata="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" filled="f" stroked="f">
                 <v:textbox>
                   <w:txbxContent>
                     <w:p>
@@ -19812,7 +19523,7 @@
           </mc:Choice>
           <mc:Fallback>
             <w:pict>
-              <v:shape w14:anchorId="16D21137" id="Cuadro de texto 103800741" o:spid="_x0000_s1078" type="#_x0000_t202" style="position:absolute;margin-left:340.45pt;margin-top:52.65pt;width:18.5pt;height:22pt;z-index:251791360;visibility:visible;mso-wrap-style:square;mso-width-percent:0;mso-height-percent:0;mso-wrap-distance-left:9pt;mso-wrap-distance-top:0;mso-wrap-distance-right:9pt;mso-wrap-distance-bottom:0;mso-position-horizontal:absolute;mso-position-horizontal-relative:text;mso-position-vertical:absolute;mso-position-vertical-relative:text;mso-width-percent:0;mso-height-percent:0;mso-width-relative:margin;mso-height-relative:margin;v-text-anchor:top" o:gfxdata="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" filled="f" stroked="f">
+              <v:shape w14:anchorId="16D21137" id="Cuadro de texto 103800741" o:spid="_x0000_s1078" type="#_x0000_t202" style="position:absolute;margin-left:340.45pt;margin-top:52.65pt;width:18.5pt;height:22pt;z-index:251791360;visibility:visible;mso-wrap-style:square;mso-width-percent:0;mso-height-percent:0;mso-wrap-distance-left:9pt;mso-wrap-distance-top:0;mso-wrap-distance-right:9pt;mso-wrap-distance-bottom:0;mso-position-horizontal:absolute;mso-position-horizontal-relative:text;mso-position-vertical:absolute;mso-position-vertical-relative:text;mso-width-percent:0;mso-height-percent:0;mso-width-relative:margin;mso-height-relative:margin;v-text-anchor:top" o:gfxdata="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" filled="f" stroked="f">
                 <v:textbox>
                   <w:txbxContent>
                     <w:p>
@@ -19949,7 +19660,7 @@
           </mc:Choice>
           <mc:Fallback>
             <w:pict>
-              <v:shape w14:anchorId="52557068" id="Cuadro de texto 103800740" o:spid="_x0000_s1079" type="#_x0000_t202" style="position:absolute;margin-left:297.95pt;margin-top:8.65pt;width:1in;height:23.5pt;z-index:251789312;visibility:visible;mso-wrap-style:none;mso-height-percent:0;mso-wrap-distance-left:9pt;mso-wrap-distance-top:0;mso-wrap-distance-right:9pt;mso-wrap-distance-bottom:0;mso-position-horizontal:absolute;mso-position-horizontal-relative:text;mso-position-vertical:absolute;mso-position-vertical-relative:text;mso-height-percent:0;mso-height-relative:margin;v-text-anchor:top" o:gfxdata="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" filled="f" stroked="f">
+              <v:shape w14:anchorId="52557068" id="Cuadro de texto 103800740" o:spid="_x0000_s1079" type="#_x0000_t202" style="position:absolute;margin-left:297.95pt;margin-top:8.65pt;width:1in;height:23.5pt;z-index:251789312;visibility:visible;mso-wrap-style:none;mso-height-percent:0;mso-wrap-distance-left:9pt;mso-wrap-distance-top:0;mso-wrap-distance-right:9pt;mso-wrap-distance-bottom:0;mso-position-horizontal:absolute;mso-position-horizontal-relative:text;mso-position-vertical:absolute;mso-position-vertical-relative:text;mso-height-percent:0;mso-height-relative:margin;v-text-anchor:top" o:gfxdata="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" filled="f" stroked="f">
                 <v:textbox>
                   <w:txbxContent>
                     <w:p>
@@ -20097,7 +19808,7 @@
           </mc:Choice>
           <mc:Fallback>
             <w:pict>
-              <v:shape w14:anchorId="3D3531B7" id="Cuadro de texto 103800739" o:spid="_x0000_s1080" type="#_x0000_t202" style="position:absolute;margin-left:337.45pt;margin-top:38.65pt;width:1in;height:23.5pt;z-index:251787264;visibility:visible;mso-wrap-style:none;mso-height-percent:0;mso-wrap-distance-left:9pt;mso-wrap-distance-top:0;mso-wrap-distance-right:9pt;mso-wrap-distance-bottom:0;mso-position-horizontal:absolute;mso-position-horizontal-relative:text;mso-position-vertical:absolute;mso-position-vertical-relative:text;mso-height-percent:0;mso-height-relative:margin;v-text-anchor:top" o:gfxdata="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" filled="f" stroked="f">
+              <v:shape w14:anchorId="3D3531B7" id="Cuadro de texto 103800739" o:spid="_x0000_s1080" type="#_x0000_t202" style="position:absolute;margin-left:337.45pt;margin-top:38.65pt;width:1in;height:23.5pt;z-index:251787264;visibility:visible;mso-wrap-style:none;mso-height-percent:0;mso-wrap-distance-left:9pt;mso-wrap-distance-top:0;mso-wrap-distance-right:9pt;mso-wrap-distance-bottom:0;mso-position-horizontal:absolute;mso-position-horizontal-relative:text;mso-position-vertical:absolute;mso-position-vertical-relative:text;mso-height-percent:0;mso-height-relative:margin;v-text-anchor:top" o:gfxdata="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" filled="f" stroked="f">
                 <v:textbox>
                   <w:txbxContent>
                     <w:p>
@@ -20245,7 +19956,7 @@
           </mc:Choice>
           <mc:Fallback>
             <w:pict>
-              <v:shape w14:anchorId="36BEE607" id="Cuadro de texto 103800738" o:spid="_x0000_s1081" type="#_x0000_t202" style="position:absolute;margin-left:404.95pt;margin-top:35.15pt;width:1in;height:23.5pt;z-index:251785216;visibility:visible;mso-wrap-style:none;mso-height-percent:0;mso-wrap-distance-left:9pt;mso-wrap-distance-top:0;mso-wrap-distance-right:9pt;mso-wrap-distance-bottom:0;mso-position-horizontal:absolute;mso-position-horizontal-relative:text;mso-position-vertical:absolute;mso-position-vertical-relative:text;mso-height-percent:0;mso-height-relative:margin;v-text-anchor:top" o:gfxdata="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" filled="f" stroked="f">
+              <v:shape w14:anchorId="36BEE607" id="Cuadro de texto 103800738" o:spid="_x0000_s1081" type="#_x0000_t202" style="position:absolute;margin-left:404.95pt;margin-top:35.15pt;width:1in;height:23.5pt;z-index:251785216;visibility:visible;mso-wrap-style:none;mso-height-percent:0;mso-wrap-distance-left:9pt;mso-wrap-distance-top:0;mso-wrap-distance-right:9pt;mso-wrap-distance-bottom:0;mso-position-horizontal:absolute;mso-position-horizontal-relative:text;mso-position-vertical:absolute;mso-position-vertical-relative:text;mso-height-percent:0;mso-height-relative:margin;v-text-anchor:top" o:gfxdata="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" filled="f" stroked="f">
                 <v:textbox>
                   <w:txbxContent>
                     <w:p>
@@ -20393,7 +20104,7 @@
           </mc:Choice>
           <mc:Fallback>
             <w:pict>
-              <v:shape w14:anchorId="090E9C5E" id="Cuadro de texto 103800737" o:spid="_x0000_s1082" type="#_x0000_t202" style="position:absolute;margin-left:401.45pt;margin-top:65.15pt;width:1in;height:23.5pt;z-index:251783168;visibility:visible;mso-wrap-style:none;mso-height-percent:0;mso-wrap-distance-left:9pt;mso-wrap-distance-top:0;mso-wrap-distance-right:9pt;mso-wrap-distance-bottom:0;mso-position-horizontal:absolute;mso-position-horizontal-relative:text;mso-position-vertical:absolute;mso-position-vertical-relative:text;mso-height-percent:0;mso-height-relative:margin;v-text-anchor:top" o:gfxdata="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" filled="f" stroked="f">
+              <v:shape w14:anchorId="090E9C5E" id="Cuadro de texto 103800737" o:spid="_x0000_s1082" type="#_x0000_t202" style="position:absolute;margin-left:401.45pt;margin-top:65.15pt;width:1in;height:23.5pt;z-index:251783168;visibility:visible;mso-wrap-style:none;mso-height-percent:0;mso-wrap-distance-left:9pt;mso-wrap-distance-top:0;mso-wrap-distance-right:9pt;mso-wrap-distance-bottom:0;mso-position-horizontal:absolute;mso-position-horizontal-relative:text;mso-position-vertical:absolute;mso-position-vertical-relative:text;mso-height-percent:0;mso-height-relative:margin;v-text-anchor:top" o:gfxdata="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" filled="f" stroked="f">
                 <v:textbox>
                   <w:txbxContent>
                     <w:p>
@@ -20541,7 +20252,7 @@
           </mc:Choice>
           <mc:Fallback>
             <w:pict>
-              <v:shape w14:anchorId="71A0D6FE" id="Cuadro de texto 103800736" o:spid="_x0000_s1083" type="#_x0000_t202" style="position:absolute;margin-left:339.45pt;margin-top:63.65pt;width:1in;height:23.5pt;z-index:251781120;visibility:visible;mso-wrap-style:none;mso-height-percent:0;mso-wrap-distance-left:9pt;mso-wrap-distance-top:0;mso-wrap-distance-right:9pt;mso-wrap-distance-bottom:0;mso-position-horizontal:absolute;mso-position-horizontal-relative:text;mso-position-vertical:absolute;mso-position-vertical-relative:text;mso-height-percent:0;mso-height-relative:margin;v-text-anchor:top" o:gfxdata="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" filled="f" stroked="f">
+              <v:shape w14:anchorId="71A0D6FE" id="Cuadro de texto 103800736" o:spid="_x0000_s1083" type="#_x0000_t202" style="position:absolute;margin-left:339.45pt;margin-top:63.65pt;width:1in;height:23.5pt;z-index:251781120;visibility:visible;mso-wrap-style:none;mso-height-percent:0;mso-wrap-distance-left:9pt;mso-wrap-distance-top:0;mso-wrap-distance-right:9pt;mso-wrap-distance-bottom:0;mso-position-horizontal:absolute;mso-position-horizontal-relative:text;mso-position-vertical:absolute;mso-position-vertical-relative:text;mso-height-percent:0;mso-height-relative:margin;v-text-anchor:top" o:gfxdata="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" filled="f" stroked="f">
                 <v:textbox>
                   <w:txbxContent>
                     <w:p>
@@ -20689,7 +20400,7 @@
           </mc:Choice>
           <mc:Fallback>
             <w:pict>
-              <v:shape w14:anchorId="6D8BE845" id="Cuadro de texto 103800735" o:spid="_x0000_s1084" type="#_x0000_t202" style="position:absolute;margin-left:257.45pt;margin-top:9.65pt;width:1in;height:23.5pt;z-index:251779072;visibility:visible;mso-wrap-style:none;mso-height-percent:0;mso-wrap-distance-left:9pt;mso-wrap-distance-top:0;mso-wrap-distance-right:9pt;mso-wrap-distance-bottom:0;mso-position-horizontal:absolute;mso-position-horizontal-relative:text;mso-position-vertical:absolute;mso-position-vertical-relative:text;mso-height-percent:0;mso-height-relative:margin;v-text-anchor:top" o:gfxdata="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" filled="f" stroked="f">
+              <v:shape w14:anchorId="6D8BE845" id="Cuadro de texto 103800735" o:spid="_x0000_s1084" type="#_x0000_t202" style="position:absolute;margin-left:257.45pt;margin-top:9.65pt;width:1in;height:23.5pt;z-index:251779072;visibility:visible;mso-wrap-style:none;mso-height-percent:0;mso-wrap-distance-left:9pt;mso-wrap-distance-top:0;mso-wrap-distance-right:9pt;mso-wrap-distance-bottom:0;mso-position-horizontal:absolute;mso-position-horizontal-relative:text;mso-position-vertical:absolute;mso-position-vertical-relative:text;mso-height-percent:0;mso-height-relative:margin;v-text-anchor:top" o:gfxdata="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" filled="f" stroked="f">
                 <v:textbox>
                   <w:txbxContent>
                     <w:p>
@@ -20950,7 +20661,7 @@
                     <pic:cNvPicPr/>
                   </pic:nvPicPr>
                   <pic:blipFill>
-                    <a:blip r:embed="rId21"/>
+                    <a:blip r:embed="rId19"/>
                     <a:stretch>
                       <a:fillRect/>
                     </a:stretch>
@@ -21346,7 +21057,7 @@
           </mc:Choice>
           <mc:Fallback>
             <w:pict>
-              <v:shape w14:anchorId="2825CEC8" id="Cuadro de texto 438739056" o:spid="_x0000_s1085" type="#_x0000_t202" style="position:absolute;margin-left:209.25pt;margin-top:53.4pt;width:1in;height:18.3pt;z-index:251881472;visibility:visible;mso-wrap-style:none;mso-height-percent:0;mso-wrap-distance-left:9pt;mso-wrap-distance-top:0;mso-wrap-distance-right:9pt;mso-wrap-distance-bottom:0;mso-position-horizontal:absolute;mso-position-horizontal-relative:text;mso-position-vertical:absolute;mso-position-vertical-relative:text;mso-height-percent:0;mso-height-relative:margin;v-text-anchor:top" o:gfxdata="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" filled="f" stroked="f">
+              <v:shape w14:anchorId="2825CEC8" id="Cuadro de texto 438739056" o:spid="_x0000_s1085" type="#_x0000_t202" style="position:absolute;margin-left:209.25pt;margin-top:53.4pt;width:1in;height:18.3pt;z-index:251881472;visibility:visible;mso-wrap-style:none;mso-height-percent:0;mso-wrap-distance-left:9pt;mso-wrap-distance-top:0;mso-wrap-distance-right:9pt;mso-wrap-distance-bottom:0;mso-position-horizontal:absolute;mso-position-horizontal-relative:text;mso-position-vertical:absolute;mso-position-vertical-relative:text;mso-height-percent:0;mso-height-relative:margin;v-text-anchor:top" o:gfxdata="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" filled="f" stroked="f">
                 <v:textbox>
                   <w:txbxContent>
                     <w:p>
@@ -21454,7 +21165,7 @@
           </mc:Choice>
           <mc:Fallback>
             <w:pict>
-              <v:shape w14:anchorId="7EA91B45" id="Cuadro de texto 438739055" o:spid="_x0000_s1086" type="#_x0000_t202" style="position:absolute;margin-left:133.4pt;margin-top:36.35pt;width:1in;height:18.3pt;z-index:251879424;visibility:visible;mso-wrap-style:none;mso-height-percent:0;mso-wrap-distance-left:9pt;mso-wrap-distance-top:0;mso-wrap-distance-right:9pt;mso-wrap-distance-bottom:0;mso-position-horizontal:absolute;mso-position-horizontal-relative:text;mso-position-vertical:absolute;mso-position-vertical-relative:text;mso-height-percent:0;mso-height-relative:margin;v-text-anchor:top" o:gfxdata="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" filled="f" stroked="f">
+              <v:shape w14:anchorId="7EA91B45" id="Cuadro de texto 438739055" o:spid="_x0000_s1086" type="#_x0000_t202" style="position:absolute;margin-left:133.4pt;margin-top:36.35pt;width:1in;height:18.3pt;z-index:251879424;visibility:visible;mso-wrap-style:none;mso-height-percent:0;mso-wrap-distance-left:9pt;mso-wrap-distance-top:0;mso-wrap-distance-right:9pt;mso-wrap-distance-bottom:0;mso-position-horizontal:absolute;mso-position-horizontal-relative:text;mso-position-vertical:absolute;mso-position-vertical-relative:text;mso-height-percent:0;mso-height-relative:margin;v-text-anchor:top" o:gfxdata="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" filled="f" stroked="f">
                 <v:textbox>
                   <w:txbxContent>
                     <w:p>
@@ -21578,7 +21289,7 @@
                                           </pic:cNvPicPr>
                                         </pic:nvPicPr>
                                         <pic:blipFill>
-                                          <a:blip r:embed="rId19">
+                                          <a:blip r:embed="rId18">
                                             <a:extLst>
                                               <a:ext uri="{28A0092B-C50C-407E-A947-70E740481C1C}">
                                                 <a14:useLocalDpi xmlns:a14="http://schemas.microsoft.com/office/drawing/2010/main" val="0"/>
@@ -21632,7 +21343,7 @@
           </mc:Choice>
           <mc:Fallback>
             <w:pict>
-              <v:shape w14:anchorId="4BFAB92D" id="Cuadro de texto 438739053" o:spid="_x0000_s1087" type="#_x0000_t202" style="position:absolute;margin-left:402.95pt;margin-top:72.6pt;width:18.5pt;height:22pt;z-index:251878400;visibility:visible;mso-wrap-style:square;mso-width-percent:0;mso-height-percent:0;mso-wrap-distance-left:9pt;mso-wrap-distance-top:0;mso-wrap-distance-right:9pt;mso-wrap-distance-bottom:0;mso-position-horizontal:absolute;mso-position-horizontal-relative:text;mso-position-vertical:absolute;mso-position-vertical-relative:text;mso-width-percent:0;mso-height-percent:0;mso-width-relative:margin;mso-height-relative:margin;v-text-anchor:top" o:gfxdata="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" filled="f" stroked="f">
+              <v:shape w14:anchorId="4BFAB92D" id="Cuadro de texto 438739053" o:spid="_x0000_s1087" type="#_x0000_t202" style="position:absolute;margin-left:402.95pt;margin-top:72.6pt;width:18.5pt;height:22pt;z-index:251878400;visibility:visible;mso-wrap-style:square;mso-width-percent:0;mso-height-percent:0;mso-wrap-distance-left:9pt;mso-wrap-distance-top:0;mso-wrap-distance-right:9pt;mso-wrap-distance-bottom:0;mso-position-horizontal:absolute;mso-position-horizontal-relative:text;mso-position-vertical:absolute;mso-position-vertical-relative:text;mso-width-percent:0;mso-height-percent:0;mso-width-relative:margin;mso-height-relative:margin;v-text-anchor:top" o:gfxdata="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" filled="f" stroked="f">
                 <v:textbox>
                   <w:txbxContent>
                     <w:p>
@@ -21683,7 +21394,7 @@
                                     </pic:cNvPicPr>
                                   </pic:nvPicPr>
                                   <pic:blipFill>
-                                    <a:blip r:embed="rId20">
+                                    <a:blip r:embed="rId18">
                                       <a:extLst>
                                         <a:ext uri="{28A0092B-C50C-407E-A947-70E740481C1C}">
                                           <a14:useLocalDpi xmlns:a14="http://schemas.microsoft.com/office/drawing/2010/main" val="0"/>
@@ -21823,7 +21534,7 @@
                                           </pic:cNvPicPr>
                                         </pic:nvPicPr>
                                         <pic:blipFill>
-                                          <a:blip r:embed="rId19">
+                                          <a:blip r:embed="rId18">
                                             <a:extLst>
                                               <a:ext uri="{28A0092B-C50C-407E-A947-70E740481C1C}">
                                                 <a14:useLocalDpi xmlns:a14="http://schemas.microsoft.com/office/drawing/2010/main" val="0"/>
@@ -21877,7 +21588,7 @@
           </mc:Choice>
           <mc:Fallback>
             <w:pict>
-              <v:shape w14:anchorId="01524E56" id="Cuadro de texto 438739051" o:spid="_x0000_s1088" type="#_x0000_t202" style="position:absolute;margin-left:340.45pt;margin-top:74.6pt;width:18.5pt;height:22pt;z-index:251876352;visibility:visible;mso-wrap-style:square;mso-width-percent:0;mso-height-percent:0;mso-wrap-distance-left:9pt;mso-wrap-distance-top:0;mso-wrap-distance-right:9pt;mso-wrap-distance-bottom:0;mso-position-horizontal:absolute;mso-position-horizontal-relative:text;mso-position-vertical:absolute;mso-position-vertical-relative:text;mso-width-percent:0;mso-height-percent:0;mso-width-relative:margin;mso-height-relative:margin;v-text-anchor:top" o:gfxdata="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" filled="f" stroked="f">
+              <v:shape w14:anchorId="01524E56" id="Cuadro de texto 438739051" o:spid="_x0000_s1088" type="#_x0000_t202" style="position:absolute;margin-left:340.45pt;margin-top:74.6pt;width:18.5pt;height:22pt;z-index:251876352;visibility:visible;mso-wrap-style:square;mso-width-percent:0;mso-height-percent:0;mso-wrap-distance-left:9pt;mso-wrap-distance-top:0;mso-wrap-distance-right:9pt;mso-wrap-distance-bottom:0;mso-position-horizontal:absolute;mso-position-horizontal-relative:text;mso-position-vertical:absolute;mso-position-vertical-relative:text;mso-width-percent:0;mso-height-percent:0;mso-width-relative:margin;mso-height-relative:margin;v-text-anchor:top" o:gfxdata="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" filled="f" stroked="f">
                 <v:textbox>
                   <w:txbxContent>
                     <w:p>
@@ -21928,7 +21639,7 @@
                                     </pic:cNvPicPr>
                                   </pic:nvPicPr>
                                   <pic:blipFill>
-                                    <a:blip r:embed="rId20">
+                                    <a:blip r:embed="rId18">
                                       <a:extLst>
                                         <a:ext uri="{28A0092B-C50C-407E-A947-70E740481C1C}">
                                           <a14:useLocalDpi xmlns:a14="http://schemas.microsoft.com/office/drawing/2010/main" val="0"/>
@@ -22068,7 +21779,7 @@
                                           </pic:cNvPicPr>
                                         </pic:nvPicPr>
                                         <pic:blipFill>
-                                          <a:blip r:embed="rId19">
+                                          <a:blip r:embed="rId18">
                                             <a:extLst>
                                               <a:ext uri="{28A0092B-C50C-407E-A947-70E740481C1C}">
                                                 <a14:useLocalDpi xmlns:a14="http://schemas.microsoft.com/office/drawing/2010/main" val="0"/>
@@ -22122,7 +21833,7 @@
           </mc:Choice>
           <mc:Fallback>
             <w:pict>
-              <v:shape w14:anchorId="6FDDA49F" id="Cuadro de texto 438739029" o:spid="_x0000_s1089" type="#_x0000_t202" style="position:absolute;margin-left:402.45pt;margin-top:55.6pt;width:18.5pt;height:22pt;z-index:251857920;visibility:visible;mso-wrap-style:square;mso-width-percent:0;mso-height-percent:0;mso-wrap-distance-left:9pt;mso-wrap-distance-top:0;mso-wrap-distance-right:9pt;mso-wrap-distance-bottom:0;mso-position-horizontal:absolute;mso-position-horizontal-relative:text;mso-position-vertical:absolute;mso-position-vertical-relative:text;mso-width-percent:0;mso-height-percent:0;mso-width-relative:margin;mso-height-relative:margin;v-text-anchor:top" o:gfxdata="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" filled="f" stroked="f">
+              <v:shape w14:anchorId="6FDDA49F" id="Cuadro de texto 438739029" o:spid="_x0000_s1089" type="#_x0000_t202" style="position:absolute;margin-left:402.45pt;margin-top:55.6pt;width:18.5pt;height:22pt;z-index:251857920;visibility:visible;mso-wrap-style:square;mso-width-percent:0;mso-height-percent:0;mso-wrap-distance-left:9pt;mso-wrap-distance-top:0;mso-wrap-distance-right:9pt;mso-wrap-distance-bottom:0;mso-position-horizontal:absolute;mso-position-horizontal-relative:text;mso-position-vertical:absolute;mso-position-vertical-relative:text;mso-width-percent:0;mso-height-percent:0;mso-width-relative:margin;mso-height-relative:margin;v-text-anchor:top" o:gfxdata="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" filled="f" stroked="f">
                 <v:textbox>
                   <w:txbxContent>
                     <w:p>
@@ -22173,7 +21884,7 @@
                                     </pic:cNvPicPr>
                                   </pic:nvPicPr>
                                   <pic:blipFill>
-                                    <a:blip r:embed="rId20">
+                                    <a:blip r:embed="rId18">
                                       <a:extLst>
                                         <a:ext uri="{28A0092B-C50C-407E-A947-70E740481C1C}">
                                           <a14:useLocalDpi xmlns:a14="http://schemas.microsoft.com/office/drawing/2010/main" val="0"/>
@@ -22313,7 +22024,7 @@
                                           </pic:cNvPicPr>
                                         </pic:nvPicPr>
                                         <pic:blipFill>
-                                          <a:blip r:embed="rId19">
+                                          <a:blip r:embed="rId18">
                                             <a:extLst>
                                               <a:ext uri="{28A0092B-C50C-407E-A947-70E740481C1C}">
                                                 <a14:useLocalDpi xmlns:a14="http://schemas.microsoft.com/office/drawing/2010/main" val="0"/>
@@ -22367,7 +22078,7 @@
           </mc:Choice>
           <mc:Fallback>
             <w:pict>
-              <v:shape w14:anchorId="60F02E35" id="Cuadro de texto 438739027" o:spid="_x0000_s1090" type="#_x0000_t202" style="position:absolute;margin-left:340.95pt;margin-top:51.6pt;width:18.5pt;height:22pt;z-index:251855872;visibility:visible;mso-wrap-style:square;mso-width-percent:0;mso-height-percent:0;mso-wrap-distance-left:9pt;mso-wrap-distance-top:0;mso-wrap-distance-right:9pt;mso-wrap-distance-bottom:0;mso-position-horizontal:absolute;mso-position-horizontal-relative:text;mso-position-vertical:absolute;mso-position-vertical-relative:text;mso-width-percent:0;mso-height-percent:0;mso-width-relative:margin;mso-height-relative:margin;v-text-anchor:top" o:gfxdata="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" filled="f" stroked="f">
+              <v:shape w14:anchorId="60F02E35" id="Cuadro de texto 438739027" o:spid="_x0000_s1090" type="#_x0000_t202" style="position:absolute;margin-left:340.95pt;margin-top:51.6pt;width:18.5pt;height:22pt;z-index:251855872;visibility:visible;mso-wrap-style:square;mso-width-percent:0;mso-height-percent:0;mso-wrap-distance-left:9pt;mso-wrap-distance-top:0;mso-wrap-distance-right:9pt;mso-wrap-distance-bottom:0;mso-position-horizontal:absolute;mso-position-horizontal-relative:text;mso-position-vertical:absolute;mso-position-vertical-relative:text;mso-width-percent:0;mso-height-percent:0;mso-width-relative:margin;mso-height-relative:margin;v-text-anchor:top" o:gfxdata="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" filled="f" stroked="f">
                 <v:textbox>
                   <w:txbxContent>
                     <w:p>
@@ -22418,7 +22129,7 @@
                                     </pic:cNvPicPr>
                                   </pic:nvPicPr>
                                   <pic:blipFill>
-                                    <a:blip r:embed="rId20">
+                                    <a:blip r:embed="rId18">
                                       <a:extLst>
                                         <a:ext uri="{28A0092B-C50C-407E-A947-70E740481C1C}">
                                           <a14:useLocalDpi xmlns:a14="http://schemas.microsoft.com/office/drawing/2010/main" val="0"/>
@@ -22562,7 +22273,7 @@
           </mc:Choice>
           <mc:Fallback>
             <w:pict>
-              <v:shape w14:anchorId="01FCA0E1" id="Cuadro de texto 438739016" o:spid="_x0000_s1091" type="#_x0000_t202" style="position:absolute;margin-left:338.7pt;margin-top:42.1pt;width:1in;height:23.5pt;z-index:251835392;visibility:visible;mso-wrap-style:none;mso-height-percent:0;mso-wrap-distance-left:9pt;mso-wrap-distance-top:0;mso-wrap-distance-right:9pt;mso-wrap-distance-bottom:0;mso-position-horizontal:absolute;mso-position-horizontal-relative:text;mso-position-vertical:absolute;mso-position-vertical-relative:text;mso-height-percent:0;mso-height-relative:margin;v-text-anchor:top" o:gfxdata="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" filled="f" stroked="f">
+              <v:shape w14:anchorId="01FCA0E1" id="Cuadro de texto 438739016" o:spid="_x0000_s1091" type="#_x0000_t202" style="position:absolute;margin-left:338.7pt;margin-top:42.1pt;width:1in;height:23.5pt;z-index:251835392;visibility:visible;mso-wrap-style:none;mso-height-percent:0;mso-wrap-distance-left:9pt;mso-wrap-distance-top:0;mso-wrap-distance-right:9pt;mso-wrap-distance-bottom:0;mso-position-horizontal:absolute;mso-position-horizontal-relative:text;mso-position-vertical:absolute;mso-position-vertical-relative:text;mso-height-percent:0;mso-height-relative:margin;v-text-anchor:top" o:gfxdata="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" filled="f" stroked="f">
                 <v:textbox>
                   <w:txbxContent>
                     <w:p>
@@ -22710,7 +22421,7 @@
           </mc:Choice>
           <mc:Fallback>
             <w:pict>
-              <v:shape w14:anchorId="7D1B3368" id="Cuadro de texto 438739015" o:spid="_x0000_s1092" type="#_x0000_t202" style="position:absolute;margin-left:408.45pt;margin-top:34.6pt;width:1in;height:23.5pt;z-index:251833344;visibility:visible;mso-wrap-style:none;mso-height-percent:0;mso-wrap-distance-left:9pt;mso-wrap-distance-top:0;mso-wrap-distance-right:9pt;mso-wrap-distance-bottom:0;mso-position-horizontal:absolute;mso-position-horizontal-relative:text;mso-position-vertical:absolute;mso-position-vertical-relative:text;mso-height-percent:0;mso-height-relative:margin;v-text-anchor:top" o:gfxdata="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" filled="f" stroked="f">
+              <v:shape w14:anchorId="7D1B3368" id="Cuadro de texto 438739015" o:spid="_x0000_s1092" type="#_x0000_t202" style="position:absolute;margin-left:408.45pt;margin-top:34.6pt;width:1in;height:23.5pt;z-index:251833344;visibility:visible;mso-wrap-style:none;mso-height-percent:0;mso-wrap-distance-left:9pt;mso-wrap-distance-top:0;mso-wrap-distance-right:9pt;mso-wrap-distance-bottom:0;mso-position-horizontal:absolute;mso-position-horizontal-relative:text;mso-position-vertical:absolute;mso-position-vertical-relative:text;mso-height-percent:0;mso-height-relative:margin;v-text-anchor:top" o:gfxdata="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" filled="f" stroked="f">
                 <v:textbox>
                   <w:txbxContent>
                     <w:p>
@@ -22990,7 +22701,7 @@
           </mc:Choice>
           <mc:Fallback>
             <w:pict>
-              <v:shape w14:anchorId="1BECF3E1" id="Cuadro de texto 438739011" o:spid="_x0000_s1093" type="#_x0000_t202" style="position:absolute;margin-left:307.95pt;margin-top:8.1pt;width:1in;height:23.5pt;z-index:251829248;visibility:visible;mso-wrap-style:none;mso-height-percent:0;mso-wrap-distance-left:9pt;mso-wrap-distance-top:0;mso-wrap-distance-right:9pt;mso-wrap-distance-bottom:0;mso-position-horizontal:absolute;mso-position-horizontal-relative:text;mso-position-vertical:absolute;mso-position-vertical-relative:text;mso-height-percent:0;mso-height-relative:margin;v-text-anchor:top" o:gfxdata="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" filled="f" stroked="f">
+              <v:shape w14:anchorId="1BECF3E1" id="Cuadro de texto 438739011" o:spid="_x0000_s1093" type="#_x0000_t202" style="position:absolute;margin-left:307.95pt;margin-top:8.1pt;width:1in;height:23.5pt;z-index:251829248;visibility:visible;mso-wrap-style:none;mso-height-percent:0;mso-wrap-distance-left:9pt;mso-wrap-distance-top:0;mso-wrap-distance-right:9pt;mso-wrap-distance-bottom:0;mso-position-horizontal:absolute;mso-position-horizontal-relative:text;mso-position-vertical:absolute;mso-position-vertical-relative:text;mso-height-percent:0;mso-height-relative:margin;v-text-anchor:top" o:gfxdata="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" filled="f" stroked="f">
                 <v:textbox>
                   <w:txbxContent>
                     <w:p>
@@ -23211,7 +22922,7 @@
                                           </pic:cNvPicPr>
                                         </pic:nvPicPr>
                                         <pic:blipFill>
-                                          <a:blip r:embed="rId19">
+                                          <a:blip r:embed="rId18">
                                             <a:extLst>
                                               <a:ext uri="{28A0092B-C50C-407E-A947-70E740481C1C}">
                                                 <a14:useLocalDpi xmlns:a14="http://schemas.microsoft.com/office/drawing/2010/main" val="0"/>
@@ -23265,7 +22976,7 @@
           </mc:Choice>
           <mc:Fallback>
             <w:pict>
-              <v:shape w14:anchorId="54634734" id="Cuadro de texto 103800757" o:spid="_x0000_s1094" type="#_x0000_t202" style="position:absolute;margin-left:401.95pt;margin-top:63.6pt;width:31.5pt;height:29.5pt;z-index:251813888;visibility:visible;mso-wrap-style:square;mso-width-percent:0;mso-height-percent:0;mso-wrap-distance-left:9pt;mso-wrap-distance-top:0;mso-wrap-distance-right:9pt;mso-wrap-distance-bottom:0;mso-position-horizontal:absolute;mso-position-horizontal-relative:text;mso-position-vertical:absolute;mso-position-vertical-relative:text;mso-width-percent:0;mso-height-percent:0;mso-width-relative:margin;mso-height-relative:margin;v-text-anchor:top" o:gfxdata="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" filled="f" stroked="f">
+              <v:shape w14:anchorId="54634734" id="Cuadro de texto 103800757" o:spid="_x0000_s1094" type="#_x0000_t202" style="position:absolute;margin-left:401.95pt;margin-top:63.6pt;width:31.5pt;height:29.5pt;z-index:251813888;visibility:visible;mso-wrap-style:square;mso-width-percent:0;mso-height-percent:0;mso-wrap-distance-left:9pt;mso-wrap-distance-top:0;mso-wrap-distance-right:9pt;mso-wrap-distance-bottom:0;mso-position-horizontal:absolute;mso-position-horizontal-relative:text;mso-position-vertical:absolute;mso-position-vertical-relative:text;mso-width-percent:0;mso-height-percent:0;mso-width-relative:margin;mso-height-relative:margin;v-text-anchor:top" o:gfxdata="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" filled="f" stroked="f">
                 <v:textbox>
                   <w:txbxContent>
                     <w:p>
@@ -23327,7 +23038,7 @@
                                     </pic:cNvPicPr>
                                   </pic:nvPicPr>
                                   <pic:blipFill>
-                                    <a:blip r:embed="rId20">
+                                    <a:blip r:embed="rId18">
                                       <a:extLst>
                                         <a:ext uri="{28A0092B-C50C-407E-A947-70E740481C1C}">
                                           <a14:useLocalDpi xmlns:a14="http://schemas.microsoft.com/office/drawing/2010/main" val="0"/>
@@ -23474,7 +23185,7 @@
           </mc:Choice>
           <mc:Fallback>
             <w:pict>
-              <v:shape w14:anchorId="3D28AD2B" id="Cuadro de texto 103800755" o:spid="_x0000_s1095" type="#_x0000_t202" style="position:absolute;margin-left:339.95pt;margin-top:65.6pt;width:31.5pt;height:29.5pt;z-index:251811840;visibility:visible;mso-wrap-style:square;mso-width-percent:0;mso-height-percent:0;mso-wrap-distance-left:9pt;mso-wrap-distance-top:0;mso-wrap-distance-right:9pt;mso-wrap-distance-bottom:0;mso-position-horizontal:absolute;mso-position-horizontal-relative:text;mso-position-vertical:absolute;mso-position-vertical-relative:text;mso-width-percent:0;mso-height-percent:0;mso-width-relative:margin;mso-height-relative:margin;v-text-anchor:top" o:gfxdata="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" filled="f" stroked="f">
+              <v:shape w14:anchorId="3D28AD2B" id="Cuadro de texto 103800755" o:spid="_x0000_s1095" type="#_x0000_t202" style="position:absolute;margin-left:339.95pt;margin-top:65.6pt;width:31.5pt;height:29.5pt;z-index:251811840;visibility:visible;mso-wrap-style:square;mso-width-percent:0;mso-height-percent:0;mso-wrap-distance-left:9pt;mso-wrap-distance-top:0;mso-wrap-distance-right:9pt;mso-wrap-distance-bottom:0;mso-position-horizontal:absolute;mso-position-horizontal-relative:text;mso-position-vertical:absolute;mso-position-vertical-relative:text;mso-width-percent:0;mso-height-percent:0;mso-width-relative:margin;mso-height-relative:margin;v-text-anchor:top" o:gfxdata="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" filled="f" stroked="f">
                 <v:textbox>
                   <w:txbxContent>
                     <w:p>
@@ -23622,7 +23333,7 @@
           </mc:Choice>
           <mc:Fallback>
             <w:pict>
-              <v:shape w14:anchorId="4FF904CC" id="Cuadro de texto 103800752" o:spid="_x0000_s1096" type="#_x0000_t202" style="position:absolute;margin-left:269.95pt;margin-top:9.6pt;width:1in;height:23.5pt;z-index:251805696;visibility:visible;mso-wrap-style:none;mso-height-percent:0;mso-wrap-distance-left:9pt;mso-wrap-distance-top:0;mso-wrap-distance-right:9pt;mso-wrap-distance-bottom:0;mso-position-horizontal:absolute;mso-position-horizontal-relative:text;mso-position-vertical:absolute;mso-position-vertical-relative:text;mso-height-percent:0;mso-height-relative:margin;v-text-anchor:top" o:gfxdata="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" filled="f" stroked="f">
+              <v:shape w14:anchorId="4FF904CC" id="Cuadro de texto 103800752" o:spid="_x0000_s1096" type="#_x0000_t202" style="position:absolute;margin-left:269.95pt;margin-top:9.6pt;width:1in;height:23.5pt;z-index:251805696;visibility:visible;mso-wrap-style:none;mso-height-percent:0;mso-wrap-distance-left:9pt;mso-wrap-distance-top:0;mso-wrap-distance-right:9pt;mso-wrap-distance-bottom:0;mso-position-horizontal:absolute;mso-position-horizontal-relative:text;mso-position-vertical:absolute;mso-position-vertical-relative:text;mso-height-percent:0;mso-height-relative:margin;v-text-anchor:top" o:gfxdata="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" filled="f" stroked="f">
                 <v:textbox>
                   <w:txbxContent>
                     <w:p>
@@ -23685,7 +23396,7 @@
                     <pic:cNvPicPr/>
                   </pic:nvPicPr>
                   <pic:blipFill>
-                    <a:blip r:embed="rId22"/>
+                    <a:blip r:embed="rId20"/>
                     <a:stretch>
                       <a:fillRect/>
                     </a:stretch>
@@ -24068,7 +23779,7 @@
                                           </pic:cNvPicPr>
                                         </pic:nvPicPr>
                                         <pic:blipFill>
-                                          <a:blip r:embed="rId19">
+                                          <a:blip r:embed="rId18">
                                             <a:extLst>
                                               <a:ext uri="{28A0092B-C50C-407E-A947-70E740481C1C}">
                                                 <a14:useLocalDpi xmlns:a14="http://schemas.microsoft.com/office/drawing/2010/main" val="0"/>
@@ -24122,7 +23833,7 @@
           </mc:Choice>
           <mc:Fallback>
             <w:pict>
-              <v:shape w14:anchorId="35255680" id="Cuadro de texto 438739035" o:spid="_x0000_s1097" type="#_x0000_t202" style="position:absolute;margin-left:414.95pt;margin-top:86.5pt;width:18.5pt;height:22pt;z-index:251864064;visibility:visible;mso-wrap-style:square;mso-width-percent:0;mso-height-percent:0;mso-wrap-distance-left:9pt;mso-wrap-distance-top:0;mso-wrap-distance-right:9pt;mso-wrap-distance-bottom:0;mso-position-horizontal:absolute;mso-position-horizontal-relative:text;mso-position-vertical:absolute;mso-position-vertical-relative:text;mso-width-percent:0;mso-height-percent:0;mso-width-relative:margin;mso-height-relative:margin;v-text-anchor:top" o:gfxdata="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" filled="f" stroked="f">
+              <v:shape w14:anchorId="35255680" id="Cuadro de texto 438739035" o:spid="_x0000_s1097" type="#_x0000_t202" style="position:absolute;margin-left:414.95pt;margin-top:86.5pt;width:18.5pt;height:22pt;z-index:251864064;visibility:visible;mso-wrap-style:square;mso-width-percent:0;mso-height-percent:0;mso-wrap-distance-left:9pt;mso-wrap-distance-top:0;mso-wrap-distance-right:9pt;mso-wrap-distance-bottom:0;mso-position-horizontal:absolute;mso-position-horizontal-relative:text;mso-position-vertical:absolute;mso-position-vertical-relative:text;mso-width-percent:0;mso-height-percent:0;mso-width-relative:margin;mso-height-relative:margin;v-text-anchor:top" o:gfxdata="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" filled="f" stroked="f">
                 <v:textbox>
                   <w:txbxContent>
                     <w:p>
@@ -24173,7 +23884,7 @@
                                     </pic:cNvPicPr>
                                   </pic:nvPicPr>
                                   <pic:blipFill>
-                                    <a:blip r:embed="rId20">
+                                    <a:blip r:embed="rId18">
                                       <a:extLst>
                                         <a:ext uri="{28A0092B-C50C-407E-A947-70E740481C1C}">
                                           <a14:useLocalDpi xmlns:a14="http://schemas.microsoft.com/office/drawing/2010/main" val="0"/>
@@ -24313,7 +24024,7 @@
                                           </pic:cNvPicPr>
                                         </pic:nvPicPr>
                                         <pic:blipFill>
-                                          <a:blip r:embed="rId19">
+                                          <a:blip r:embed="rId18">
                                             <a:extLst>
                                               <a:ext uri="{28A0092B-C50C-407E-A947-70E740481C1C}">
                                                 <a14:useLocalDpi xmlns:a14="http://schemas.microsoft.com/office/drawing/2010/main" val="0"/>
@@ -24367,7 +24078,7 @@
           </mc:Choice>
           <mc:Fallback>
             <w:pict>
-              <v:shape w14:anchorId="310F5BE8" id="Cuadro de texto 438739037" o:spid="_x0000_s1098" type="#_x0000_t202" style="position:absolute;margin-left:354.45pt;margin-top:87.5pt;width:18.5pt;height:22pt;z-index:251866112;visibility:visible;mso-wrap-style:square;mso-width-percent:0;mso-height-percent:0;mso-wrap-distance-left:9pt;mso-wrap-distance-top:0;mso-wrap-distance-right:9pt;mso-wrap-distance-bottom:0;mso-position-horizontal:absolute;mso-position-horizontal-relative:text;mso-position-vertical:absolute;mso-position-vertical-relative:text;mso-width-percent:0;mso-height-percent:0;mso-width-relative:margin;mso-height-relative:margin;v-text-anchor:top" o:gfxdata="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" filled="f" stroked="f">
+              <v:shape w14:anchorId="310F5BE8" id="Cuadro de texto 438739037" o:spid="_x0000_s1098" type="#_x0000_t202" style="position:absolute;margin-left:354.45pt;margin-top:87.5pt;width:18.5pt;height:22pt;z-index:251866112;visibility:visible;mso-wrap-style:square;mso-width-percent:0;mso-height-percent:0;mso-wrap-distance-left:9pt;mso-wrap-distance-top:0;mso-wrap-distance-right:9pt;mso-wrap-distance-bottom:0;mso-position-horizontal:absolute;mso-position-horizontal-relative:text;mso-position-vertical:absolute;mso-position-vertical-relative:text;mso-width-percent:0;mso-height-percent:0;mso-width-relative:margin;mso-height-relative:margin;v-text-anchor:top" o:gfxdata="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" filled="f" stroked="f">
                 <v:textbox>
                   <w:txbxContent>
                     <w:p>
@@ -24418,7 +24129,7 @@
                                     </pic:cNvPicPr>
                                   </pic:nvPicPr>
                                   <pic:blipFill>
-                                    <a:blip r:embed="rId20">
+                                    <a:blip r:embed="rId18">
                                       <a:extLst>
                                         <a:ext uri="{28A0092B-C50C-407E-A947-70E740481C1C}">
                                           <a14:useLocalDpi xmlns:a14="http://schemas.microsoft.com/office/drawing/2010/main" val="0"/>
@@ -24558,7 +24269,7 @@
                                           </pic:cNvPicPr>
                                         </pic:nvPicPr>
                                         <pic:blipFill>
-                                          <a:blip r:embed="rId19">
+                                          <a:blip r:embed="rId18">
                                             <a:extLst>
                                               <a:ext uri="{28A0092B-C50C-407E-A947-70E740481C1C}">
                                                 <a14:useLocalDpi xmlns:a14="http://schemas.microsoft.com/office/drawing/2010/main" val="0"/>
@@ -24612,7 +24323,7 @@
           </mc:Choice>
           <mc:Fallback>
             <w:pict>
-              <v:shape w14:anchorId="1CE87ECD" id="Cuadro de texto 438739033" o:spid="_x0000_s1099" type="#_x0000_t202" style="position:absolute;margin-left:414.45pt;margin-top:69pt;width:18.5pt;height:22pt;z-index:251862016;visibility:visible;mso-wrap-style:square;mso-width-percent:0;mso-height-percent:0;mso-wrap-distance-left:9pt;mso-wrap-distance-top:0;mso-wrap-distance-right:9pt;mso-wrap-distance-bottom:0;mso-position-horizontal:absolute;mso-position-horizontal-relative:text;mso-position-vertical:absolute;mso-position-vertical-relative:text;mso-width-percent:0;mso-height-percent:0;mso-width-relative:margin;mso-height-relative:margin;v-text-anchor:top" o:gfxdata="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" filled="f" stroked="f">
+              <v:shape w14:anchorId="1CE87ECD" id="Cuadro de texto 438739033" o:spid="_x0000_s1099" type="#_x0000_t202" style="position:absolute;margin-left:414.45pt;margin-top:69pt;width:18.5pt;height:22pt;z-index:251862016;visibility:visible;mso-wrap-style:square;mso-width-percent:0;mso-height-percent:0;mso-wrap-distance-left:9pt;mso-wrap-distance-top:0;mso-wrap-distance-right:9pt;mso-wrap-distance-bottom:0;mso-position-horizontal:absolute;mso-position-horizontal-relative:text;mso-position-vertical:absolute;mso-position-vertical-relative:text;mso-width-percent:0;mso-height-percent:0;mso-width-relative:margin;mso-height-relative:margin;v-text-anchor:top" o:gfxdata="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" filled="f" stroked="f">
                 <v:textbox>
                   <w:txbxContent>
                     <w:p>
@@ -24663,7 +24374,7 @@
                                     </pic:cNvPicPr>
                                   </pic:nvPicPr>
                                   <pic:blipFill>
-                                    <a:blip r:embed="rId20">
+                                    <a:blip r:embed="rId18">
                                       <a:extLst>
                                         <a:ext uri="{28A0092B-C50C-407E-A947-70E740481C1C}">
                                           <a14:useLocalDpi xmlns:a14="http://schemas.microsoft.com/office/drawing/2010/main" val="0"/>
@@ -24803,7 +24514,7 @@
                                           </pic:cNvPicPr>
                                         </pic:nvPicPr>
                                         <pic:blipFill>
-                                          <a:blip r:embed="rId19">
+                                          <a:blip r:embed="rId18">
                                             <a:extLst>
                                               <a:ext uri="{28A0092B-C50C-407E-A947-70E740481C1C}">
                                                 <a14:useLocalDpi xmlns:a14="http://schemas.microsoft.com/office/drawing/2010/main" val="0"/>
@@ -24857,7 +24568,7 @@
           </mc:Choice>
           <mc:Fallback>
             <w:pict>
-              <v:shape w14:anchorId="3012EF86" id="Cuadro de texto 438739031" o:spid="_x0000_s1100" type="#_x0000_t202" style="position:absolute;margin-left:352.95pt;margin-top:68pt;width:18.5pt;height:22pt;z-index:251859968;visibility:visible;mso-wrap-style:square;mso-width-percent:0;mso-height-percent:0;mso-wrap-distance-left:9pt;mso-wrap-distance-top:0;mso-wrap-distance-right:9pt;mso-wrap-distance-bottom:0;mso-position-horizontal:absolute;mso-position-horizontal-relative:text;mso-position-vertical:absolute;mso-position-vertical-relative:text;mso-width-percent:0;mso-height-percent:0;mso-width-relative:margin;mso-height-relative:margin;v-text-anchor:top" o:gfxdata="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" filled="f" stroked="f">
+              <v:shape w14:anchorId="3012EF86" id="Cuadro de texto 438739031" o:spid="_x0000_s1100" type="#_x0000_t202" style="position:absolute;margin-left:352.95pt;margin-top:68pt;width:18.5pt;height:22pt;z-index:251859968;visibility:visible;mso-wrap-style:square;mso-width-percent:0;mso-height-percent:0;mso-wrap-distance-left:9pt;mso-wrap-distance-top:0;mso-wrap-distance-right:9pt;mso-wrap-distance-bottom:0;mso-position-horizontal:absolute;mso-position-horizontal-relative:text;mso-position-vertical:absolute;mso-position-vertical-relative:text;mso-width-percent:0;mso-height-percent:0;mso-width-relative:margin;mso-height-relative:margin;v-text-anchor:top" o:gfxdata="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" filled="f" stroked="f">
                 <v:textbox>
                   <w:txbxContent>
                     <w:p>
@@ -24908,7 +24619,7 @@
                                     </pic:cNvPicPr>
                                   </pic:nvPicPr>
                                   <pic:blipFill>
-                                    <a:blip r:embed="rId20">
+                                    <a:blip r:embed="rId18">
                                       <a:extLst>
                                         <a:ext uri="{28A0092B-C50C-407E-A947-70E740481C1C}">
                                           <a14:useLocalDpi xmlns:a14="http://schemas.microsoft.com/office/drawing/2010/main" val="0"/>
@@ -25052,7 +24763,7 @@
           </mc:Choice>
           <mc:Fallback>
             <w:pict>
-              <v:shape w14:anchorId="5A761326" id="Cuadro de texto 438739024" o:spid="_x0000_s1101" type="#_x0000_t202" style="position:absolute;margin-left:413.95pt;margin-top:44pt;width:1in;height:23.5pt;z-index:251849728;visibility:visible;mso-wrap-style:none;mso-height-percent:0;mso-wrap-distance-left:9pt;mso-wrap-distance-top:0;mso-wrap-distance-right:9pt;mso-wrap-distance-bottom:0;mso-position-horizontal:absolute;mso-position-horizontal-relative:text;mso-position-vertical:absolute;mso-position-vertical-relative:text;mso-height-percent:0;mso-height-relative:margin;v-text-anchor:top" o:gfxdata="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" filled="f" stroked="f">
+              <v:shape w14:anchorId="5A761326" id="Cuadro de texto 438739024" o:spid="_x0000_s1101" type="#_x0000_t202" style="position:absolute;margin-left:413.95pt;margin-top:44pt;width:1in;height:23.5pt;z-index:251849728;visibility:visible;mso-wrap-style:none;mso-height-percent:0;mso-wrap-distance-left:9pt;mso-wrap-distance-top:0;mso-wrap-distance-right:9pt;mso-wrap-distance-bottom:0;mso-position-horizontal:absolute;mso-position-horizontal-relative:text;mso-position-vertical:absolute;mso-position-vertical-relative:text;mso-height-percent:0;mso-height-relative:margin;v-text-anchor:top" o:gfxdata="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" filled="f" stroked="f">
                 <v:textbox>
                   <w:txbxContent>
                     <w:p>
@@ -25200,7 +24911,7 @@
           </mc:Choice>
           <mc:Fallback>
             <w:pict>
-              <v:shape w14:anchorId="2425238E" id="Cuadro de texto 438739023" o:spid="_x0000_s1102" type="#_x0000_t202" style="position:absolute;margin-left:349.95pt;margin-top:39.5pt;width:1in;height:23.5pt;z-index:251847680;visibility:visible;mso-wrap-style:none;mso-height-percent:0;mso-wrap-distance-left:9pt;mso-wrap-distance-top:0;mso-wrap-distance-right:9pt;mso-wrap-distance-bottom:0;mso-position-horizontal:absolute;mso-position-horizontal-relative:text;mso-position-vertical:absolute;mso-position-vertical-relative:text;mso-height-percent:0;mso-height-relative:margin;v-text-anchor:top" o:gfxdata="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" filled="f" stroked="f">
+              <v:shape w14:anchorId="2425238E" id="Cuadro de texto 438739023" o:spid="_x0000_s1102" type="#_x0000_t202" style="position:absolute;margin-left:349.95pt;margin-top:39.5pt;width:1in;height:23.5pt;z-index:251847680;visibility:visible;mso-wrap-style:none;mso-height-percent:0;mso-wrap-distance-left:9pt;mso-wrap-distance-top:0;mso-wrap-distance-right:9pt;mso-wrap-distance-bottom:0;mso-position-horizontal:absolute;mso-position-horizontal-relative:text;mso-position-vertical:absolute;mso-position-vertical-relative:text;mso-height-percent:0;mso-height-relative:margin;v-text-anchor:top" o:gfxdata="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" filled="f" stroked="f">
                 <v:textbox>
                   <w:txbxContent>
                     <w:p>
@@ -25480,7 +25191,7 @@
           </mc:Choice>
           <mc:Fallback>
             <w:pict>
-              <v:shape w14:anchorId="04EF35BA" id="Cuadro de texto 438739017" o:spid="_x0000_s1103" type="#_x0000_t202" style="position:absolute;margin-left:316.45pt;margin-top:10pt;width:1in;height:23.5pt;z-index:251837440;visibility:visible;mso-wrap-style:none;mso-height-percent:0;mso-wrap-distance-left:9pt;mso-wrap-distance-top:0;mso-wrap-distance-right:9pt;mso-wrap-distance-bottom:0;mso-position-horizontal:absolute;mso-position-horizontal-relative:text;mso-position-vertical:absolute;mso-position-vertical-relative:text;mso-height-percent:0;mso-height-relative:margin;v-text-anchor:top" o:gfxdata="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" filled="f" stroked="f">
+              <v:shape w14:anchorId="04EF35BA" id="Cuadro de texto 438739017" o:spid="_x0000_s1103" type="#_x0000_t202" style="position:absolute;margin-left:316.45pt;margin-top:10pt;width:1in;height:23.5pt;z-index:251837440;visibility:visible;mso-wrap-style:none;mso-height-percent:0;mso-wrap-distance-left:9pt;mso-wrap-distance-top:0;mso-wrap-distance-right:9pt;mso-wrap-distance-bottom:0;mso-position-horizontal:absolute;mso-position-horizontal-relative:text;mso-position-vertical:absolute;mso-position-vertical-relative:text;mso-height-percent:0;mso-height-relative:margin;v-text-anchor:top" o:gfxdata="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" filled="f" stroked="f">
                 <v:textbox>
                   <w:txbxContent>
                     <w:p>
@@ -25697,7 +25408,7 @@
           </mc:Choice>
           <mc:Fallback>
             <w:pict>
-              <v:shape w14:anchorId="7FC501F8" id="Cuadro de texto 103800761" o:spid="_x0000_s1104" type="#_x0000_t202" style="position:absolute;margin-left:412.95pt;margin-top:78pt;width:31.5pt;height:29.5pt;z-index:251817984;visibility:visible;mso-wrap-style:square;mso-width-percent:0;mso-height-percent:0;mso-wrap-distance-left:9pt;mso-wrap-distance-top:0;mso-wrap-distance-right:9pt;mso-wrap-distance-bottom:0;mso-position-horizontal:absolute;mso-position-horizontal-relative:text;mso-position-vertical:absolute;mso-position-vertical-relative:text;mso-width-percent:0;mso-height-percent:0;mso-width-relative:margin;mso-height-relative:margin;v-text-anchor:top" o:gfxdata="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" filled="f" stroked="f">
+              <v:shape w14:anchorId="7FC501F8" id="Cuadro de texto 103800761" o:spid="_x0000_s1104" type="#_x0000_t202" style="position:absolute;margin-left:412.95pt;margin-top:78pt;width:31.5pt;height:29.5pt;z-index:251817984;visibility:visible;mso-wrap-style:square;mso-width-percent:0;mso-height-percent:0;mso-wrap-distance-left:9pt;mso-wrap-distance-top:0;mso-wrap-distance-right:9pt;mso-wrap-distance-bottom:0;mso-position-horizontal:absolute;mso-position-horizontal-relative:text;mso-position-vertical:absolute;mso-position-vertical-relative:text;mso-width-percent:0;mso-height-percent:0;mso-width-relative:margin;mso-height-relative:margin;v-text-anchor:top" o:gfxdata="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" filled="f" stroked="f">
                 <v:textbox>
                   <w:txbxContent>
                     <w:p>
@@ -25848,7 +25559,7 @@
           </mc:Choice>
           <mc:Fallback>
             <w:pict>
-              <v:shape w14:anchorId="59233264" id="Cuadro de texto 103800759" o:spid="_x0000_s1105" type="#_x0000_t202" style="position:absolute;margin-left:352.45pt;margin-top:77pt;width:31.5pt;height:29.5pt;z-index:251815936;visibility:visible;mso-wrap-style:square;mso-width-percent:0;mso-height-percent:0;mso-wrap-distance-left:9pt;mso-wrap-distance-top:0;mso-wrap-distance-right:9pt;mso-wrap-distance-bottom:0;mso-position-horizontal:absolute;mso-position-horizontal-relative:text;mso-position-vertical:absolute;mso-position-vertical-relative:text;mso-width-percent:0;mso-height-percent:0;mso-width-relative:margin;mso-height-relative:margin;v-text-anchor:top" o:gfxdata="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" filled="f" stroked="f">
+              <v:shape w14:anchorId="59233264" id="Cuadro de texto 103800759" o:spid="_x0000_s1105" type="#_x0000_t202" style="position:absolute;margin-left:352.45pt;margin-top:77pt;width:31.5pt;height:29.5pt;z-index:251815936;visibility:visible;mso-wrap-style:square;mso-width-percent:0;mso-height-percent:0;mso-wrap-distance-left:9pt;mso-wrap-distance-top:0;mso-wrap-distance-right:9pt;mso-wrap-distance-bottom:0;mso-position-horizontal:absolute;mso-position-horizontal-relative:text;mso-position-vertical:absolute;mso-position-vertical-relative:text;mso-width-percent:0;mso-height-percent:0;mso-width-relative:margin;mso-height-relative:margin;v-text-anchor:top" o:gfxdata="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" filled="f" stroked="f">
                 <v:textbox>
                   <w:txbxContent>
                     <w:p>
@@ -25996,7 +25707,7 @@
           </mc:Choice>
           <mc:Fallback>
             <w:pict>
-              <v:shape w14:anchorId="1F0742AF" id="Cuadro de texto 103800753" o:spid="_x0000_s1106" type="#_x0000_t202" style="position:absolute;margin-left:269.95pt;margin-top:12pt;width:1in;height:23.5pt;z-index:251807744;visibility:visible;mso-wrap-style:none;mso-height-percent:0;mso-wrap-distance-left:9pt;mso-wrap-distance-top:0;mso-wrap-distance-right:9pt;mso-wrap-distance-bottom:0;mso-position-horizontal:absolute;mso-position-horizontal-relative:text;mso-position-vertical:absolute;mso-position-vertical-relative:text;mso-height-percent:0;mso-height-relative:margin;v-text-anchor:top" o:gfxdata="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" filled="f" stroked="f">
+              <v:shape w14:anchorId="1F0742AF" id="Cuadro de texto 103800753" o:spid="_x0000_s1106" type="#_x0000_t202" style="position:absolute;margin-left:269.95pt;margin-top:12pt;width:1in;height:23.5pt;z-index:251807744;visibility:visible;mso-wrap-style:none;mso-height-percent:0;mso-wrap-distance-left:9pt;mso-wrap-distance-top:0;mso-wrap-distance-right:9pt;mso-wrap-distance-bottom:0;mso-position-horizontal:absolute;mso-position-horizontal-relative:text;mso-position-vertical:absolute;mso-position-vertical-relative:text;mso-height-percent:0;mso-height-relative:margin;v-text-anchor:top" o:gfxdata="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" filled="f" stroked="f">
                 <v:textbox>
                   <w:txbxContent>
                     <w:p>
@@ -26059,7 +25770,7 @@
                     <pic:cNvPicPr/>
                   </pic:nvPicPr>
                   <pic:blipFill>
-                    <a:blip r:embed="rId23"/>
+                    <a:blip r:embed="rId21"/>
                     <a:stretch>
                       <a:fillRect/>
                     </a:stretch>
@@ -26389,32 +26100,14 @@
           <w:sz w:val="24"/>
           <w:szCs w:val="24"/>
         </w:rPr>
-        <w:t xml:space="preserve">De forma análoga a lo descrito previamente en el análisis del convertidor </w:t>
-      </w:r>
-      <w:proofErr w:type="spellStart"/>
-      <w:r>
-        <w:rPr>
-          <w:rFonts w:cstheme="minorHAnsi"/>
-          <w:sz w:val="24"/>
-          <w:szCs w:val="24"/>
-        </w:rPr>
-        <w:t>Boost</w:t>
-      </w:r>
-      <w:proofErr w:type="spellEnd"/>
-      <w:r>
-        <w:rPr>
-          <w:rFonts w:cstheme="minorHAnsi"/>
-          <w:sz w:val="24"/>
-          <w:szCs w:val="24"/>
-        </w:rPr>
-        <w:t>, durante este intervalo la fuente de entrada queda conectada directamente con el inductor y la etapa de salida, mientras que el diodo se encuentra polarizado en inversa. Bajo esta condición, la energía suministrada por la fuente es transferida al inductor y a la carga, mientras el capacitor contribuye al filtrado del voltaje de salida.</w:t>
+        <w:t>De forma análoga a lo descrito previamente en el análisis del convertidor Boost, durante este intervalo la fuente de entrada queda conectada directamente con el inductor y la etapa de salida, mientras que el diodo se encuentra polarizado en inversa. Bajo esta condición, la energía suministrada por la fuente es transferida al inductor y a la carga, mientras el capacitor contribuye al filtrado del voltaje de salida.</w:t>
       </w:r>
       <w:r>
         <w:t xml:space="preserve"> Aplicando la </w:t>
       </w:r>
       <w:r>
         <w:rPr>
-          <w:rStyle w:val="Textoennegrita"/>
+          <w:rStyle w:val="Fuerte"/>
           <w:b w:val="0"/>
           <w:bCs w:val="0"/>
         </w:rPr>
@@ -26422,13 +26115,13 @@
       </w:r>
       <w:r>
         <w:rPr>
-          <w:rStyle w:val="Textoennegrita"/>
+          <w:rStyle w:val="Fuerte"/>
         </w:rPr>
         <w:t xml:space="preserve"> </w:t>
       </w:r>
       <w:r>
         <w:rPr>
-          <w:rStyle w:val="Textoennegrita"/>
+          <w:rStyle w:val="Fuerte"/>
           <w:b w:val="0"/>
           <w:bCs w:val="0"/>
         </w:rPr>
@@ -26446,7 +26139,7 @@
       </w:r>
       <w:r>
         <w:rPr>
-          <w:rStyle w:val="Textoennegrita"/>
+          <w:rStyle w:val="Fuerte"/>
           <w:b w:val="0"/>
           <w:bCs w:val="0"/>
         </w:rPr>
@@ -27798,7 +27491,7 @@
           </mc:Choice>
           <mc:Fallback>
             <w:pict>
-              <v:shape w14:anchorId="199F1712" id="Cuadro de texto 1248200729" o:spid="_x0000_s1107" type="#_x0000_t202" style="position:absolute;margin-left:349.05pt;margin-top:38.8pt;width:1in;height:23.5pt;z-index:251907072;visibility:visible;mso-wrap-style:none;mso-height-percent:0;mso-wrap-distance-left:9pt;mso-wrap-distance-top:0;mso-wrap-distance-right:9pt;mso-wrap-distance-bottom:0;mso-position-horizontal:absolute;mso-position-horizontal-relative:text;mso-position-vertical:absolute;mso-position-vertical-relative:text;mso-height-percent:0;mso-height-relative:margin;v-text-anchor:top" o:gfxdata="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" filled="f" stroked="f">
+              <v:shape w14:anchorId="199F1712" id="Cuadro de texto 1248200729" o:spid="_x0000_s1107" type="#_x0000_t202" style="position:absolute;margin-left:349.05pt;margin-top:38.8pt;width:1in;height:23.5pt;z-index:251907072;visibility:visible;mso-wrap-style:none;mso-height-percent:0;mso-wrap-distance-left:9pt;mso-wrap-distance-top:0;mso-wrap-distance-right:9pt;mso-wrap-distance-bottom:0;mso-position-horizontal:absolute;mso-position-horizontal-relative:text;mso-position-vertical:absolute;mso-position-vertical-relative:text;mso-height-percent:0;mso-height-relative:margin;v-text-anchor:top" o:gfxdata="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" filled="f" stroked="f">
                 <v:textbox>
                   <w:txbxContent>
                     <w:p>
@@ -27946,7 +27639,7 @@
           </mc:Choice>
           <mc:Fallback>
             <w:pict>
-              <v:shape w14:anchorId="5FDC3D13" id="Cuadro de texto 1248200728" o:spid="_x0000_s1108" type="#_x0000_t202" style="position:absolute;margin-left:415.25pt;margin-top:42.15pt;width:1in;height:23.5pt;z-index:251905024;visibility:visible;mso-wrap-style:none;mso-height-percent:0;mso-wrap-distance-left:9pt;mso-wrap-distance-top:0;mso-wrap-distance-right:9pt;mso-wrap-distance-bottom:0;mso-position-horizontal:absolute;mso-position-horizontal-relative:text;mso-position-vertical:absolute;mso-position-vertical-relative:text;mso-height-percent:0;mso-height-relative:margin;v-text-anchor:top" o:gfxdata="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" filled="f" stroked="f">
+              <v:shape w14:anchorId="5FDC3D13" id="Cuadro de texto 1248200728" o:spid="_x0000_s1108" type="#_x0000_t202" style="position:absolute;margin-left:415.25pt;margin-top:42.15pt;width:1in;height:23.5pt;z-index:251905024;visibility:visible;mso-wrap-style:none;mso-height-percent:0;mso-wrap-distance-left:9pt;mso-wrap-distance-top:0;mso-wrap-distance-right:9pt;mso-wrap-distance-bottom:0;mso-position-horizontal:absolute;mso-position-horizontal-relative:text;mso-position-vertical:absolute;mso-position-vertical-relative:text;mso-height-percent:0;mso-height-relative:margin;v-text-anchor:top" o:gfxdata="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" filled="f" stroked="f">
                 <v:textbox>
                   <w:txbxContent>
                     <w:p>
@@ -28086,7 +27779,7 @@
           </mc:Choice>
           <mc:Fallback>
             <w:pict>
-              <v:shape w14:anchorId="218A271D" id="Cuadro de texto 1248200716" o:spid="_x0000_s1109" type="#_x0000_t202" style="position:absolute;margin-left:413.9pt;margin-top:89.2pt;width:18.5pt;height:23.25pt;z-index:251902976;visibility:visible;mso-wrap-style:square;mso-width-percent:0;mso-height-percent:0;mso-wrap-distance-left:9pt;mso-wrap-distance-top:0;mso-wrap-distance-right:9pt;mso-wrap-distance-bottom:0;mso-position-horizontal:absolute;mso-position-horizontal-relative:text;mso-position-vertical:absolute;mso-position-vertical-relative:text;mso-width-percent:0;mso-height-percent:0;mso-width-relative:margin;mso-height-relative:margin;v-text-anchor:top" o:gfxdata="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" filled="f" stroked="f">
+              <v:shape w14:anchorId="218A271D" id="Cuadro de texto 1248200716" o:spid="_x0000_s1109" type="#_x0000_t202" style="position:absolute;margin-left:413.9pt;margin-top:89.2pt;width:18.5pt;height:23.25pt;z-index:251902976;visibility:visible;mso-wrap-style:square;mso-width-percent:0;mso-height-percent:0;mso-wrap-distance-left:9pt;mso-wrap-distance-top:0;mso-wrap-distance-right:9pt;mso-wrap-distance-bottom:0;mso-position-horizontal:absolute;mso-position-horizontal-relative:text;mso-position-vertical:absolute;mso-position-vertical-relative:text;mso-width-percent:0;mso-height-percent:0;mso-width-relative:margin;mso-height-relative:margin;v-text-anchor:top" o:gfxdata="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" filled="f" stroked="f">
                 <v:textbox>
                   <w:txbxContent>
                     <w:p>
@@ -28219,7 +27912,7 @@
                                           </pic:cNvPicPr>
                                         </pic:nvPicPr>
                                         <pic:blipFill>
-                                          <a:blip r:embed="rId24">
+                                          <a:blip r:embed="rId22">
                                             <a:extLst>
                                               <a:ext uri="{28A0092B-C50C-407E-A947-70E740481C1C}">
                                                 <a14:useLocalDpi xmlns:a14="http://schemas.microsoft.com/office/drawing/2010/main" val="0"/>
@@ -28277,7 +27970,7 @@
                                           </pic:cNvPicPr>
                                         </pic:nvPicPr>
                                         <pic:blipFill>
-                                          <a:blip r:embed="rId19">
+                                          <a:blip r:embed="rId18">
                                             <a:extLst>
                                               <a:ext uri="{28A0092B-C50C-407E-A947-70E740481C1C}">
                                                 <a14:useLocalDpi xmlns:a14="http://schemas.microsoft.com/office/drawing/2010/main" val="0"/>
@@ -28331,7 +28024,7 @@
           </mc:Choice>
           <mc:Fallback>
             <w:pict>
-              <v:shape w14:anchorId="25F9922A" id="Cuadro de texto 1248200710" o:spid="_x0000_s1110" type="#_x0000_t202" style="position:absolute;margin-left:411.8pt;margin-top:64.55pt;width:18.5pt;height:22pt;z-index:251900928;visibility:visible;mso-wrap-style:square;mso-width-percent:0;mso-height-percent:0;mso-wrap-distance-left:9pt;mso-wrap-distance-top:0;mso-wrap-distance-right:9pt;mso-wrap-distance-bottom:0;mso-position-horizontal:absolute;mso-position-horizontal-relative:text;mso-position-vertical:absolute;mso-position-vertical-relative:text;mso-width-percent:0;mso-height-percent:0;mso-width-relative:margin;mso-height-relative:margin;v-text-anchor:top" o:gfxdata="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" filled="f" stroked="f">
+              <v:shape w14:anchorId="25F9922A" id="Cuadro de texto 1248200710" o:spid="_x0000_s1110" type="#_x0000_t202" style="position:absolute;margin-left:411.8pt;margin-top:64.55pt;width:18.5pt;height:22pt;z-index:251900928;visibility:visible;mso-wrap-style:square;mso-width-percent:0;mso-height-percent:0;mso-wrap-distance-left:9pt;mso-wrap-distance-top:0;mso-wrap-distance-right:9pt;mso-wrap-distance-bottom:0;mso-position-horizontal:absolute;mso-position-horizontal-relative:text;mso-position-vertical:absolute;mso-position-vertical-relative:text;mso-width-percent:0;mso-height-percent:0;mso-width-relative:margin;mso-height-relative:margin;v-text-anchor:top" o:gfxdata="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" filled="f" stroked="f">
                 <v:textbox>
                   <w:txbxContent>
                     <w:p>
@@ -28382,7 +28075,7 @@
                                     </pic:cNvPicPr>
                                   </pic:nvPicPr>
                                   <pic:blipFill>
-                                    <a:blip r:embed="rId25">
+                                    <a:blip r:embed="rId22">
                                       <a:extLst>
                                         <a:ext uri="{28A0092B-C50C-407E-A947-70E740481C1C}">
                                           <a14:useLocalDpi xmlns:a14="http://schemas.microsoft.com/office/drawing/2010/main" val="0"/>
@@ -28440,7 +28133,7 @@
                                     </pic:cNvPicPr>
                                   </pic:nvPicPr>
                                   <pic:blipFill>
-                                    <a:blip r:embed="rId20">
+                                    <a:blip r:embed="rId18">
                                       <a:extLst>
                                         <a:ext uri="{28A0092B-C50C-407E-A947-70E740481C1C}">
                                           <a14:useLocalDpi xmlns:a14="http://schemas.microsoft.com/office/drawing/2010/main" val="0"/>
@@ -28580,7 +28273,7 @@
                                           </pic:cNvPicPr>
                                         </pic:nvPicPr>
                                         <pic:blipFill>
-                                          <a:blip r:embed="rId24">
+                                          <a:blip r:embed="rId22">
                                             <a:extLst>
                                               <a:ext uri="{28A0092B-C50C-407E-A947-70E740481C1C}">
                                                 <a14:useLocalDpi xmlns:a14="http://schemas.microsoft.com/office/drawing/2010/main" val="0"/>
@@ -28638,7 +28331,7 @@
                                           </pic:cNvPicPr>
                                         </pic:nvPicPr>
                                         <pic:blipFill>
-                                          <a:blip r:embed="rId19">
+                                          <a:blip r:embed="rId18">
                                             <a:extLst>
                                               <a:ext uri="{28A0092B-C50C-407E-A947-70E740481C1C}">
                                                 <a14:useLocalDpi xmlns:a14="http://schemas.microsoft.com/office/drawing/2010/main" val="0"/>
@@ -28692,7 +28385,7 @@
           </mc:Choice>
           <mc:Fallback>
             <w:pict>
-              <v:shape w14:anchorId="66386CDF" id="Cuadro de texto 438739064" o:spid="_x0000_s1111" type="#_x0000_t202" style="position:absolute;margin-left:347.4pt;margin-top:69.55pt;width:18.5pt;height:22pt;z-index:251890688;visibility:visible;mso-wrap-style:square;mso-width-percent:0;mso-height-percent:0;mso-wrap-distance-left:9pt;mso-wrap-distance-top:0;mso-wrap-distance-right:9pt;mso-wrap-distance-bottom:0;mso-position-horizontal:absolute;mso-position-horizontal-relative:text;mso-position-vertical:absolute;mso-position-vertical-relative:text;mso-width-percent:0;mso-height-percent:0;mso-width-relative:margin;mso-height-relative:margin;v-text-anchor:top" o:gfxdata="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" filled="f" stroked="f">
+              <v:shape w14:anchorId="66386CDF" id="Cuadro de texto 438739064" o:spid="_x0000_s1111" type="#_x0000_t202" style="position:absolute;margin-left:347.4pt;margin-top:69.55pt;width:18.5pt;height:22pt;z-index:251890688;visibility:visible;mso-wrap-style:square;mso-width-percent:0;mso-height-percent:0;mso-wrap-distance-left:9pt;mso-wrap-distance-top:0;mso-wrap-distance-right:9pt;mso-wrap-distance-bottom:0;mso-position-horizontal:absolute;mso-position-horizontal-relative:text;mso-position-vertical:absolute;mso-position-vertical-relative:text;mso-width-percent:0;mso-height-percent:0;mso-width-relative:margin;mso-height-relative:margin;v-text-anchor:top" o:gfxdata="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" filled="f" stroked="f">
                 <v:textbox>
                   <w:txbxContent>
                     <w:p>
@@ -28743,7 +28436,7 @@
                                     </pic:cNvPicPr>
                                   </pic:nvPicPr>
                                   <pic:blipFill>
-                                    <a:blip r:embed="rId25">
+                                    <a:blip r:embed="rId22">
                                       <a:extLst>
                                         <a:ext uri="{28A0092B-C50C-407E-A947-70E740481C1C}">
                                           <a14:useLocalDpi xmlns:a14="http://schemas.microsoft.com/office/drawing/2010/main" val="0"/>
@@ -28801,7 +28494,7 @@
                                     </pic:cNvPicPr>
                                   </pic:nvPicPr>
                                   <pic:blipFill>
-                                    <a:blip r:embed="rId20">
+                                    <a:blip r:embed="rId18">
                                       <a:extLst>
                                         <a:ext uri="{28A0092B-C50C-407E-A947-70E740481C1C}">
                                           <a14:useLocalDpi xmlns:a14="http://schemas.microsoft.com/office/drawing/2010/main" val="0"/>
@@ -28948,7 +28641,7 @@
           </mc:Choice>
           <mc:Fallback>
             <w:pict>
-              <v:shape w14:anchorId="4A83F4B3" id="Cuadro de texto 1248200708" o:spid="_x0000_s1112" type="#_x0000_t202" style="position:absolute;margin-left:-19.7pt;margin-top:77.45pt;width:31.5pt;height:29.5pt;z-index:251898880;visibility:visible;mso-wrap-style:square;mso-width-percent:0;mso-height-percent:0;mso-wrap-distance-left:9pt;mso-wrap-distance-top:0;mso-wrap-distance-right:9pt;mso-wrap-distance-bottom:0;mso-position-horizontal:right;mso-position-horizontal-relative:margin;mso-position-vertical:absolute;mso-position-vertical-relative:text;mso-width-percent:0;mso-height-percent:0;mso-width-relative:margin;mso-height-relative:margin;v-text-anchor:top" o:gfxdata="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" filled="f" stroked="f">
+              <v:shape w14:anchorId="4A83F4B3" id="Cuadro de texto 1248200708" o:spid="_x0000_s1112" type="#_x0000_t202" style="position:absolute;margin-left:-19.7pt;margin-top:77.45pt;width:31.5pt;height:29.5pt;z-index:251898880;visibility:visible;mso-wrap-style:square;mso-width-percent:0;mso-height-percent:0;mso-wrap-distance-left:9pt;mso-wrap-distance-top:0;mso-wrap-distance-right:9pt;mso-wrap-distance-bottom:0;mso-position-horizontal:right;mso-position-horizontal-relative:margin;mso-position-vertical:absolute;mso-position-vertical-relative:text;mso-width-percent:0;mso-height-percent:0;mso-width-relative:margin;mso-height-relative:margin;v-text-anchor:top" o:gfxdata="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" filled="f" stroked="f">
                 <v:textbox>
                   <w:txbxContent>
                     <w:p>
@@ -29100,7 +28793,7 @@
           </mc:Choice>
           <mc:Fallback>
             <w:pict>
-              <v:shape w14:anchorId="606BAA7A" id="Cuadro de texto 1248200707" o:spid="_x0000_s1113" type="#_x0000_t202" style="position:absolute;margin-left:352pt;margin-top:76.25pt;width:31.5pt;height:29.5pt;z-index:251896832;visibility:visible;mso-wrap-style:square;mso-width-percent:0;mso-height-percent:0;mso-wrap-distance-left:9pt;mso-wrap-distance-top:0;mso-wrap-distance-right:9pt;mso-wrap-distance-bottom:0;mso-position-horizontal:absolute;mso-position-horizontal-relative:text;mso-position-vertical:absolute;mso-position-vertical-relative:text;mso-width-percent:0;mso-height-percent:0;mso-width-relative:margin;mso-height-relative:margin;v-text-anchor:top" o:gfxdata="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" filled="f" stroked="f">
+              <v:shape w14:anchorId="606BAA7A" id="Cuadro de texto 1248200707" o:spid="_x0000_s1113" type="#_x0000_t202" style="position:absolute;margin-left:352pt;margin-top:76.25pt;width:31.5pt;height:29.5pt;z-index:251896832;visibility:visible;mso-wrap-style:square;mso-width-percent:0;mso-height-percent:0;mso-wrap-distance-left:9pt;mso-wrap-distance-top:0;mso-wrap-distance-right:9pt;mso-wrap-distance-bottom:0;mso-position-horizontal:absolute;mso-position-horizontal-relative:text;mso-position-vertical:absolute;mso-position-vertical-relative:text;mso-width-percent:0;mso-height-percent:0;mso-width-relative:margin;mso-height-relative:margin;v-text-anchor:top" o:gfxdata="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" filled="f" stroked="f">
                 <v:textbox>
                   <w:txbxContent>
                     <w:p>
@@ -29244,7 +28937,7 @@
                                           </pic:cNvPicPr>
                                         </pic:nvPicPr>
                                         <pic:blipFill>
-                                          <a:blip r:embed="rId19">
+                                          <a:blip r:embed="rId18">
                                             <a:extLst>
                                               <a:ext uri="{28A0092B-C50C-407E-A947-70E740481C1C}">
                                                 <a14:useLocalDpi xmlns:a14="http://schemas.microsoft.com/office/drawing/2010/main" val="0"/>
@@ -29298,7 +28991,7 @@
           </mc:Choice>
           <mc:Fallback>
             <w:pict>
-              <v:shape w14:anchorId="3E493C5D" id="Cuadro de texto 438739068" o:spid="_x0000_s1114" type="#_x0000_t202" style="position:absolute;margin-left:347.6pt;margin-top:85.85pt;width:18.5pt;height:22pt;z-index:251894784;visibility:visible;mso-wrap-style:square;mso-width-percent:0;mso-height-percent:0;mso-wrap-distance-left:9pt;mso-wrap-distance-top:0;mso-wrap-distance-right:9pt;mso-wrap-distance-bottom:0;mso-position-horizontal:absolute;mso-position-horizontal-relative:text;mso-position-vertical:absolute;mso-position-vertical-relative:text;mso-width-percent:0;mso-height-percent:0;mso-width-relative:margin;mso-height-relative:margin;v-text-anchor:top" o:gfxdata="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" filled="f" stroked="f">
+              <v:shape w14:anchorId="3E493C5D" id="Cuadro de texto 438739068" o:spid="_x0000_s1114" type="#_x0000_t202" style="position:absolute;margin-left:347.6pt;margin-top:85.85pt;width:18.5pt;height:22pt;z-index:251894784;visibility:visible;mso-wrap-style:square;mso-width-percent:0;mso-height-percent:0;mso-wrap-distance-left:9pt;mso-wrap-distance-top:0;mso-wrap-distance-right:9pt;mso-wrap-distance-bottom:0;mso-position-horizontal:absolute;mso-position-horizontal-relative:text;mso-position-vertical:absolute;mso-position-vertical-relative:text;mso-width-percent:0;mso-height-percent:0;mso-width-relative:margin;mso-height-relative:margin;v-text-anchor:top" o:gfxdata="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" filled="f" stroked="f">
                 <v:textbox>
                   <w:txbxContent>
                     <w:p>
@@ -29349,7 +29042,7 @@
                                     </pic:cNvPicPr>
                                   </pic:nvPicPr>
                                   <pic:blipFill>
-                                    <a:blip r:embed="rId20">
+                                    <a:blip r:embed="rId18">
                                       <a:extLst>
                                         <a:ext uri="{28A0092B-C50C-407E-A947-70E740481C1C}">
                                           <a14:useLocalDpi xmlns:a14="http://schemas.microsoft.com/office/drawing/2010/main" val="0"/>
@@ -29479,7 +29172,7 @@
                                           </pic:cNvPicPr>
                                         </pic:nvPicPr>
                                         <pic:blipFill>
-                                          <a:blip r:embed="rId19">
+                                          <a:blip r:embed="rId18">
                                             <a:extLst>
                                               <a:ext uri="{28A0092B-C50C-407E-A947-70E740481C1C}">
                                                 <a14:useLocalDpi xmlns:a14="http://schemas.microsoft.com/office/drawing/2010/main" val="0"/>
@@ -29533,7 +29226,7 @@
           </mc:Choice>
           <mc:Fallback>
             <w:pict>
-              <v:shape w14:anchorId="6613120F" id="Cuadro de texto 438739066" o:spid="_x0000_s1115" type="#_x0000_t202" style="position:absolute;margin-left:354.75pt;margin-top:78.7pt;width:18.5pt;height:22pt;z-index:251892736;visibility:visible;mso-wrap-style:square;mso-width-percent:0;mso-height-percent:0;mso-wrap-distance-left:9pt;mso-wrap-distance-top:0;mso-wrap-distance-right:9pt;mso-wrap-distance-bottom:0;mso-position-horizontal:absolute;mso-position-horizontal-relative:text;mso-position-vertical:absolute;mso-position-vertical-relative:text;mso-width-percent:0;mso-height-percent:0;mso-width-relative:margin;mso-height-relative:margin;v-text-anchor:top" o:gfxdata="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" filled="f" stroked="f">
+              <v:shape w14:anchorId="6613120F" id="Cuadro de texto 438739066" o:spid="_x0000_s1115" type="#_x0000_t202" style="position:absolute;margin-left:354.75pt;margin-top:78.7pt;width:18.5pt;height:22pt;z-index:251892736;visibility:visible;mso-wrap-style:square;mso-width-percent:0;mso-height-percent:0;mso-wrap-distance-left:9pt;mso-wrap-distance-top:0;mso-wrap-distance-right:9pt;mso-wrap-distance-bottom:0;mso-position-horizontal:absolute;mso-position-horizontal-relative:text;mso-position-vertical:absolute;mso-position-vertical-relative:text;mso-width-percent:0;mso-height-percent:0;mso-width-relative:margin;mso-height-relative:margin;v-text-anchor:top" o:gfxdata="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" filled="f" stroked="f">
                 <v:textbox>
                   <w:txbxContent>
                     <w:p>
@@ -29574,7 +29267,7 @@
                                     </pic:cNvPicPr>
                                   </pic:nvPicPr>
                                   <pic:blipFill>
-                                    <a:blip r:embed="rId20">
+                                    <a:blip r:embed="rId18">
                                       <a:extLst>
                                         <a:ext uri="{28A0092B-C50C-407E-A947-70E740481C1C}">
                                           <a14:useLocalDpi xmlns:a14="http://schemas.microsoft.com/office/drawing/2010/main" val="0"/>
@@ -29784,7 +29477,7 @@
           </mc:Choice>
           <mc:Fallback>
             <w:pict>
-              <v:shape w14:anchorId="377B90F8" id="Cuadro de texto 438739061" o:spid="_x0000_s1116" type="#_x0000_t202" style="position:absolute;margin-left:301.65pt;margin-top:9.25pt;width:1in;height:23.5pt;z-index:251886592;visibility:visible;mso-wrap-style:none;mso-height-percent:0;mso-wrap-distance-left:9pt;mso-wrap-distance-top:0;mso-wrap-distance-right:9pt;mso-wrap-distance-bottom:0;mso-position-horizontal:absolute;mso-position-horizontal-relative:text;mso-position-vertical:absolute;mso-position-vertical-relative:text;mso-height-percent:0;mso-height-relative:margin;v-text-anchor:top" o:gfxdata="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" filled="f" stroked="f">
+              <v:shape w14:anchorId="377B90F8" id="Cuadro de texto 438739061" o:spid="_x0000_s1116" type="#_x0000_t202" style="position:absolute;margin-left:301.65pt;margin-top:9.25pt;width:1in;height:23.5pt;z-index:251886592;visibility:visible;mso-wrap-style:none;mso-height-percent:0;mso-wrap-distance-left:9pt;mso-wrap-distance-top:0;mso-wrap-distance-right:9pt;mso-wrap-distance-bottom:0;mso-position-horizontal:absolute;mso-position-horizontal-relative:text;mso-position-vertical:absolute;mso-position-vertical-relative:text;mso-height-percent:0;mso-height-relative:margin;v-text-anchor:top" o:gfxdata="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" filled="f" stroked="f">
                 <v:textbox>
                   <w:txbxContent>
                     <w:p>
@@ -29932,7 +29625,7 @@
           </mc:Choice>
           <mc:Fallback>
             <w:pict>
-              <v:shape w14:anchorId="3AFB7DAE" id="Cuadro de texto 438739060" o:spid="_x0000_s1117" type="#_x0000_t202" style="position:absolute;margin-left:271.25pt;margin-top:12.15pt;width:1in;height:23.5pt;z-index:251884544;visibility:visible;mso-wrap-style:none;mso-height-percent:0;mso-wrap-distance-left:9pt;mso-wrap-distance-top:0;mso-wrap-distance-right:9pt;mso-wrap-distance-bottom:0;mso-position-horizontal:absolute;mso-position-horizontal-relative:text;mso-position-vertical:absolute;mso-position-vertical-relative:text;mso-height-percent:0;mso-height-relative:margin;v-text-anchor:top" o:gfxdata="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" filled="f" stroked="f">
+              <v:shape w14:anchorId="3AFB7DAE" id="Cuadro de texto 438739060" o:spid="_x0000_s1117" type="#_x0000_t202" style="position:absolute;margin-left:271.25pt;margin-top:12.15pt;width:1in;height:23.5pt;z-index:251884544;visibility:visible;mso-wrap-style:none;mso-height-percent:0;mso-wrap-distance-left:9pt;mso-wrap-distance-top:0;mso-wrap-distance-right:9pt;mso-wrap-distance-bottom:0;mso-position-horizontal:absolute;mso-position-horizontal-relative:text;mso-position-vertical:absolute;mso-position-vertical-relative:text;mso-height-percent:0;mso-height-relative:margin;v-text-anchor:top" o:gfxdata="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" filled="f" stroked="f">
                 <v:textbox>
                   <w:txbxContent>
                     <w:p>
@@ -29995,7 +29688,7 @@
                     <pic:cNvPicPr/>
                   </pic:nvPicPr>
                   <pic:blipFill>
-                    <a:blip r:embed="rId26"/>
+                    <a:blip r:embed="rId23"/>
                     <a:stretch>
                       <a:fillRect/>
                     </a:stretch>
@@ -31260,7 +30953,7 @@
       </w:r>
       <w:r>
         <w:rPr>
-          <w:rStyle w:val="Textoennegrita"/>
+          <w:rStyle w:val="Fuerte"/>
           <w:b w:val="0"/>
           <w:bCs w:val="0"/>
         </w:rPr>
@@ -31327,25 +31020,7 @@
           <w:sz w:val="24"/>
           <w:szCs w:val="24"/>
         </w:rPr>
-        <w:t xml:space="preserve">Como se explicó previamente en el análisis del convertidor </w:t>
-      </w:r>
-      <w:proofErr w:type="spellStart"/>
-      <w:r>
-        <w:rPr>
-          <w:rFonts w:ascii="Times New Roman" w:eastAsia="Times New Roman" w:hAnsi="Times New Roman" w:cs="Times New Roman"/>
-          <w:sz w:val="24"/>
-          <w:szCs w:val="24"/>
-        </w:rPr>
-        <w:t>Boost</w:t>
-      </w:r>
-      <w:proofErr w:type="spellEnd"/>
-      <w:r>
-        <w:rPr>
-          <w:rFonts w:ascii="Times New Roman" w:eastAsia="Times New Roman" w:hAnsi="Times New Roman" w:cs="Times New Roman"/>
-          <w:sz w:val="24"/>
-          <w:szCs w:val="24"/>
-        </w:rPr>
-        <w:t xml:space="preserve">, el modelo conmutado puede simplificarse mediante el uso de un modelo promediado, el cual reemplaza la señal de conmutación </w:t>
+        <w:t xml:space="preserve">Como se explicó previamente en el análisis del convertidor Boost, el modelo conmutado puede simplificarse mediante el uso de un modelo promediado, el cual reemplaza la señal de conmutación </w:t>
       </w:r>
       <m:oMath>
         <m:r>
@@ -33839,43 +33514,7 @@
           <w:sz w:val="24"/>
           <w:szCs w:val="24"/>
         </w:rPr>
-        <w:t xml:space="preserve">el formato de la American </w:t>
-      </w:r>
-      <w:proofErr w:type="spellStart"/>
-      <w:r>
-        <w:rPr>
-          <w:rFonts w:cstheme="minorHAnsi"/>
-          <w:sz w:val="24"/>
-          <w:szCs w:val="24"/>
-        </w:rPr>
-        <w:t>Psychological</w:t>
-      </w:r>
-      <w:proofErr w:type="spellEnd"/>
-      <w:r>
-        <w:rPr>
-          <w:rFonts w:cstheme="minorHAnsi"/>
-          <w:sz w:val="24"/>
-          <w:szCs w:val="24"/>
-        </w:rPr>
-        <w:t xml:space="preserve"> </w:t>
-      </w:r>
-      <w:proofErr w:type="spellStart"/>
-      <w:r>
-        <w:rPr>
-          <w:rFonts w:cstheme="minorHAnsi"/>
-          <w:sz w:val="24"/>
-          <w:szCs w:val="24"/>
-        </w:rPr>
-        <w:t>Association</w:t>
-      </w:r>
-      <w:proofErr w:type="spellEnd"/>
-      <w:r>
-        <w:rPr>
-          <w:rFonts w:cstheme="minorHAnsi"/>
-          <w:sz w:val="24"/>
-          <w:szCs w:val="24"/>
-        </w:rPr>
-        <w:t xml:space="preserve"> (APA), última edición.</w:t>
+        <w:t>el formato de la American Psychological Association (APA), última edición.</w:t>
       </w:r>
       <w:r>
         <w:rPr>
@@ -33982,25 +33621,7 @@
           <w:sz w:val="24"/>
           <w:szCs w:val="24"/>
         </w:rPr>
-        <w:t xml:space="preserve">deben ser nombrados con letras para diferenciarse unos de otros (p. </w:t>
-      </w:r>
-      <w:proofErr w:type="spellStart"/>
-      <w:r>
-        <w:rPr>
-          <w:rFonts w:cstheme="minorHAnsi"/>
-          <w:sz w:val="24"/>
-          <w:szCs w:val="24"/>
-        </w:rPr>
-        <w:t>ej</w:t>
-      </w:r>
-      <w:proofErr w:type="spellEnd"/>
-      <w:r>
-        <w:rPr>
-          <w:rFonts w:cstheme="minorHAnsi"/>
-          <w:sz w:val="24"/>
-          <w:szCs w:val="24"/>
-        </w:rPr>
-        <w:t xml:space="preserve">: </w:t>
+        <w:t xml:space="preserve">deben ser nombrados con letras para diferenciarse unos de otros (p. ej: </w:t>
       </w:r>
       <w:r>
         <w:rPr>
@@ -34567,8 +34188,8 @@
       </w:pPr>
     </w:p>
     <w:sectPr>
-      <w:headerReference w:type="default" r:id="rId27"/>
-      <w:footerReference w:type="default" r:id="rId28"/>
+      <w:headerReference w:type="default" r:id="rId24"/>
+      <w:footerReference w:type="default" r:id="rId25"/>
       <w:type w:val="continuous"/>
       <w:pgSz w:w="12240" w:h="15840"/>
       <w:pgMar w:top="1418" w:right="1701" w:bottom="1418" w:left="1701" w:header="709" w:footer="851" w:gutter="0"/>
@@ -34580,7 +34201,7 @@
 </file>
 
 <file path=word/comments.xml><?xml version="1.0" encoding="utf-8"?>
-<w:comments xmlns:wpc="http://schemas.microsoft.com/office/word/2010/wordprocessingCanvas" xmlns:cx="http://schemas.microsoft.com/office/drawing/2014/chartex" xmlns:cx1="http://schemas.microsoft.com/office/drawing/2015/9/8/chartex" xmlns:cx2="http://schemas.microsoft.com/office/drawing/2015/10/21/chartex" xmlns:cx3="http://schemas.microsoft.com/office/drawing/2016/5/9/chartex" xmlns:cx4="http://schemas.microsoft.com/office/drawing/2016/5/10/chartex" xmlns:cx5="http://schemas.microsoft.com/office/drawing/2016/5/11/chartex" xmlns:cx6="http://schemas.microsoft.com/office/drawing/2016/5/12/chartex" xmlns:cx7="http://schemas.microsoft.com/office/drawing/2016/5/13/chartex" xmlns:cx8="http://schemas.microsoft.com/office/drawing/2016/5/14/chartex" xmlns:mc="http://schemas.openxmlformats.org/markup-compatibility/2006" xmlns:aink="http://schemas.microsoft.com/office/drawing/2016/ink" xmlns:am3d="http://schemas.microsoft.com/office/drawing/2017/model3d" xmlns:o="urn:schemas-microsoft-com:office:office" xmlns:oel="http://schemas.microsoft.com/office/2019/extlst" xmlns:r="http://schemas.openxmlformats.org/officeDocument/2006/relationships" xmlns:m="http://schemas.openxmlformats.org/officeDocument/2006/math" xmlns:v="urn:schemas-microsoft-com:vml" xmlns:wp14="http://schemas.microsoft.com/office/word/2010/wordprocessingDrawing" xmlns:wp="http://schemas.openxmlformats.org/drawingml/2006/wordprocessingDrawing" xmlns:w10="urn:schemas-microsoft-com:office:word" xmlns:w="http://schemas.openxmlformats.org/wordprocessingml/2006/main" xmlns:w14="http://schemas.microsoft.com/office/word/2010/wordml" xmlns:w15="http://schemas.microsoft.com/office/word/2012/wordml" xmlns:w16cex="http://schemas.microsoft.com/office/word/2018/wordml/cex" xmlns:w16cid="http://schemas.microsoft.com/office/word/2016/wordml/cid" xmlns:w16="http://schemas.microsoft.com/office/word/2018/wordml" xmlns:w16sdtdh="http://schemas.microsoft.com/office/word/2020/wordml/sdtdatahash" xmlns:w16se="http://schemas.microsoft.com/office/word/2015/wordml/symex" xmlns:wpg="http://schemas.microsoft.com/office/word/2010/wordprocessingGroup" xmlns:wpi="http://schemas.microsoft.com/office/word/2010/wordprocessingInk" xmlns:wne="http://schemas.microsoft.com/office/word/2006/wordml" xmlns:wps="http://schemas.microsoft.com/office/word/2010/wordprocessingShape" mc:Ignorable="w14 w15 w16se w16cid w16 w16cex w16sdtdh wp14">
+<w:comments xmlns:wpc="http://schemas.microsoft.com/office/word/2010/wordprocessingCanvas" xmlns:cx="http://schemas.microsoft.com/office/drawing/2014/chartex" xmlns:cx1="http://schemas.microsoft.com/office/drawing/2015/9/8/chartex" xmlns:cx2="http://schemas.microsoft.com/office/drawing/2015/10/21/chartex" xmlns:cx3="http://schemas.microsoft.com/office/drawing/2016/5/9/chartex" xmlns:cx4="http://schemas.microsoft.com/office/drawing/2016/5/10/chartex" xmlns:cx5="http://schemas.microsoft.com/office/drawing/2016/5/11/chartex" xmlns:cx6="http://schemas.microsoft.com/office/drawing/2016/5/12/chartex" xmlns:cx7="http://schemas.microsoft.com/office/drawing/2016/5/13/chartex" xmlns:cx8="http://schemas.microsoft.com/office/drawing/2016/5/14/chartex" xmlns:mc="http://schemas.openxmlformats.org/markup-compatibility/2006" xmlns:m="http://schemas.openxmlformats.org/officeDocument/2006/math" xmlns:aink="http://schemas.microsoft.com/office/drawing/2016/ink" xmlns:am3d="http://schemas.microsoft.com/office/drawing/2017/model3d" xmlns:oel="http://schemas.microsoft.com/office/2019/extlst" xmlns:r="http://schemas.openxmlformats.org/officeDocument/2006/relationships" xmlns:wp14="http://schemas.microsoft.com/office/word/2010/wordprocessingDrawing" xmlns:wp="http://schemas.openxmlformats.org/drawingml/2006/wordprocessingDrawing" xmlns:wpg="http://schemas.microsoft.com/office/word/2010/wordprocessingGroup" xmlns:wpi="http://schemas.microsoft.com/office/word/2010/wordprocessingInk" xmlns:wps="http://schemas.microsoft.com/office/word/2010/wordprocessingShape" xmlns:o="urn:schemas-microsoft-com:office:office" xmlns:v="urn:schemas-microsoft-com:vml" xmlns:w10="urn:schemas-microsoft-com:office:word" xmlns:w="http://schemas.openxmlformats.org/wordprocessingml/2006/main" xmlns:w14="http://schemas.microsoft.com/office/word/2010/wordml" xmlns:w15="http://schemas.microsoft.com/office/word/2012/wordml" xmlns:w16cex="http://schemas.microsoft.com/office/word/2018/wordml/cex" xmlns:w16cid="http://schemas.microsoft.com/office/word/2016/wordml/cid" xmlns:w16="http://schemas.microsoft.com/office/word/2018/wordml" xmlns:w16sdtdh="http://schemas.microsoft.com/office/word/2020/wordml/sdtdatahash" xmlns:w16sdtfl="http://schemas.microsoft.com/office/word/2024/wordml/sdtformatlock" xmlns:w16se="http://schemas.microsoft.com/office/word/2015/wordml/symex" xmlns:w16du="http://schemas.microsoft.com/office/word/2023/wordml/word16du" xmlns:wne="http://schemas.microsoft.com/office/word/2006/wordml" mc:Ignorable="w14 w15 w16se w16cid w16 w16cex w16sdtdh w16sdtfl w16du wp14">
   <w:comment w:id="3" w:author="Sergio Ignacio Serna Garces" w:date="2026-02-26T16:23:00Z" w:initials="SS">
     <w:p>
       <w:r>
@@ -34662,14 +34283,7 @@
           <w:sz w:val="20"/>
           <w:szCs w:val="20"/>
         </w:rPr>
-        <w:t xml:space="preserve">Poner subíndice a voltajes y corrientes y resistencia de carga.  Vo y </w:t>
-      </w:r>
-      <w:r>
-        <w:rPr>
-          <w:sz w:val="20"/>
-          <w:szCs w:val="20"/>
-        </w:rPr>
-        <w:t>Vc son iguales, quitar Vc y dejar Vo. Poner subíndice a Q1 y Q2 y llamar a la señal PWM solo PWM no PWM1.</w:t>
+        <w:t>Poner subíndice a voltajes y corrientes y resistencia de carga.  Vo y Vc son iguales, quitar Vc y dejar Vo. Poner subíndice a Q1 y Q2 y llamar a la señal PWM solo PWM no PWM1.</w:t>
       </w:r>
     </w:p>
   </w:comment>
@@ -34694,7 +34308,7 @@
 </file>
 
 <file path=word/commentsExtended.xml><?xml version="1.0" encoding="utf-8"?>
-<w15:commentsEx xmlns:wpc="http://schemas.microsoft.com/office/word/2010/wordprocessingCanvas" xmlns:cx="http://schemas.microsoft.com/office/drawing/2014/chartex" xmlns:cx1="http://schemas.microsoft.com/office/drawing/2015/9/8/chartex" xmlns:cx2="http://schemas.microsoft.com/office/drawing/2015/10/21/chartex" xmlns:cx3="http://schemas.microsoft.com/office/drawing/2016/5/9/chartex" xmlns:cx4="http://schemas.microsoft.com/office/drawing/2016/5/10/chartex" xmlns:cx5="http://schemas.microsoft.com/office/drawing/2016/5/11/chartex" xmlns:cx6="http://schemas.microsoft.com/office/drawing/2016/5/12/chartex" xmlns:cx7="http://schemas.microsoft.com/office/drawing/2016/5/13/chartex" xmlns:cx8="http://schemas.microsoft.com/office/drawing/2016/5/14/chartex" xmlns:mc="http://schemas.openxmlformats.org/markup-compatibility/2006" xmlns:aink="http://schemas.microsoft.com/office/drawing/2016/ink" xmlns:am3d="http://schemas.microsoft.com/office/drawing/2017/model3d" xmlns:o="urn:schemas-microsoft-com:office:office" xmlns:oel="http://schemas.microsoft.com/office/2019/extlst" xmlns:r="http://schemas.openxmlformats.org/officeDocument/2006/relationships" xmlns:m="http://schemas.openxmlformats.org/officeDocument/2006/math" xmlns:v="urn:schemas-microsoft-com:vml" xmlns:wp14="http://schemas.microsoft.com/office/word/2010/wordprocessingDrawing" xmlns:wp="http://schemas.openxmlformats.org/drawingml/2006/wordprocessingDrawing" xmlns:w10="urn:schemas-microsoft-com:office:word" xmlns:w="http://schemas.openxmlformats.org/wordprocessingml/2006/main" xmlns:w14="http://schemas.microsoft.com/office/word/2010/wordml" xmlns:w15="http://schemas.microsoft.com/office/word/2012/wordml" xmlns:w16cex="http://schemas.microsoft.com/office/word/2018/wordml/cex" xmlns:w16cid="http://schemas.microsoft.com/office/word/2016/wordml/cid" xmlns:w16="http://schemas.microsoft.com/office/word/2018/wordml" xmlns:w16sdtdh="http://schemas.microsoft.com/office/word/2020/wordml/sdtdatahash" xmlns:w16se="http://schemas.microsoft.com/office/word/2015/wordml/symex" xmlns:wpg="http://schemas.microsoft.com/office/word/2010/wordprocessingGroup" xmlns:wpi="http://schemas.microsoft.com/office/word/2010/wordprocessingInk" xmlns:wne="http://schemas.microsoft.com/office/word/2006/wordml" xmlns:wps="http://schemas.microsoft.com/office/word/2010/wordprocessingShape" mc:Ignorable="w14 w15 w16se w16cid w16 w16cex w16sdtdh wp14">
+<w15:commentsEx xmlns:wpc="http://schemas.microsoft.com/office/word/2010/wordprocessingCanvas" xmlns:cx="http://schemas.microsoft.com/office/drawing/2014/chartex" xmlns:cx1="http://schemas.microsoft.com/office/drawing/2015/9/8/chartex" xmlns:cx2="http://schemas.microsoft.com/office/drawing/2015/10/21/chartex" xmlns:cx3="http://schemas.microsoft.com/office/drawing/2016/5/9/chartex" xmlns:cx4="http://schemas.microsoft.com/office/drawing/2016/5/10/chartex" xmlns:cx5="http://schemas.microsoft.com/office/drawing/2016/5/11/chartex" xmlns:cx6="http://schemas.microsoft.com/office/drawing/2016/5/12/chartex" xmlns:cx7="http://schemas.microsoft.com/office/drawing/2016/5/13/chartex" xmlns:cx8="http://schemas.microsoft.com/office/drawing/2016/5/14/chartex" xmlns:mc="http://schemas.openxmlformats.org/markup-compatibility/2006" xmlns:m="http://schemas.openxmlformats.org/officeDocument/2006/math" xmlns:aink="http://schemas.microsoft.com/office/drawing/2016/ink" xmlns:am3d="http://schemas.microsoft.com/office/drawing/2017/model3d" xmlns:oel="http://schemas.microsoft.com/office/2019/extlst" xmlns:r="http://schemas.openxmlformats.org/officeDocument/2006/relationships" xmlns:wp14="http://schemas.microsoft.com/office/word/2010/wordprocessingDrawing" xmlns:wp="http://schemas.openxmlformats.org/drawingml/2006/wordprocessingDrawing" xmlns:wpg="http://schemas.microsoft.com/office/word/2010/wordprocessingGroup" xmlns:wpi="http://schemas.microsoft.com/office/word/2010/wordprocessingInk" xmlns:wps="http://schemas.microsoft.com/office/word/2010/wordprocessingShape" xmlns:o="urn:schemas-microsoft-com:office:office" xmlns:v="urn:schemas-microsoft-com:vml" xmlns:w10="urn:schemas-microsoft-com:office:word" xmlns:w="http://schemas.openxmlformats.org/wordprocessingml/2006/main" xmlns:w14="http://schemas.microsoft.com/office/word/2010/wordml" xmlns:w15="http://schemas.microsoft.com/office/word/2012/wordml" xmlns:w16cex="http://schemas.microsoft.com/office/word/2018/wordml/cex" xmlns:w16cid="http://schemas.microsoft.com/office/word/2016/wordml/cid" xmlns:w16="http://schemas.microsoft.com/office/word/2018/wordml" xmlns:w16sdtdh="http://schemas.microsoft.com/office/word/2020/wordml/sdtdatahash" xmlns:w16sdtfl="http://schemas.microsoft.com/office/word/2024/wordml/sdtformatlock" xmlns:w16se="http://schemas.microsoft.com/office/word/2015/wordml/symex" xmlns:w16du="http://schemas.microsoft.com/office/word/2023/wordml/word16du" xmlns:wne="http://schemas.microsoft.com/office/word/2006/wordml" mc:Ignorable="w14 w15 w16se w16cid w16 w16cex w16sdtdh w16sdtfl w16du wp14">
   <w15:commentEx w15:paraId="286ABA1A" w15:done="0"/>
   <w15:commentEx w15:paraId="20F1C926" w15:done="0"/>
   <w15:commentEx w15:paraId="4FA23FCD" w15:done="0"/>
@@ -34705,7 +34319,7 @@
 </file>
 
 <file path=word/commentsExtensible.xml><?xml version="1.0" encoding="utf-8"?>
-<w16cex:commentsExtensible xmlns:wpc="http://schemas.microsoft.com/office/word/2010/wordprocessingCanvas" xmlns:cx="http://schemas.microsoft.com/office/drawing/2014/chartex" xmlns:cx1="http://schemas.microsoft.com/office/drawing/2015/9/8/chartex" xmlns:cx2="http://schemas.microsoft.com/office/drawing/2015/10/21/chartex" xmlns:cx3="http://schemas.microsoft.com/office/drawing/2016/5/9/chartex" xmlns:cx4="http://schemas.microsoft.com/office/drawing/2016/5/10/chartex" xmlns:cx5="http://schemas.microsoft.com/office/drawing/2016/5/11/chartex" xmlns:cx6="http://schemas.microsoft.com/office/drawing/2016/5/12/chartex" xmlns:cx7="http://schemas.microsoft.com/office/drawing/2016/5/13/chartex" xmlns:cx8="http://schemas.microsoft.com/office/drawing/2016/5/14/chartex" xmlns:mc="http://schemas.openxmlformats.org/markup-compatibility/2006" xmlns:aink="http://schemas.microsoft.com/office/drawing/2016/ink" xmlns:am3d="http://schemas.microsoft.com/office/drawing/2017/model3d" xmlns:o="urn:schemas-microsoft-com:office:office" xmlns:oel="http://schemas.microsoft.com/office/2019/extlst" xmlns:r="http://schemas.openxmlformats.org/officeDocument/2006/relationships" xmlns:m="http://schemas.openxmlformats.org/officeDocument/2006/math" xmlns:v="urn:schemas-microsoft-com:vml" xmlns:wp14="http://schemas.microsoft.com/office/word/2010/wordprocessingDrawing" xmlns:wp="http://schemas.openxmlformats.org/drawingml/2006/wordprocessingDrawing" xmlns:w10="urn:schemas-microsoft-com:office:word" xmlns:w="http://schemas.openxmlformats.org/wordprocessingml/2006/main" xmlns:w14="http://schemas.microsoft.com/office/word/2010/wordml" xmlns:w15="http://schemas.microsoft.com/office/word/2012/wordml" xmlns:w16cex="http://schemas.microsoft.com/office/word/2018/wordml/cex" xmlns:w16cid="http://schemas.microsoft.com/office/word/2016/wordml/cid" xmlns:w16="http://schemas.microsoft.com/office/word/2018/wordml" xmlns:w16sdtdh="http://schemas.microsoft.com/office/word/2020/wordml/sdtdatahash" xmlns:w16se="http://schemas.microsoft.com/office/word/2015/wordml/symex" xmlns:wpg="http://schemas.microsoft.com/office/word/2010/wordprocessingGroup" xmlns:wpi="http://schemas.microsoft.com/office/word/2010/wordprocessingInk" xmlns:wne="http://schemas.microsoft.com/office/word/2006/wordml" xmlns:wps="http://schemas.microsoft.com/office/word/2010/wordprocessingShape" mc:Ignorable="w14 w15 w16se w16cid w16 w16cex w16sdtdh wp14">
+<w16cex:commentsExtensible xmlns:wpc="http://schemas.microsoft.com/office/word/2010/wordprocessingCanvas" xmlns:cx="http://schemas.microsoft.com/office/drawing/2014/chartex" xmlns:cx1="http://schemas.microsoft.com/office/drawing/2015/9/8/chartex" xmlns:cx2="http://schemas.microsoft.com/office/drawing/2015/10/21/chartex" xmlns:cx3="http://schemas.microsoft.com/office/drawing/2016/5/9/chartex" xmlns:cx4="http://schemas.microsoft.com/office/drawing/2016/5/10/chartex" xmlns:cx5="http://schemas.microsoft.com/office/drawing/2016/5/11/chartex" xmlns:cx6="http://schemas.microsoft.com/office/drawing/2016/5/12/chartex" xmlns:cx7="http://schemas.microsoft.com/office/drawing/2016/5/13/chartex" xmlns:cx8="http://schemas.microsoft.com/office/drawing/2016/5/14/chartex" xmlns:cr="http://schemas.microsoft.com/office/comments/2020/reactions" xmlns:mc="http://schemas.openxmlformats.org/markup-compatibility/2006" xmlns:m="http://schemas.openxmlformats.org/officeDocument/2006/math" xmlns:aink="http://schemas.microsoft.com/office/drawing/2016/ink" xmlns:am3d="http://schemas.microsoft.com/office/drawing/2017/model3d" xmlns:oel="http://schemas.microsoft.com/office/2019/extlst" xmlns:r="http://schemas.openxmlformats.org/officeDocument/2006/relationships" xmlns:wp14="http://schemas.microsoft.com/office/word/2010/wordprocessingDrawing" xmlns:wp="http://schemas.openxmlformats.org/drawingml/2006/wordprocessingDrawing" xmlns:wpg="http://schemas.microsoft.com/office/word/2010/wordprocessingGroup" xmlns:wpi="http://schemas.microsoft.com/office/word/2010/wordprocessingInk" xmlns:wps="http://schemas.microsoft.com/office/word/2010/wordprocessingShape" xmlns:o="urn:schemas-microsoft-com:office:office" xmlns:v="urn:schemas-microsoft-com:vml" xmlns:w10="urn:schemas-microsoft-com:office:word" xmlns:w="http://schemas.openxmlformats.org/wordprocessingml/2006/main" xmlns:w14="http://schemas.microsoft.com/office/word/2010/wordml" xmlns:w15="http://schemas.microsoft.com/office/word/2012/wordml" xmlns:w16cex="http://schemas.microsoft.com/office/word/2018/wordml/cex" xmlns:w16cid="http://schemas.microsoft.com/office/word/2016/wordml/cid" xmlns:w16="http://schemas.microsoft.com/office/word/2018/wordml" xmlns:w16sdtdh="http://schemas.microsoft.com/office/word/2020/wordml/sdtdatahash" xmlns:w16sdtfl="http://schemas.microsoft.com/office/word/2024/wordml/sdtformatlock" xmlns:w16se="http://schemas.microsoft.com/office/word/2015/wordml/symex" xmlns:w16du="http://schemas.microsoft.com/office/word/2023/wordml/word16du" xmlns:wne="http://schemas.microsoft.com/office/word/2006/wordml" mc:Ignorable="w14 w15 w16se w16cid w16 w16cex w16sdtdh w16sdtfl cr w16du wp14">
   <w16cex:commentExtensible w16cex:durableId="76E4E42C" w16cex:dateUtc="2026-02-26T21:23:00Z"/>
   <w16cex:commentExtensible w16cex:durableId="279C1C02" w16cex:dateUtc="2026-02-26T23:15:00Z"/>
   <w16cex:commentExtensible w16cex:durableId="3235D43C" w16cex:dateUtc="2026-02-26T21:25:00Z"/>
@@ -34716,7 +34330,7 @@
 </file>
 
 <file path=word/commentsIds.xml><?xml version="1.0" encoding="utf-8"?>
-<w16cid:commentsIds xmlns:wpc="http://schemas.microsoft.com/office/word/2010/wordprocessingCanvas" xmlns:cx="http://schemas.microsoft.com/office/drawing/2014/chartex" xmlns:cx1="http://schemas.microsoft.com/office/drawing/2015/9/8/chartex" xmlns:cx2="http://schemas.microsoft.com/office/drawing/2015/10/21/chartex" xmlns:cx3="http://schemas.microsoft.com/office/drawing/2016/5/9/chartex" xmlns:cx4="http://schemas.microsoft.com/office/drawing/2016/5/10/chartex" xmlns:cx5="http://schemas.microsoft.com/office/drawing/2016/5/11/chartex" xmlns:cx6="http://schemas.microsoft.com/office/drawing/2016/5/12/chartex" xmlns:cx7="http://schemas.microsoft.com/office/drawing/2016/5/13/chartex" xmlns:cx8="http://schemas.microsoft.com/office/drawing/2016/5/14/chartex" xmlns:mc="http://schemas.openxmlformats.org/markup-compatibility/2006" xmlns:aink="http://schemas.microsoft.com/office/drawing/2016/ink" xmlns:am3d="http://schemas.microsoft.com/office/drawing/2017/model3d" xmlns:o="urn:schemas-microsoft-com:office:office" xmlns:oel="http://schemas.microsoft.com/office/2019/extlst" xmlns:r="http://schemas.openxmlformats.org/officeDocument/2006/relationships" xmlns:m="http://schemas.openxmlformats.org/officeDocument/2006/math" xmlns:v="urn:schemas-microsoft-com:vml" xmlns:wp14="http://schemas.microsoft.com/office/word/2010/wordprocessingDrawing" xmlns:wp="http://schemas.openxmlformats.org/drawingml/2006/wordprocessingDrawing" xmlns:w10="urn:schemas-microsoft-com:office:word" xmlns:w="http://schemas.openxmlformats.org/wordprocessingml/2006/main" xmlns:w14="http://schemas.microsoft.com/office/word/2010/wordml" xmlns:w15="http://schemas.microsoft.com/office/word/2012/wordml" xmlns:w16cex="http://schemas.microsoft.com/office/word/2018/wordml/cex" xmlns:w16cid="http://schemas.microsoft.com/office/word/2016/wordml/cid" xmlns:w16="http://schemas.microsoft.com/office/word/2018/wordml" xmlns:w16sdtdh="http://schemas.microsoft.com/office/word/2020/wordml/sdtdatahash" xmlns:w16se="http://schemas.microsoft.com/office/word/2015/wordml/symex" xmlns:wpg="http://schemas.microsoft.com/office/word/2010/wordprocessingGroup" xmlns:wpi="http://schemas.microsoft.com/office/word/2010/wordprocessingInk" xmlns:wne="http://schemas.microsoft.com/office/word/2006/wordml" xmlns:wps="http://schemas.microsoft.com/office/word/2010/wordprocessingShape" mc:Ignorable="w14 w15 w16se w16cid w16 w16cex w16sdtdh wp14">
+<w16cid:commentsIds xmlns:wpc="http://schemas.microsoft.com/office/word/2010/wordprocessingCanvas" xmlns:cx="http://schemas.microsoft.com/office/drawing/2014/chartex" xmlns:cx1="http://schemas.microsoft.com/office/drawing/2015/9/8/chartex" xmlns:cx2="http://schemas.microsoft.com/office/drawing/2015/10/21/chartex" xmlns:cx3="http://schemas.microsoft.com/office/drawing/2016/5/9/chartex" xmlns:cx4="http://schemas.microsoft.com/office/drawing/2016/5/10/chartex" xmlns:cx5="http://schemas.microsoft.com/office/drawing/2016/5/11/chartex" xmlns:cx6="http://schemas.microsoft.com/office/drawing/2016/5/12/chartex" xmlns:cx7="http://schemas.microsoft.com/office/drawing/2016/5/13/chartex" xmlns:cx8="http://schemas.microsoft.com/office/drawing/2016/5/14/chartex" xmlns:mc="http://schemas.openxmlformats.org/markup-compatibility/2006" xmlns:m="http://schemas.openxmlformats.org/officeDocument/2006/math" xmlns:aink="http://schemas.microsoft.com/office/drawing/2016/ink" xmlns:am3d="http://schemas.microsoft.com/office/drawing/2017/model3d" xmlns:oel="http://schemas.microsoft.com/office/2019/extlst" xmlns:r="http://schemas.openxmlformats.org/officeDocument/2006/relationships" xmlns:wp14="http://schemas.microsoft.com/office/word/2010/wordprocessingDrawing" xmlns:wp="http://schemas.openxmlformats.org/drawingml/2006/wordprocessingDrawing" xmlns:wpg="http://schemas.microsoft.com/office/word/2010/wordprocessingGroup" xmlns:wpi="http://schemas.microsoft.com/office/word/2010/wordprocessingInk" xmlns:wps="http://schemas.microsoft.com/office/word/2010/wordprocessingShape" xmlns:o="urn:schemas-microsoft-com:office:office" xmlns:v="urn:schemas-microsoft-com:vml" xmlns:w10="urn:schemas-microsoft-com:office:word" xmlns:w="http://schemas.openxmlformats.org/wordprocessingml/2006/main" xmlns:w14="http://schemas.microsoft.com/office/word/2010/wordml" xmlns:w15="http://schemas.microsoft.com/office/word/2012/wordml" xmlns:w16cex="http://schemas.microsoft.com/office/word/2018/wordml/cex" xmlns:w16cid="http://schemas.microsoft.com/office/word/2016/wordml/cid" xmlns:w16="http://schemas.microsoft.com/office/word/2018/wordml" xmlns:w16sdtdh="http://schemas.microsoft.com/office/word/2020/wordml/sdtdatahash" xmlns:w16sdtfl="http://schemas.microsoft.com/office/word/2024/wordml/sdtformatlock" xmlns:w16se="http://schemas.microsoft.com/office/word/2015/wordml/symex" xmlns:w16du="http://schemas.microsoft.com/office/word/2023/wordml/word16du" xmlns:wne="http://schemas.microsoft.com/office/word/2006/wordml" mc:Ignorable="w14 w15 w16se w16cid w16 w16cex w16sdtdh w16sdtfl w16du wp14">
   <w16cid:commentId w16cid:paraId="286ABA1A" w16cid:durableId="76E4E42C"/>
   <w16cid:commentId w16cid:paraId="20F1C926" w16cid:durableId="279C1C02"/>
   <w16cid:commentId w16cid:paraId="4FA23FCD" w16cid:durableId="3235D43C"/>
@@ -34727,7 +34341,7 @@
 </file>
 
 <file path=word/endnotes.xml><?xml version="1.0" encoding="utf-8"?>
-<w:endnotes xmlns:wpc="http://schemas.microsoft.com/office/word/2010/wordprocessingCanvas" xmlns:cx="http://schemas.microsoft.com/office/drawing/2014/chartex" xmlns:cx1="http://schemas.microsoft.com/office/drawing/2015/9/8/chartex" xmlns:cx2="http://schemas.microsoft.com/office/drawing/2015/10/21/chartex" xmlns:cx3="http://schemas.microsoft.com/office/drawing/2016/5/9/chartex" xmlns:cx4="http://schemas.microsoft.com/office/drawing/2016/5/10/chartex" xmlns:cx5="http://schemas.microsoft.com/office/drawing/2016/5/11/chartex" xmlns:cx6="http://schemas.microsoft.com/office/drawing/2016/5/12/chartex" xmlns:cx7="http://schemas.microsoft.com/office/drawing/2016/5/13/chartex" xmlns:cx8="http://schemas.microsoft.com/office/drawing/2016/5/14/chartex" xmlns:mc="http://schemas.openxmlformats.org/markup-compatibility/2006" xmlns:aink="http://schemas.microsoft.com/office/drawing/2016/ink" xmlns:am3d="http://schemas.microsoft.com/office/drawing/2017/model3d" xmlns:o="urn:schemas-microsoft-com:office:office" xmlns:oel="http://schemas.microsoft.com/office/2019/extlst" xmlns:r="http://schemas.openxmlformats.org/officeDocument/2006/relationships" xmlns:m="http://schemas.openxmlformats.org/officeDocument/2006/math" xmlns:v="urn:schemas-microsoft-com:vml" xmlns:wp14="http://schemas.microsoft.com/office/word/2010/wordprocessingDrawing" xmlns:wp="http://schemas.openxmlformats.org/drawingml/2006/wordprocessingDrawing" xmlns:w10="urn:schemas-microsoft-com:office:word" xmlns:w="http://schemas.openxmlformats.org/wordprocessingml/2006/main" xmlns:w14="http://schemas.microsoft.com/office/word/2010/wordml" xmlns:w15="http://schemas.microsoft.com/office/word/2012/wordml" xmlns:w16cex="http://schemas.microsoft.com/office/word/2018/wordml/cex" xmlns:w16cid="http://schemas.microsoft.com/office/word/2016/wordml/cid" xmlns:w16="http://schemas.microsoft.com/office/word/2018/wordml" xmlns:w16sdtdh="http://schemas.microsoft.com/office/word/2020/wordml/sdtdatahash" xmlns:w16se="http://schemas.microsoft.com/office/word/2015/wordml/symex" xmlns:wpg="http://schemas.microsoft.com/office/word/2010/wordprocessingGroup" xmlns:wpi="http://schemas.microsoft.com/office/word/2010/wordprocessingInk" xmlns:wne="http://schemas.microsoft.com/office/word/2006/wordml" xmlns:wps="http://schemas.microsoft.com/office/word/2010/wordprocessingShape" mc:Ignorable="w14 w15 w16se w16cid w16 w16cex w16sdtdh wp14">
+<w:endnotes xmlns:wpc="http://schemas.microsoft.com/office/word/2010/wordprocessingCanvas" xmlns:cx="http://schemas.microsoft.com/office/drawing/2014/chartex" xmlns:cx1="http://schemas.microsoft.com/office/drawing/2015/9/8/chartex" xmlns:cx2="http://schemas.microsoft.com/office/drawing/2015/10/21/chartex" xmlns:cx3="http://schemas.microsoft.com/office/drawing/2016/5/9/chartex" xmlns:cx4="http://schemas.microsoft.com/office/drawing/2016/5/10/chartex" xmlns:cx5="http://schemas.microsoft.com/office/drawing/2016/5/11/chartex" xmlns:cx6="http://schemas.microsoft.com/office/drawing/2016/5/12/chartex" xmlns:cx7="http://schemas.microsoft.com/office/drawing/2016/5/13/chartex" xmlns:cx8="http://schemas.microsoft.com/office/drawing/2016/5/14/chartex" xmlns:mc="http://schemas.openxmlformats.org/markup-compatibility/2006" xmlns:m="http://schemas.openxmlformats.org/officeDocument/2006/math" xmlns:aink="http://schemas.microsoft.com/office/drawing/2016/ink" xmlns:am3d="http://schemas.microsoft.com/office/drawing/2017/model3d" xmlns:oel="http://schemas.microsoft.com/office/2019/extlst" xmlns:r="http://schemas.openxmlformats.org/officeDocument/2006/relationships" xmlns:wp14="http://schemas.microsoft.com/office/word/2010/wordprocessingDrawing" xmlns:wp="http://schemas.openxmlformats.org/drawingml/2006/wordprocessingDrawing" xmlns:wpg="http://schemas.microsoft.com/office/word/2010/wordprocessingGroup" xmlns:wpi="http://schemas.microsoft.com/office/word/2010/wordprocessingInk" xmlns:wps="http://schemas.microsoft.com/office/word/2010/wordprocessingShape" xmlns:o="urn:schemas-microsoft-com:office:office" xmlns:v="urn:schemas-microsoft-com:vml" xmlns:w10="urn:schemas-microsoft-com:office:word" xmlns:w="http://schemas.openxmlformats.org/wordprocessingml/2006/main" xmlns:w14="http://schemas.microsoft.com/office/word/2010/wordml" xmlns:w15="http://schemas.microsoft.com/office/word/2012/wordml" xmlns:w16cex="http://schemas.microsoft.com/office/word/2018/wordml/cex" xmlns:w16cid="http://schemas.microsoft.com/office/word/2016/wordml/cid" xmlns:w16="http://schemas.microsoft.com/office/word/2018/wordml" xmlns:w16sdtdh="http://schemas.microsoft.com/office/word/2020/wordml/sdtdatahash" xmlns:w16sdtfl="http://schemas.microsoft.com/office/word/2024/wordml/sdtformatlock" xmlns:w16se="http://schemas.microsoft.com/office/word/2015/wordml/symex" xmlns:w16du="http://schemas.microsoft.com/office/word/2023/wordml/word16du" xmlns:wne="http://schemas.microsoft.com/office/word/2006/wordml" mc:Ignorable="w14 w15 w16se w16cid w16 w16cex w16sdtdh w16sdtfl w16du wp14">
   <w:endnote w:type="separator" w:id="-1">
     <w:p>
       <w:pPr>
@@ -34752,7 +34366,7 @@
 </file>
 
 <file path=word/footer1.xml><?xml version="1.0" encoding="utf-8"?>
-<w:ftr xmlns:wpc="http://schemas.microsoft.com/office/word/2010/wordprocessingCanvas" xmlns:cx="http://schemas.microsoft.com/office/drawing/2014/chartex" xmlns:cx1="http://schemas.microsoft.com/office/drawing/2015/9/8/chartex" xmlns:cx2="http://schemas.microsoft.com/office/drawing/2015/10/21/chartex" xmlns:cx3="http://schemas.microsoft.com/office/drawing/2016/5/9/chartex" xmlns:cx4="http://schemas.microsoft.com/office/drawing/2016/5/10/chartex" xmlns:cx5="http://schemas.microsoft.com/office/drawing/2016/5/11/chartex" xmlns:cx6="http://schemas.microsoft.com/office/drawing/2016/5/12/chartex" xmlns:cx7="http://schemas.microsoft.com/office/drawing/2016/5/13/chartex" xmlns:cx8="http://schemas.microsoft.com/office/drawing/2016/5/14/chartex" xmlns:mc="http://schemas.openxmlformats.org/markup-compatibility/2006" xmlns:aink="http://schemas.microsoft.com/office/drawing/2016/ink" xmlns:am3d="http://schemas.microsoft.com/office/drawing/2017/model3d" xmlns:o="urn:schemas-microsoft-com:office:office" xmlns:oel="http://schemas.microsoft.com/office/2019/extlst" xmlns:r="http://schemas.openxmlformats.org/officeDocument/2006/relationships" xmlns:m="http://schemas.openxmlformats.org/officeDocument/2006/math" xmlns:v="urn:schemas-microsoft-com:vml" xmlns:wp14="http://schemas.microsoft.com/office/word/2010/wordprocessingDrawing" xmlns:wp="http://schemas.openxmlformats.org/drawingml/2006/wordprocessingDrawing" xmlns:w10="urn:schemas-microsoft-com:office:word" xmlns:w="http://schemas.openxmlformats.org/wordprocessingml/2006/main" xmlns:w14="http://schemas.microsoft.com/office/word/2010/wordml" xmlns:w15="http://schemas.microsoft.com/office/word/2012/wordml" xmlns:w16cex="http://schemas.microsoft.com/office/word/2018/wordml/cex" xmlns:w16cid="http://schemas.microsoft.com/office/word/2016/wordml/cid" xmlns:w16="http://schemas.microsoft.com/office/word/2018/wordml" xmlns:w16sdtdh="http://schemas.microsoft.com/office/word/2020/wordml/sdtdatahash" xmlns:w16se="http://schemas.microsoft.com/office/word/2015/wordml/symex" xmlns:wpg="http://schemas.microsoft.com/office/word/2010/wordprocessingGroup" xmlns:wpi="http://schemas.microsoft.com/office/word/2010/wordprocessingInk" xmlns:wne="http://schemas.microsoft.com/office/word/2006/wordml" xmlns:wps="http://schemas.microsoft.com/office/word/2010/wordprocessingShape" mc:Ignorable="w14 w15 w16se w16cid w16 w16cex w16sdtdh wp14">
+<w:ftr xmlns:wpc="http://schemas.microsoft.com/office/word/2010/wordprocessingCanvas" xmlns:cx="http://schemas.microsoft.com/office/drawing/2014/chartex" xmlns:cx1="http://schemas.microsoft.com/office/drawing/2015/9/8/chartex" xmlns:cx2="http://schemas.microsoft.com/office/drawing/2015/10/21/chartex" xmlns:cx3="http://schemas.microsoft.com/office/drawing/2016/5/9/chartex" xmlns:cx4="http://schemas.microsoft.com/office/drawing/2016/5/10/chartex" xmlns:cx5="http://schemas.microsoft.com/office/drawing/2016/5/11/chartex" xmlns:cx6="http://schemas.microsoft.com/office/drawing/2016/5/12/chartex" xmlns:cx7="http://schemas.microsoft.com/office/drawing/2016/5/13/chartex" xmlns:cx8="http://schemas.microsoft.com/office/drawing/2016/5/14/chartex" xmlns:mc="http://schemas.openxmlformats.org/markup-compatibility/2006" xmlns:m="http://schemas.openxmlformats.org/officeDocument/2006/math" xmlns:aink="http://schemas.microsoft.com/office/drawing/2016/ink" xmlns:am3d="http://schemas.microsoft.com/office/drawing/2017/model3d" xmlns:oel="http://schemas.microsoft.com/office/2019/extlst" xmlns:r="http://schemas.openxmlformats.org/officeDocument/2006/relationships" xmlns:wp14="http://schemas.microsoft.com/office/word/2010/wordprocessingDrawing" xmlns:wp="http://schemas.openxmlformats.org/drawingml/2006/wordprocessingDrawing" xmlns:wpg="http://schemas.microsoft.com/office/word/2010/wordprocessingGroup" xmlns:wpi="http://schemas.microsoft.com/office/word/2010/wordprocessingInk" xmlns:wps="http://schemas.microsoft.com/office/word/2010/wordprocessingShape" xmlns:o="urn:schemas-microsoft-com:office:office" xmlns:v="urn:schemas-microsoft-com:vml" xmlns:w10="urn:schemas-microsoft-com:office:word" xmlns:w="http://schemas.openxmlformats.org/wordprocessingml/2006/main" xmlns:w14="http://schemas.microsoft.com/office/word/2010/wordml" xmlns:w15="http://schemas.microsoft.com/office/word/2012/wordml" xmlns:w16cex="http://schemas.microsoft.com/office/word/2018/wordml/cex" xmlns:w16cid="http://schemas.microsoft.com/office/word/2016/wordml/cid" xmlns:w16="http://schemas.microsoft.com/office/word/2018/wordml" xmlns:w16sdtdh="http://schemas.microsoft.com/office/word/2020/wordml/sdtdatahash" xmlns:w16sdtfl="http://schemas.microsoft.com/office/word/2024/wordml/sdtformatlock" xmlns:w16se="http://schemas.microsoft.com/office/word/2015/wordml/symex" xmlns:w16du="http://schemas.microsoft.com/office/word/2023/wordml/word16du" xmlns:wne="http://schemas.microsoft.com/office/word/2006/wordml" mc:Ignorable="w14 w15 w16se w16cid w16 w16cex w16sdtdh w16sdtfl w16du wp14">
   <w:sdt>
     <w:sdtPr>
       <w:id w:val="5227080"/>
@@ -34800,7 +34414,7 @@
 </file>
 
 <file path=word/footnotes.xml><?xml version="1.0" encoding="utf-8"?>
-<w:footnotes xmlns:wpc="http://schemas.microsoft.com/office/word/2010/wordprocessingCanvas" xmlns:cx="http://schemas.microsoft.com/office/drawing/2014/chartex" xmlns:cx1="http://schemas.microsoft.com/office/drawing/2015/9/8/chartex" xmlns:cx2="http://schemas.microsoft.com/office/drawing/2015/10/21/chartex" xmlns:cx3="http://schemas.microsoft.com/office/drawing/2016/5/9/chartex" xmlns:cx4="http://schemas.microsoft.com/office/drawing/2016/5/10/chartex" xmlns:cx5="http://schemas.microsoft.com/office/drawing/2016/5/11/chartex" xmlns:cx6="http://schemas.microsoft.com/office/drawing/2016/5/12/chartex" xmlns:cx7="http://schemas.microsoft.com/office/drawing/2016/5/13/chartex" xmlns:cx8="http://schemas.microsoft.com/office/drawing/2016/5/14/chartex" xmlns:mc="http://schemas.openxmlformats.org/markup-compatibility/2006" xmlns:aink="http://schemas.microsoft.com/office/drawing/2016/ink" xmlns:am3d="http://schemas.microsoft.com/office/drawing/2017/model3d" xmlns:o="urn:schemas-microsoft-com:office:office" xmlns:oel="http://schemas.microsoft.com/office/2019/extlst" xmlns:r="http://schemas.openxmlformats.org/officeDocument/2006/relationships" xmlns:m="http://schemas.openxmlformats.org/officeDocument/2006/math" xmlns:v="urn:schemas-microsoft-com:vml" xmlns:wp14="http://schemas.microsoft.com/office/word/2010/wordprocessingDrawing" xmlns:wp="http://schemas.openxmlformats.org/drawingml/2006/wordprocessingDrawing" xmlns:w10="urn:schemas-microsoft-com:office:word" xmlns:w="http://schemas.openxmlformats.org/wordprocessingml/2006/main" xmlns:w14="http://schemas.microsoft.com/office/word/2010/wordml" xmlns:w15="http://schemas.microsoft.com/office/word/2012/wordml" xmlns:w16cex="http://schemas.microsoft.com/office/word/2018/wordml/cex" xmlns:w16cid="http://schemas.microsoft.com/office/word/2016/wordml/cid" xmlns:w16="http://schemas.microsoft.com/office/word/2018/wordml" xmlns:w16sdtdh="http://schemas.microsoft.com/office/word/2020/wordml/sdtdatahash" xmlns:w16se="http://schemas.microsoft.com/office/word/2015/wordml/symex" xmlns:wpg="http://schemas.microsoft.com/office/word/2010/wordprocessingGroup" xmlns:wpi="http://schemas.microsoft.com/office/word/2010/wordprocessingInk" xmlns:wne="http://schemas.microsoft.com/office/word/2006/wordml" xmlns:wps="http://schemas.microsoft.com/office/word/2010/wordprocessingShape" mc:Ignorable="w14 w15 w16se w16cid w16 w16cex w16sdtdh wp14">
+<w:footnotes xmlns:wpc="http://schemas.microsoft.com/office/word/2010/wordprocessingCanvas" xmlns:cx="http://schemas.microsoft.com/office/drawing/2014/chartex" xmlns:cx1="http://schemas.microsoft.com/office/drawing/2015/9/8/chartex" xmlns:cx2="http://schemas.microsoft.com/office/drawing/2015/10/21/chartex" xmlns:cx3="http://schemas.microsoft.com/office/drawing/2016/5/9/chartex" xmlns:cx4="http://schemas.microsoft.com/office/drawing/2016/5/10/chartex" xmlns:cx5="http://schemas.microsoft.com/office/drawing/2016/5/11/chartex" xmlns:cx6="http://schemas.microsoft.com/office/drawing/2016/5/12/chartex" xmlns:cx7="http://schemas.microsoft.com/office/drawing/2016/5/13/chartex" xmlns:cx8="http://schemas.microsoft.com/office/drawing/2016/5/14/chartex" xmlns:mc="http://schemas.openxmlformats.org/markup-compatibility/2006" xmlns:m="http://schemas.openxmlformats.org/officeDocument/2006/math" xmlns:aink="http://schemas.microsoft.com/office/drawing/2016/ink" xmlns:am3d="http://schemas.microsoft.com/office/drawing/2017/model3d" xmlns:oel="http://schemas.microsoft.com/office/2019/extlst" xmlns:r="http://schemas.openxmlformats.org/officeDocument/2006/relationships" xmlns:wp14="http://schemas.microsoft.com/office/word/2010/wordprocessingDrawing" xmlns:wp="http://schemas.openxmlformats.org/drawingml/2006/wordprocessingDrawing" xmlns:wpg="http://schemas.microsoft.com/office/word/2010/wordprocessingGroup" xmlns:wpi="http://schemas.microsoft.com/office/word/2010/wordprocessingInk" xmlns:wps="http://schemas.microsoft.com/office/word/2010/wordprocessingShape" xmlns:o="urn:schemas-microsoft-com:office:office" xmlns:v="urn:schemas-microsoft-com:vml" xmlns:w10="urn:schemas-microsoft-com:office:word" xmlns:w="http://schemas.openxmlformats.org/wordprocessingml/2006/main" xmlns:w14="http://schemas.microsoft.com/office/word/2010/wordml" xmlns:w15="http://schemas.microsoft.com/office/word/2012/wordml" xmlns:w16cex="http://schemas.microsoft.com/office/word/2018/wordml/cex" xmlns:w16cid="http://schemas.microsoft.com/office/word/2016/wordml/cid" xmlns:w16="http://schemas.microsoft.com/office/word/2018/wordml" xmlns:w16sdtdh="http://schemas.microsoft.com/office/word/2020/wordml/sdtdatahash" xmlns:w16sdtfl="http://schemas.microsoft.com/office/word/2024/wordml/sdtformatlock" xmlns:w16se="http://schemas.microsoft.com/office/word/2015/wordml/symex" xmlns:w16du="http://schemas.microsoft.com/office/word/2023/wordml/word16du" xmlns:wne="http://schemas.microsoft.com/office/word/2006/wordml" mc:Ignorable="w14 w15 w16se w16cid w16 w16cex w16sdtdh w16sdtfl w16du wp14">
   <w:footnote w:type="separator" w:id="-1">
     <w:p>
       <w:pPr>
@@ -34825,7 +34439,7 @@
 </file>
 
 <file path=word/header1.xml><?xml version="1.0" encoding="utf-8"?>
-<w:hdr xmlns:wpc="http://schemas.microsoft.com/office/word/2010/wordprocessingCanvas" xmlns:cx="http://schemas.microsoft.com/office/drawing/2014/chartex" xmlns:cx1="http://schemas.microsoft.com/office/drawing/2015/9/8/chartex" xmlns:cx2="http://schemas.microsoft.com/office/drawing/2015/10/21/chartex" xmlns:cx3="http://schemas.microsoft.com/office/drawing/2016/5/9/chartex" xmlns:cx4="http://schemas.microsoft.com/office/drawing/2016/5/10/chartex" xmlns:cx5="http://schemas.microsoft.com/office/drawing/2016/5/11/chartex" xmlns:cx6="http://schemas.microsoft.com/office/drawing/2016/5/12/chartex" xmlns:cx7="http://schemas.microsoft.com/office/drawing/2016/5/13/chartex" xmlns:cx8="http://schemas.microsoft.com/office/drawing/2016/5/14/chartex" xmlns:mc="http://schemas.openxmlformats.org/markup-compatibility/2006" xmlns:aink="http://schemas.microsoft.com/office/drawing/2016/ink" xmlns:am3d="http://schemas.microsoft.com/office/drawing/2017/model3d" xmlns:o="urn:schemas-microsoft-com:office:office" xmlns:oel="http://schemas.microsoft.com/office/2019/extlst" xmlns:r="http://schemas.openxmlformats.org/officeDocument/2006/relationships" xmlns:m="http://schemas.openxmlformats.org/officeDocument/2006/math" xmlns:v="urn:schemas-microsoft-com:vml" xmlns:wp14="http://schemas.microsoft.com/office/word/2010/wordprocessingDrawing" xmlns:wp="http://schemas.openxmlformats.org/drawingml/2006/wordprocessingDrawing" xmlns:w10="urn:schemas-microsoft-com:office:word" xmlns:w="http://schemas.openxmlformats.org/wordprocessingml/2006/main" xmlns:w14="http://schemas.microsoft.com/office/word/2010/wordml" xmlns:w15="http://schemas.microsoft.com/office/word/2012/wordml" xmlns:w16cex="http://schemas.microsoft.com/office/word/2018/wordml/cex" xmlns:w16cid="http://schemas.microsoft.com/office/word/2016/wordml/cid" xmlns:w16="http://schemas.microsoft.com/office/word/2018/wordml" xmlns:w16sdtdh="http://schemas.microsoft.com/office/word/2020/wordml/sdtdatahash" xmlns:w16se="http://schemas.microsoft.com/office/word/2015/wordml/symex" xmlns:wpg="http://schemas.microsoft.com/office/word/2010/wordprocessingGroup" xmlns:wpi="http://schemas.microsoft.com/office/word/2010/wordprocessingInk" xmlns:wne="http://schemas.microsoft.com/office/word/2006/wordml" xmlns:wps="http://schemas.microsoft.com/office/word/2010/wordprocessingShape" mc:Ignorable="w14 w15 w16se w16cid w16 w16cex w16sdtdh wp14">
+<w:hdr xmlns:wpc="http://schemas.microsoft.com/office/word/2010/wordprocessingCanvas" xmlns:cx="http://schemas.microsoft.com/office/drawing/2014/chartex" xmlns:cx1="http://schemas.microsoft.com/office/drawing/2015/9/8/chartex" xmlns:cx2="http://schemas.microsoft.com/office/drawing/2015/10/21/chartex" xmlns:cx3="http://schemas.microsoft.com/office/drawing/2016/5/9/chartex" xmlns:cx4="http://schemas.microsoft.com/office/drawing/2016/5/10/chartex" xmlns:cx5="http://schemas.microsoft.com/office/drawing/2016/5/11/chartex" xmlns:cx6="http://schemas.microsoft.com/office/drawing/2016/5/12/chartex" xmlns:cx7="http://schemas.microsoft.com/office/drawing/2016/5/13/chartex" xmlns:cx8="http://schemas.microsoft.com/office/drawing/2016/5/14/chartex" xmlns:mc="http://schemas.openxmlformats.org/markup-compatibility/2006" xmlns:m="http://schemas.openxmlformats.org/officeDocument/2006/math" xmlns:aink="http://schemas.microsoft.com/office/drawing/2016/ink" xmlns:am3d="http://schemas.microsoft.com/office/drawing/2017/model3d" xmlns:oel="http://schemas.microsoft.com/office/2019/extlst" xmlns:r="http://schemas.openxmlformats.org/officeDocument/2006/relationships" xmlns:wp14="http://schemas.microsoft.com/office/word/2010/wordprocessingDrawing" xmlns:wp="http://schemas.openxmlformats.org/drawingml/2006/wordprocessingDrawing" xmlns:wpg="http://schemas.microsoft.com/office/word/2010/wordprocessingGroup" xmlns:wpi="http://schemas.microsoft.com/office/word/2010/wordprocessingInk" xmlns:wps="http://schemas.microsoft.com/office/word/2010/wordprocessingShape" xmlns:o="urn:schemas-microsoft-com:office:office" xmlns:v="urn:schemas-microsoft-com:vml" xmlns:w10="urn:schemas-microsoft-com:office:word" xmlns:w="http://schemas.openxmlformats.org/wordprocessingml/2006/main" xmlns:w14="http://schemas.microsoft.com/office/word/2010/wordml" xmlns:w15="http://schemas.microsoft.com/office/word/2012/wordml" xmlns:w16cex="http://schemas.microsoft.com/office/word/2018/wordml/cex" xmlns:w16cid="http://schemas.microsoft.com/office/word/2016/wordml/cid" xmlns:w16="http://schemas.microsoft.com/office/word/2018/wordml" xmlns:w16sdtdh="http://schemas.microsoft.com/office/word/2020/wordml/sdtdatahash" xmlns:w16sdtfl="http://schemas.microsoft.com/office/word/2024/wordml/sdtformatlock" xmlns:w16se="http://schemas.microsoft.com/office/word/2015/wordml/symex" xmlns:w16du="http://schemas.microsoft.com/office/word/2023/wordml/word16du" xmlns:wne="http://schemas.microsoft.com/office/word/2006/wordml" mc:Ignorable="w14 w15 w16se w16cid w16 w16cex w16sdtdh w16sdtfl w16du wp14">
   <w:tbl>
     <w:tblPr>
       <w:tblW w:w="8622" w:type="dxa"/>
@@ -35229,7 +34843,7 @@
 </file>
 
 <file path=word/numbering.xml><?xml version="1.0" encoding="utf-8"?>
-<w:numbering xmlns:wpc="http://schemas.microsoft.com/office/word/2010/wordprocessingCanvas" xmlns:cx="http://schemas.microsoft.com/office/drawing/2014/chartex" xmlns:cx1="http://schemas.microsoft.com/office/drawing/2015/9/8/chartex" xmlns:cx2="http://schemas.microsoft.com/office/drawing/2015/10/21/chartex" xmlns:cx3="http://schemas.microsoft.com/office/drawing/2016/5/9/chartex" xmlns:cx4="http://schemas.microsoft.com/office/drawing/2016/5/10/chartex" xmlns:cx5="http://schemas.microsoft.com/office/drawing/2016/5/11/chartex" xmlns:cx6="http://schemas.microsoft.com/office/drawing/2016/5/12/chartex" xmlns:cx7="http://schemas.microsoft.com/office/drawing/2016/5/13/chartex" xmlns:cx8="http://schemas.microsoft.com/office/drawing/2016/5/14/chartex" xmlns:mc="http://schemas.openxmlformats.org/markup-compatibility/2006" xmlns:aink="http://schemas.microsoft.com/office/drawing/2016/ink" xmlns:am3d="http://schemas.microsoft.com/office/drawing/2017/model3d" xmlns:o="urn:schemas-microsoft-com:office:office" xmlns:oel="http://schemas.microsoft.com/office/2019/extlst" xmlns:r="http://schemas.openxmlformats.org/officeDocument/2006/relationships" xmlns:m="http://schemas.openxmlformats.org/officeDocument/2006/math" xmlns:v="urn:schemas-microsoft-com:vml" xmlns:wp14="http://schemas.microsoft.com/office/word/2010/wordprocessingDrawing" xmlns:wp="http://schemas.openxmlformats.org/drawingml/2006/wordprocessingDrawing" xmlns:w10="urn:schemas-microsoft-com:office:word" xmlns:w="http://schemas.openxmlformats.org/wordprocessingml/2006/main" xmlns:w14="http://schemas.microsoft.com/office/word/2010/wordml" xmlns:w15="http://schemas.microsoft.com/office/word/2012/wordml" xmlns:w16cex="http://schemas.microsoft.com/office/word/2018/wordml/cex" xmlns:w16cid="http://schemas.microsoft.com/office/word/2016/wordml/cid" xmlns:w16="http://schemas.microsoft.com/office/word/2018/wordml" xmlns:w16sdtdh="http://schemas.microsoft.com/office/word/2020/wordml/sdtdatahash" xmlns:w16se="http://schemas.microsoft.com/office/word/2015/wordml/symex" xmlns:wpg="http://schemas.microsoft.com/office/word/2010/wordprocessingGroup" xmlns:wpi="http://schemas.microsoft.com/office/word/2010/wordprocessingInk" xmlns:wne="http://schemas.microsoft.com/office/word/2006/wordml" xmlns:wps="http://schemas.microsoft.com/office/word/2010/wordprocessingShape" mc:Ignorable="w14 w15 w16se w16cid w16 w16cex w16sdtdh wp14">
+<w:numbering xmlns:wpc="http://schemas.microsoft.com/office/word/2010/wordprocessingCanvas" xmlns:cx="http://schemas.microsoft.com/office/drawing/2014/chartex" xmlns:cx1="http://schemas.microsoft.com/office/drawing/2015/9/8/chartex" xmlns:cx2="http://schemas.microsoft.com/office/drawing/2015/10/21/chartex" xmlns:cx3="http://schemas.microsoft.com/office/drawing/2016/5/9/chartex" xmlns:cx4="http://schemas.microsoft.com/office/drawing/2016/5/10/chartex" xmlns:cx5="http://schemas.microsoft.com/office/drawing/2016/5/11/chartex" xmlns:cx6="http://schemas.microsoft.com/office/drawing/2016/5/12/chartex" xmlns:cx7="http://schemas.microsoft.com/office/drawing/2016/5/13/chartex" xmlns:cx8="http://schemas.microsoft.com/office/drawing/2016/5/14/chartex" xmlns:mc="http://schemas.openxmlformats.org/markup-compatibility/2006" xmlns:m="http://schemas.openxmlformats.org/officeDocument/2006/math" xmlns:aink="http://schemas.microsoft.com/office/drawing/2016/ink" xmlns:am3d="http://schemas.microsoft.com/office/drawing/2017/model3d" xmlns:oel="http://schemas.microsoft.com/office/2019/extlst" xmlns:r="http://schemas.openxmlformats.org/officeDocument/2006/relationships" xmlns:wp14="http://schemas.microsoft.com/office/word/2010/wordprocessingDrawing" xmlns:wp="http://schemas.openxmlformats.org/drawingml/2006/wordprocessingDrawing" xmlns:wpg="http://schemas.microsoft.com/office/word/2010/wordprocessingGroup" xmlns:wpi="http://schemas.microsoft.com/office/word/2010/wordprocessingInk" xmlns:wps="http://schemas.microsoft.com/office/word/2010/wordprocessingShape" xmlns:o="urn:schemas-microsoft-com:office:office" xmlns:v="urn:schemas-microsoft-com:vml" xmlns:w10="urn:schemas-microsoft-com:office:word" xmlns:w="http://schemas.openxmlformats.org/wordprocessingml/2006/main" xmlns:w14="http://schemas.microsoft.com/office/word/2010/wordml" xmlns:w15="http://schemas.microsoft.com/office/word/2012/wordml" xmlns:w16cex="http://schemas.microsoft.com/office/word/2018/wordml/cex" xmlns:w16cid="http://schemas.microsoft.com/office/word/2016/wordml/cid" xmlns:w16="http://schemas.microsoft.com/office/word/2018/wordml" xmlns:w16sdtdh="http://schemas.microsoft.com/office/word/2020/wordml/sdtdatahash" xmlns:w16sdtfl="http://schemas.microsoft.com/office/word/2024/wordml/sdtformatlock" xmlns:w16se="http://schemas.microsoft.com/office/word/2015/wordml/symex" xmlns:w16du="http://schemas.microsoft.com/office/word/2023/wordml/word16du" xmlns:wne="http://schemas.microsoft.com/office/word/2006/wordml" mc:Ignorable="w14 w15 w16se w16cid w16 w16cex w16sdtdh w16sdtfl w16du wp14">
   <w:numPicBullet w:numPicBulletId="0">
     <w:pict>
       <v:shapetype id="_x0000_t75" coordsize="21600,21600" o:spt="75" o:preferrelative="t" path="m@4@5l@4@11@9@11@9@5xe" filled="f" stroked="f">
@@ -35251,7 +34865,7 @@
         <v:path o:extrusionok="f" gradientshapeok="t" o:connecttype="rect"/>
         <o:lock v:ext="edit" aspectratio="t"/>
       </v:shapetype>
-      <v:shape id="_x0000_i1057" type="#_x0000_t75" style="width:25pt;height:20pt;visibility:visible;mso-wrap-style:square" o:bullet="t">
+      <v:shape id="_x0000_i1025" type="#_x0000_t75" style="width:24.8pt;height:19.95pt;visibility:visible;mso-wrap-style:square" o:bullet="t">
         <v:imagedata r:id="rId1" o:title=""/>
       </v:shape>
     </w:pict>
@@ -39437,7 +39051,7 @@
 </file>
 
 <file path=word/people.xml><?xml version="1.0" encoding="utf-8"?>
-<w15:people xmlns:wpc="http://schemas.microsoft.com/office/word/2010/wordprocessingCanvas" xmlns:cx="http://schemas.microsoft.com/office/drawing/2014/chartex" xmlns:cx1="http://schemas.microsoft.com/office/drawing/2015/9/8/chartex" xmlns:cx2="http://schemas.microsoft.com/office/drawing/2015/10/21/chartex" xmlns:cx3="http://schemas.microsoft.com/office/drawing/2016/5/9/chartex" xmlns:cx4="http://schemas.microsoft.com/office/drawing/2016/5/10/chartex" xmlns:cx5="http://schemas.microsoft.com/office/drawing/2016/5/11/chartex" xmlns:cx6="http://schemas.microsoft.com/office/drawing/2016/5/12/chartex" xmlns:cx7="http://schemas.microsoft.com/office/drawing/2016/5/13/chartex" xmlns:cx8="http://schemas.microsoft.com/office/drawing/2016/5/14/chartex" xmlns:mc="http://schemas.openxmlformats.org/markup-compatibility/2006" xmlns:aink="http://schemas.microsoft.com/office/drawing/2016/ink" xmlns:am3d="http://schemas.microsoft.com/office/drawing/2017/model3d" xmlns:o="urn:schemas-microsoft-com:office:office" xmlns:oel="http://schemas.microsoft.com/office/2019/extlst" xmlns:r="http://schemas.openxmlformats.org/officeDocument/2006/relationships" xmlns:m="http://schemas.openxmlformats.org/officeDocument/2006/math" xmlns:v="urn:schemas-microsoft-com:vml" xmlns:wp14="http://schemas.microsoft.com/office/word/2010/wordprocessingDrawing" xmlns:wp="http://schemas.openxmlformats.org/drawingml/2006/wordprocessingDrawing" xmlns:w10="urn:schemas-microsoft-com:office:word" xmlns:w="http://schemas.openxmlformats.org/wordprocessingml/2006/main" xmlns:w14="http://schemas.microsoft.com/office/word/2010/wordml" xmlns:w15="http://schemas.microsoft.com/office/word/2012/wordml" xmlns:w16cex="http://schemas.microsoft.com/office/word/2018/wordml/cex" xmlns:w16cid="http://schemas.microsoft.com/office/word/2016/wordml/cid" xmlns:w16="http://schemas.microsoft.com/office/word/2018/wordml" xmlns:w16sdtdh="http://schemas.microsoft.com/office/word/2020/wordml/sdtdatahash" xmlns:w16se="http://schemas.microsoft.com/office/word/2015/wordml/symex" xmlns:wpg="http://schemas.microsoft.com/office/word/2010/wordprocessingGroup" xmlns:wpi="http://schemas.microsoft.com/office/word/2010/wordprocessingInk" xmlns:wne="http://schemas.microsoft.com/office/word/2006/wordml" xmlns:wps="http://schemas.microsoft.com/office/word/2010/wordprocessingShape" mc:Ignorable="w14 w15 w16se w16cid w16 w16cex w16sdtdh wp14">
+<w15:people xmlns:wpc="http://schemas.microsoft.com/office/word/2010/wordprocessingCanvas" xmlns:cx="http://schemas.microsoft.com/office/drawing/2014/chartex" xmlns:cx1="http://schemas.microsoft.com/office/drawing/2015/9/8/chartex" xmlns:cx2="http://schemas.microsoft.com/office/drawing/2015/10/21/chartex" xmlns:cx3="http://schemas.microsoft.com/office/drawing/2016/5/9/chartex" xmlns:cx4="http://schemas.microsoft.com/office/drawing/2016/5/10/chartex" xmlns:cx5="http://schemas.microsoft.com/office/drawing/2016/5/11/chartex" xmlns:cx6="http://schemas.microsoft.com/office/drawing/2016/5/12/chartex" xmlns:cx7="http://schemas.microsoft.com/office/drawing/2016/5/13/chartex" xmlns:cx8="http://schemas.microsoft.com/office/drawing/2016/5/14/chartex" xmlns:mc="http://schemas.openxmlformats.org/markup-compatibility/2006" xmlns:m="http://schemas.openxmlformats.org/officeDocument/2006/math" xmlns:aink="http://schemas.microsoft.com/office/drawing/2016/ink" xmlns:am3d="http://schemas.microsoft.com/office/drawing/2017/model3d" xmlns:oel="http://schemas.microsoft.com/office/2019/extlst" xmlns:r="http://schemas.openxmlformats.org/officeDocument/2006/relationships" xmlns:wp14="http://schemas.microsoft.com/office/word/2010/wordprocessingDrawing" xmlns:wp="http://schemas.openxmlformats.org/drawingml/2006/wordprocessingDrawing" xmlns:wpg="http://schemas.microsoft.com/office/word/2010/wordprocessingGroup" xmlns:wpi="http://schemas.microsoft.com/office/word/2010/wordprocessingInk" xmlns:wps="http://schemas.microsoft.com/office/word/2010/wordprocessingShape" xmlns:o="urn:schemas-microsoft-com:office:office" xmlns:v="urn:schemas-microsoft-com:vml" xmlns:w10="urn:schemas-microsoft-com:office:word" xmlns:w="http://schemas.openxmlformats.org/wordprocessingml/2006/main" xmlns:w14="http://schemas.microsoft.com/office/word/2010/wordml" xmlns:w15="http://schemas.microsoft.com/office/word/2012/wordml" xmlns:w16cex="http://schemas.microsoft.com/office/word/2018/wordml/cex" xmlns:w16cid="http://schemas.microsoft.com/office/word/2016/wordml/cid" xmlns:w16="http://schemas.microsoft.com/office/word/2018/wordml" xmlns:w16sdtdh="http://schemas.microsoft.com/office/word/2020/wordml/sdtdatahash" xmlns:w16sdtfl="http://schemas.microsoft.com/office/word/2024/wordml/sdtformatlock" xmlns:w16se="http://schemas.microsoft.com/office/word/2015/wordml/symex" xmlns:w16du="http://schemas.microsoft.com/office/word/2023/wordml/word16du" xmlns:wne="http://schemas.microsoft.com/office/word/2006/wordml" mc:Ignorable="w14 w15 w16se w16cid w16 w16cex w16sdtdh w16sdtfl w16du wp14">
   <w15:person w15:author="Sergio Ignacio Serna Garces">
     <w15:presenceInfo w15:providerId="AD" w15:userId="S::sergioserna@itm.edu.co::513a7376-4ebd-40e2-a4c8-b01e95f29465"/>
   </w15:person>
@@ -39445,7 +39059,7 @@
 </file>
 
 <file path=word/styles.xml><?xml version="1.0" encoding="utf-8"?>
-<w:styles xmlns:mc="http://schemas.openxmlformats.org/markup-compatibility/2006" xmlns:r="http://schemas.openxmlformats.org/officeDocument/2006/relationships" xmlns:w="http://schemas.openxmlformats.org/wordprocessingml/2006/main" xmlns:w14="http://schemas.microsoft.com/office/word/2010/wordml" xmlns:w15="http://schemas.microsoft.com/office/word/2012/wordml" xmlns:w16cex="http://schemas.microsoft.com/office/word/2018/wordml/cex" xmlns:w16cid="http://schemas.microsoft.com/office/word/2016/wordml/cid" xmlns:w16="http://schemas.microsoft.com/office/word/2018/wordml" xmlns:w16sdtdh="http://schemas.microsoft.com/office/word/2020/wordml/sdtdatahash" xmlns:w16se="http://schemas.microsoft.com/office/word/2015/wordml/symex" mc:Ignorable="w14 w15 w16se w16cid w16 w16cex w16sdtdh">
+<w:styles xmlns:mc="http://schemas.openxmlformats.org/markup-compatibility/2006" xmlns:r="http://schemas.openxmlformats.org/officeDocument/2006/relationships" xmlns:w="http://schemas.openxmlformats.org/wordprocessingml/2006/main" xmlns:w14="http://schemas.microsoft.com/office/word/2010/wordml" xmlns:w15="http://schemas.microsoft.com/office/word/2012/wordml" xmlns:w16cex="http://schemas.microsoft.com/office/word/2018/wordml/cex" xmlns:w16cid="http://schemas.microsoft.com/office/word/2016/wordml/cid" xmlns:w16="http://schemas.microsoft.com/office/word/2018/wordml" xmlns:w16sdtdh="http://schemas.microsoft.com/office/word/2020/wordml/sdtdatahash" xmlns:w16sdtfl="http://schemas.microsoft.com/office/word/2024/wordml/sdtformatlock" xmlns:w16se="http://schemas.microsoft.com/office/word/2015/wordml/symex" xmlns:w16du="http://schemas.microsoft.com/office/word/2023/wordml/word16du" mc:Ignorable="w14 w15 w16se w16cid w16 w16cex w16sdtdh w16sdtfl w16du">
   <w:docDefaults>
     <w:rPrDefault>
       <w:rPr>
@@ -40771,7 +40385,7 @@
     <w:basedOn w:val="Fuentedeprrafopredeter"/>
     <w:rsid w:val="003D5447"/>
   </w:style>
-  <w:style w:type="character" w:styleId="Textoennegrita">
+  <w:style w:type="character" w:styleId="Fuerte">
     <w:name w:val="Strong"/>
     <w:basedOn w:val="Fuentedeprrafopredeter"/>
     <w:uiPriority w:val="22"/>

</xml_diff>